<commit_message>
Frontend F4b: màn làm bài — tự lưu nháp, xung đột nháp, nộp bài
- Đề bài trái / ô soạn phải, tab theo phần, đếm từ khi gõ; điện thoại: đề thu gọn, thanh nộp dính đáy
- useDraftAutosave: lưu sau 3 giây ngừng gõ / rời tab / đổi phần, gửi draftVersion; 409 DRAFT_CONFLICT → hộp thoại chọn bản
- Nộp có xác nhận khi thiếu từ, gửi expectedVersion; lỗi trạng thái cũ thì tải lại; chỉ đọc khi đã nộp / quá hạn / bài đóng
- Đồng bộ giờ GET /api/time (3 mẫu, lấy mẫu nhanh nhất, 5 phút một lần — SD-11); ApiError mang data của lỗi
- docs/10 mục 7.3 hướng dẫn làm bài; xuất lại Word

Co-Authored-By: Claude Opus 5.5 <noreply@anthropic.com>
</commit_message>
<xml_diff>
--- a/docx/10-huong-dan-su-dung.docx
+++ b/docx/10-huong-dan-su-dung.docx
@@ -28,7 +28,7 @@
         </w:p>
       </w:sdtContent>
     </w:sdt>
-    <w:bookmarkStart w:id="32" w:name="X62b689528c743ccb8c3229542497059f4aa59b0"/>
+    <w:bookmarkStart w:id="33" w:name="X62b689528c743ccb8c3229542497059f4aa59b0"/>
     <w:p>
       <w:pPr>
         <w:pStyle w:val="Heading1"/>
@@ -258,7 +258,7 @@
               <w:pStyle w:val="Compact"/>
             </w:pPr>
             <w:r>
-              <w:t xml:space="preserve">Sinh viên: bài được giao, chi tiết bài, lịch sử nộp</w:t>
+              <w:t xml:space="preserve">Sinh viên: bài được giao, chi tiết bài, lịch sử nộp, làm bài, nộp bài</w:t>
             </w:r>
           </w:p>
         </w:tc>
@@ -279,6 +279,9 @@
             <w:pPr>
               <w:pStyle w:val="Compact"/>
             </w:pPr>
+            <w:r>
+              <w:t xml:space="preserve">Nháp khi mất mạng chưa có (bước tiếp theo)</w:t>
+            </w:r>
           </w:p>
         </w:tc>
       </w:tr>
@@ -290,7 +293,7 @@
               <w:pStyle w:val="Compact"/>
             </w:pPr>
             <w:r>
-              <w:t xml:space="preserve">Sinh viên: làm bài, nộp bài, xem kết quả chi tiết, trao đổi</w:t>
+              <w:t xml:space="preserve">Sinh viên: xem kết quả chi tiết, kết quả học tập, trao đổi</w:t>
             </w:r>
           </w:p>
         </w:tc>
@@ -311,9 +314,6 @@
             <w:pPr>
               <w:pStyle w:val="Compact"/>
             </w:pPr>
-            <w:r>
-              <w:t xml:space="preserve">Nút "Làm bài" mở màn làm bài (đang là khung trống)</w:t>
-            </w:r>
           </w:p>
         </w:tc>
       </w:tr>
@@ -4083,7 +4083,7 @@
     </w:p>
     <w:bookmarkEnd w:id="24"/>
     <w:bookmarkEnd w:id="25"/>
-    <w:bookmarkStart w:id="29" w:name="Xa4980557fe2b16e9ea1555bbc3e255ac8d44acd"/>
+    <w:bookmarkStart w:id="30" w:name="Xa4980557fe2b16e9ea1555bbc3e255ac8d44acd"/>
     <w:p>
       <w:pPr>
         <w:pStyle w:val="Heading2"/>
@@ -4541,13 +4541,13 @@
       </w:r>
     </w:p>
     <w:bookmarkEnd w:id="27"/>
-    <w:bookmarkStart w:id="28" w:name="X07fe456aeba9d24e1b08a5a30f0c57becaf912c"/>
+    <w:bookmarkStart w:id="28" w:name="Xcdbbb1fe94ded6e0db335b0616309f1ec0255e9"/>
     <w:p>
       <w:pPr>
         <w:pStyle w:val="Heading3"/>
       </w:pPr>
       <w:r>
-        <w:t xml:space="preserve">7.3. Đang làm</w:t>
+        <w:t xml:space="preserve">7.3. Làm bài và nộp bài</w:t>
       </w:r>
     </w:p>
     <w:p>
@@ -4555,7 +4555,7 @@
         <w:pStyle w:val="FirstParagraph"/>
       </w:pPr>
       <w:r>
-        <w:t xml:space="preserve">Màn</w:t>
+        <w:t xml:space="preserve">Bấm</w:t>
       </w:r>
       <w:r>
         <w:t xml:space="preserve"> </w:t>
@@ -4565,111 +4565,13 @@
           <w:b/>
           <w:bCs/>
         </w:rPr>
-        <w:t xml:space="preserve">làm bài</w:t>
-      </w:r>
-      <w:r>
-        <w:t xml:space="preserve"> </w:t>
-      </w:r>
-      <w:r>
-        <w:t xml:space="preserve">(đếm từ, tự lưu nháp, giữ bài khi mất mạng, nộp từng phần),</w:t>
-      </w:r>
-      <w:r>
-        <w:t xml:space="preserve"> </w:t>
-      </w:r>
-      <w:r>
-        <w:rPr>
-          <w:b/>
-          <w:bCs/>
-        </w:rPr>
-        <w:t xml:space="preserve">xem kết quả chi tiết</w:t>
-      </w:r>
-      <w:r>
-        <w:t xml:space="preserve"> </w:t>
-      </w:r>
-      <w:r>
-        <w:t xml:space="preserve">(nhận xét trên bài, mã lỗi, so sánh các lần nộp),</w:t>
-      </w:r>
-      <w:r>
-        <w:t xml:space="preserve"> </w:t>
-      </w:r>
-      <w:r>
-        <w:rPr>
-          <w:b/>
-          <w:bCs/>
-        </w:rPr>
-        <w:t xml:space="preserve">kết quả học tập</w:t>
-      </w:r>
-      <w:r>
-        <w:t xml:space="preserve"> </w:t>
-      </w:r>
-      <w:r>
-        <w:t xml:space="preserve">và</w:t>
-      </w:r>
-      <w:r>
-        <w:t xml:space="preserve"> </w:t>
-      </w:r>
-      <w:r>
-        <w:rPr>
-          <w:b/>
-          <w:bCs/>
-        </w:rPr>
-        <w:t xml:space="preserve">trao đổi</w:t>
-      </w:r>
-      <w:r>
-        <w:t xml:space="preserve"> </w:t>
-      </w:r>
-      <w:r>
-        <w:t xml:space="preserve">sẽ có ở các bước tiếp theo.</w:t>
-      </w:r>
-    </w:p>
-    <w:p>
-      <w:r>
-        <w:pict>
-          <v:rect style="width:0;height:1.5pt" o:hralign="center" o:hrstd="t" o:hr="t"/>
-        </w:pict>
-      </w:r>
-    </w:p>
-    <w:bookmarkEnd w:id="28"/>
-    <w:bookmarkEnd w:id="29"/>
-    <w:bookmarkStart w:id="30" w:name="X27a74f3cf0506426a1a76b4e73d04f5d967bbd0"/>
-    <w:p>
-      <w:pPr>
-        <w:pStyle w:val="Heading2"/>
-      </w:pPr>
-      <w:r>
-        <w:t xml:space="preserve">8. Kịch bản demo gợi ý (~10 phút)</w:t>
-      </w:r>
-    </w:p>
-    <w:p>
-      <w:pPr>
-        <w:pStyle w:val="FirstParagraph"/>
-      </w:pPr>
-      <w:r>
-        <w:t xml:space="preserve">Mở hai trình duyệt (hoặc một cửa sổ ẩn danh): máy A đăng nhập</w:t>
-      </w:r>
-      <w:r>
-        <w:t xml:space="preserve"> </w:t>
-      </w:r>
-      <w:r>
-        <w:rPr>
-          <w:rStyle w:val="VerbatimChar"/>
-        </w:rPr>
-        <w:t xml:space="preserve">gv.demo</w:t>
-      </w:r>
-      <w:r>
-        <w:t xml:space="preserve">, máy B đăng nhập</w:t>
-      </w:r>
-      <w:r>
-        <w:t xml:space="preserve"> </w:t>
-      </w:r>
-      <w:r>
-        <w:rPr>
-          <w:rStyle w:val="VerbatimChar"/>
-        </w:rPr>
-        <w:t xml:space="preserve">DEMO001</w:t>
-      </w:r>
-      <w:r>
-        <w:t xml:space="preserve">.</w:t>
+        <w:t xml:space="preserve">Làm bài / Viết tiếp / Sửa bài</w:t>
+      </w:r>
+      <w:r>
+        <w:t xml:space="preserve"> </w:t>
+      </w:r>
+      <w:r>
+        <w:t xml:space="preserve">để mở màn làm bài toàn màn hình. Bài nhiều phần thì chọn phần ở hàng tab trên cùng (tab ghi trạng thái từng phần).</w:t>
       </w:r>
     </w:p>
     <w:p>
@@ -4685,22 +4587,45 @@
           <w:b/>
           <w:bCs/>
         </w:rPr>
-        <w:t xml:space="preserve">Admin</w:t>
-      </w:r>
-      <w:r>
-        <w:t xml:space="preserve"> </w:t>
-      </w:r>
-      <w:r>
-        <w:t xml:space="preserve">(</w:t>
-      </w:r>
-      <w:r>
-        <w:rPr>
-          <w:rStyle w:val="VerbatimChar"/>
-        </w:rPr>
-        <w:t xml:space="preserve">admin</w:t>
-      </w:r>
-      <w:r>
-        <w:t xml:space="preserve">): Tổng quan → Giáo viên → thêm một giáo viên, xem mật khẩu tạm hiện một lần → Nhật ký thấy dòng "Tạo giáo viên".</w:t>
+        <w:t xml:space="preserve">Bên trái</w:t>
+      </w:r>
+      <w:r>
+        <w:t xml:space="preserve"> </w:t>
+      </w:r>
+      <w:r>
+        <w:t xml:space="preserve">là đề bài (trên điện thoại: bấm</w:t>
+      </w:r>
+      <w:r>
+        <w:t xml:space="preserve"> </w:t>
+      </w:r>
+      <w:r>
+        <w:rPr>
+          <w:b/>
+          <w:bCs/>
+        </w:rPr>
+        <w:t xml:space="preserve">Xem đề bài</w:t>
+      </w:r>
+      <w:r>
+        <w:t xml:space="preserve"> </w:t>
+      </w:r>
+      <w:r>
+        <w:t xml:space="preserve">để mở),</w:t>
+      </w:r>
+      <w:r>
+        <w:t xml:space="preserve"> </w:t>
+      </w:r>
+      <w:r>
+        <w:rPr>
+          <w:b/>
+          <w:bCs/>
+        </w:rPr>
+        <w:t xml:space="preserve">bên phải</w:t>
+      </w:r>
+      <w:r>
+        <w:t xml:space="preserve"> </w:t>
+      </w:r>
+      <w:r>
+        <w:t xml:space="preserve">là ô soạn. Số từ đếm ngay khi gõ (cùng cách đếm với máy chủ): màu cam khi chưa đủ tối thiểu, xanh khi đủ.</w:t>
       </w:r>
     </w:p>
     <w:p>
@@ -4716,28 +4641,10 @@
           <w:b/>
           <w:bCs/>
         </w:rPr>
-        <w:t xml:space="preserve">Giáo viên</w:t>
-      </w:r>
-      <w:r>
-        <w:t xml:space="preserve"> </w:t>
-      </w:r>
-      <w:r>
-        <w:t xml:space="preserve">(máy A): Lớp học → mở</w:t>
-      </w:r>
-      <w:r>
-        <w:t xml:space="preserve"> </w:t>
-      </w:r>
-      <w:r>
-        <w:rPr>
-          <w:rStyle w:val="VerbatimChar"/>
-        </w:rPr>
-        <w:t xml:space="preserve">DEMO-A</w:t>
-      </w:r>
-      <w:r>
-        <w:t xml:space="preserve"> </w:t>
-      </w:r>
-      <w:r>
-        <w:t xml:space="preserve">→ Import file mẫu đã điền vài sinh viên → xem kết quả, tải file tài khoản.</w:t>
+        <w:t xml:space="preserve">Tự lưu nháp</w:t>
+      </w:r>
+      <w:r>
+        <w:t xml:space="preserve">: ngừng gõ 3 giây, chuyển sang tab khác hoặc đổi phần là bài được lưu; dòng trạng thái ghi "Chưa lưu" → "Đang lưu…" → "Đã lưu lúc hh:mm". Lưu lỗi thì bấm "Lỗi lưu – thử lại". Đóng trang khi còn thay đổi chưa lưu, trình duyệt sẽ hỏi lại.</w:t>
       </w:r>
     </w:p>
     <w:p>
@@ -4749,23 +4656,14 @@
         </w:numPr>
       </w:pPr>
       <w:r>
-        <w:t xml:space="preserve">Bài tập → mở</w:t>
-      </w:r>
-      <w:r>
-        <w:t xml:space="preserve"> </w:t>
-      </w:r>
-      <w:r>
         <w:rPr>
           <w:b/>
           <w:bCs/>
         </w:rPr>
-        <w:t xml:space="preserve">"Tuần 2"</w:t>
-      </w:r>
-      <w:r>
-        <w:t xml:space="preserve"> </w:t>
-      </w:r>
-      <w:r>
-        <w:t xml:space="preserve">(nháp) →</w:t>
+        <w:t xml:space="preserve">Mở cùng bài ở 2 tab / 2 máy</w:t>
+      </w:r>
+      <w:r>
+        <w:t xml:space="preserve">: khi một nơi lưu đè, nơi kia hiện hộp thoại cho xem cả hai bản (kèm số từ) để chọn</w:t>
       </w:r>
       <w:r>
         <w:t xml:space="preserve"> </w:t>
@@ -4775,37 +4673,13 @@
           <w:b/>
           <w:bCs/>
         </w:rPr>
-        <w:t xml:space="preserve">Giao bài &amp; phát hành</w:t>
-      </w:r>
-      <w:r>
-        <w:t xml:space="preserve"> </w:t>
-      </w:r>
-      <w:r>
-        <w:t xml:space="preserve">cho lớp</w:t>
-      </w:r>
-      <w:r>
-        <w:t xml:space="preserve"> </w:t>
-      </w:r>
-      <w:r>
-        <w:rPr>
-          <w:rStyle w:val="VerbatimChar"/>
-        </w:rPr>
-        <w:t xml:space="preserve">DEMO-A</w:t>
-      </w:r>
-      <w:r>
-        <w:t xml:space="preserve"> </w:t>
-      </w:r>
-      <w:r>
-        <w:t xml:space="preserve">→ máy B (</w:t>
-      </w:r>
-      <w:r>
-        <w:rPr>
-          <w:rStyle w:val="VerbatimChar"/>
-        </w:rPr>
-        <w:t xml:space="preserve">DEMO001</w:t>
-      </w:r>
-      <w:r>
-        <w:t xml:space="preserve">) thấy</w:t>
+        <w:t xml:space="preserve">Dùng bản trên máy này</w:t>
+      </w:r>
+      <w:r>
+        <w:t xml:space="preserve"> </w:t>
+      </w:r>
+      <w:r>
+        <w:t xml:space="preserve">hoặc</w:t>
       </w:r>
       <w:r>
         <w:t xml:space="preserve"> </w:t>
@@ -4815,13 +4689,10 @@
           <w:b/>
           <w:bCs/>
         </w:rPr>
-        <w:t xml:space="preserve">thông báo bật lên ngay</w:t>
-      </w:r>
-      <w:r>
-        <w:t xml:space="preserve"> </w:t>
-      </w:r>
-      <w:r>
-        <w:t xml:space="preserve">và số trên chuông tăng.</w:t>
+        <w:t xml:space="preserve">Dùng bản trên máy chủ</w:t>
+      </w:r>
+      <w:r>
+        <w:t xml:space="preserve">.</w:t>
       </w:r>
     </w:p>
     <w:p>
@@ -4833,7 +4704,56 @@
         </w:numPr>
       </w:pPr>
       <w:r>
-        <w:t xml:space="preserve">Tắt mạng máy B vài giây (hoặc khởi động lại backend) → thanh vàng "Mất kết nối… đang thử lại" → bật lại → tự kết nối.</w:t>
+        <w:rPr>
+          <w:b/>
+          <w:bCs/>
+        </w:rPr>
+        <w:t xml:space="preserve">Nộp</w:t>
+      </w:r>
+      <w:r>
+        <w:t xml:space="preserve">: bấm</w:t>
+      </w:r>
+      <w:r>
+        <w:t xml:space="preserve"> </w:t>
+      </w:r>
+      <w:r>
+        <w:rPr>
+          <w:b/>
+          <w:bCs/>
+        </w:rPr>
+        <w:t xml:space="preserve">Nộp phần này</w:t>
+      </w:r>
+      <w:r>
+        <w:t xml:space="preserve"> </w:t>
+      </w:r>
+      <w:r>
+        <w:t xml:space="preserve">(đang "Cần sửa":</w:t>
+      </w:r>
+      <w:r>
+        <w:t xml:space="preserve"> </w:t>
+      </w:r>
+      <w:r>
+        <w:rPr>
+          <w:b/>
+          <w:bCs/>
+        </w:rPr>
+        <w:t xml:space="preserve">Nộp bản sửa</w:t>
+      </w:r>
+      <w:r>
+        <w:t xml:space="preserve">). Bài ít hơn số từ tối thiểu thì hệ thống hỏi lại ("Viết tiếp" / "Vẫn nộp"). Nộp xong ô soạn chuyển sang chỉ đọc kèm giờ nộp; nộp sau hạn (khi bài cho phép) được ghi là</w:t>
+      </w:r>
+      <w:r>
+        <w:t xml:space="preserve"> </w:t>
+      </w:r>
+      <w:r>
+        <w:rPr>
+          <w:b/>
+          <w:bCs/>
+        </w:rPr>
+        <w:t xml:space="preserve">nộp muộn</w:t>
+      </w:r>
+      <w:r>
+        <w:t xml:space="preserve">.</w:t>
       </w:r>
     </w:p>
     <w:p>
@@ -4845,22 +4765,27 @@
         </w:numPr>
       </w:pPr>
       <w:r>
-        <w:t xml:space="preserve">Đăng nhập</w:t>
-      </w:r>
-      <w:r>
-        <w:t xml:space="preserve"> </w:t>
-      </w:r>
-      <w:r>
-        <w:rPr>
-          <w:rStyle w:val="VerbatimChar"/>
-        </w:rPr>
-        <w:t xml:space="preserve">DEMO001</w:t>
-      </w:r>
-      <w:r>
-        <w:t xml:space="preserve"> </w:t>
-      </w:r>
-      <w:r>
-        <w:t xml:space="preserve">ở trình duyệt thứ ba → máy B hiện "Tài khoản vừa đăng nhập ở nơi khác".</w:t>
+        <w:rPr>
+          <w:b/>
+          <w:bCs/>
+        </w:rPr>
+        <w:t xml:space="preserve">Đồng hồ đếm ngược</w:t>
+      </w:r>
+      <w:r>
+        <w:t xml:space="preserve"> </w:t>
+      </w:r>
+      <w:r>
+        <w:t xml:space="preserve">theo giờ máy chủ (tự đồng bộ 5 phút một lần). Quá hạn mà bài không cho nộp muộn, hoặc bài đã đóng, thì ô soạn khoá lại và ghi lý do.</w:t>
+      </w:r>
+    </w:p>
+    <w:bookmarkEnd w:id="28"/>
+    <w:bookmarkStart w:id="29" w:name="X3b2aee35a6458aa45263b9eff75cd6a1e1138d6"/>
+    <w:p>
+      <w:pPr>
+        <w:pStyle w:val="Heading3"/>
+      </w:pPr>
+      <w:r>
+        <w:t xml:space="preserve">7.4. Đang làm</w:t>
       </w:r>
     </w:p>
     <w:p>
@@ -4868,43 +4793,62 @@
         <w:pStyle w:val="FirstParagraph"/>
       </w:pPr>
       <w:r>
-        <w:t xml:space="preserve">Muốn làm lại từ đầu: xoá dữ liệu (Docker:</w:t>
-      </w:r>
-      <w:r>
-        <w:t xml:space="preserve"> </w:t>
-      </w:r>
-      <w:r>
-        <w:rPr>
-          <w:rStyle w:val="VerbatimChar"/>
-        </w:rPr>
-        <w:t xml:space="preserve">docker compose down -v</w:t>
-      </w:r>
-      <w:r>
-        <w:t xml:space="preserve">; trên máy: xoá và tạo lại DB</w:t>
-      </w:r>
-      <w:r>
-        <w:t xml:space="preserve"> </w:t>
-      </w:r>
-      <w:r>
-        <w:rPr>
-          <w:rStyle w:val="VerbatimChar"/>
-        </w:rPr>
-        <w:t xml:space="preserve">ielts</w:t>
-      </w:r>
-      <w:r>
-        <w:t xml:space="preserve">) rồi khởi động lại với profile</w:t>
-      </w:r>
-      <w:r>
-        <w:t xml:space="preserve"> </w:t>
-      </w:r>
-      <w:r>
-        <w:rPr>
-          <w:rStyle w:val="VerbatimChar"/>
-        </w:rPr>
-        <w:t xml:space="preserve">demo</w:t>
-      </w:r>
-      <w:r>
-        <w:t xml:space="preserve">.</w:t>
+        <w:rPr>
+          <w:b/>
+          <w:bCs/>
+        </w:rPr>
+        <w:t xml:space="preserve">Giữ nháp khi mất mạng</w:t>
+      </w:r>
+      <w:r>
+        <w:t xml:space="preserve">,</w:t>
+      </w:r>
+      <w:r>
+        <w:t xml:space="preserve"> </w:t>
+      </w:r>
+      <w:r>
+        <w:rPr>
+          <w:b/>
+          <w:bCs/>
+        </w:rPr>
+        <w:t xml:space="preserve">xem kết quả chi tiết</w:t>
+      </w:r>
+      <w:r>
+        <w:t xml:space="preserve"> </w:t>
+      </w:r>
+      <w:r>
+        <w:t xml:space="preserve">(nhận xét trên bài, mã lỗi, so sánh các lần nộp),</w:t>
+      </w:r>
+      <w:r>
+        <w:t xml:space="preserve"> </w:t>
+      </w:r>
+      <w:r>
+        <w:rPr>
+          <w:b/>
+          <w:bCs/>
+        </w:rPr>
+        <w:t xml:space="preserve">kết quả học tập</w:t>
+      </w:r>
+      <w:r>
+        <w:t xml:space="preserve"> </w:t>
+      </w:r>
+      <w:r>
+        <w:t xml:space="preserve">và</w:t>
+      </w:r>
+      <w:r>
+        <w:t xml:space="preserve"> </w:t>
+      </w:r>
+      <w:r>
+        <w:rPr>
+          <w:b/>
+          <w:bCs/>
+        </w:rPr>
+        <w:t xml:space="preserve">trao đổi</w:t>
+      </w:r>
+      <w:r>
+        <w:t xml:space="preserve"> </w:t>
+      </w:r>
+      <w:r>
+        <w:t xml:space="preserve">sẽ có ở các bước tiếp theo.</w:t>
       </w:r>
     </w:p>
     <w:p>
@@ -4914,8 +4858,293 @@
         </w:pict>
       </w:r>
     </w:p>
+    <w:bookmarkEnd w:id="29"/>
     <w:bookmarkEnd w:id="30"/>
-    <w:bookmarkStart w:id="31" w:name="X2aaa61dde1ecd98f080cbe2f0cfb81c5163d5ab"/>
+    <w:bookmarkStart w:id="31" w:name="X27a74f3cf0506426a1a76b4e73d04f5d967bbd0"/>
+    <w:p>
+      <w:pPr>
+        <w:pStyle w:val="Heading2"/>
+      </w:pPr>
+      <w:r>
+        <w:t xml:space="preserve">8. Kịch bản demo gợi ý (~10 phút)</w:t>
+      </w:r>
+    </w:p>
+    <w:p>
+      <w:pPr>
+        <w:pStyle w:val="FirstParagraph"/>
+      </w:pPr>
+      <w:r>
+        <w:t xml:space="preserve">Mở hai trình duyệt (hoặc một cửa sổ ẩn danh): máy A đăng nhập</w:t>
+      </w:r>
+      <w:r>
+        <w:t xml:space="preserve"> </w:t>
+      </w:r>
+      <w:r>
+        <w:rPr>
+          <w:rStyle w:val="VerbatimChar"/>
+        </w:rPr>
+        <w:t xml:space="preserve">gv.demo</w:t>
+      </w:r>
+      <w:r>
+        <w:t xml:space="preserve">, máy B đăng nhập</w:t>
+      </w:r>
+      <w:r>
+        <w:t xml:space="preserve"> </w:t>
+      </w:r>
+      <w:r>
+        <w:rPr>
+          <w:rStyle w:val="VerbatimChar"/>
+        </w:rPr>
+        <w:t xml:space="preserve">DEMO001</w:t>
+      </w:r>
+      <w:r>
+        <w:t xml:space="preserve">.</w:t>
+      </w:r>
+    </w:p>
+    <w:p>
+      <w:pPr>
+        <w:pStyle w:val="Compact"/>
+        <w:numPr>
+          <w:ilvl w:val="0"/>
+          <w:numId w:val="1007"/>
+        </w:numPr>
+      </w:pPr>
+      <w:r>
+        <w:rPr>
+          <w:b/>
+          <w:bCs/>
+        </w:rPr>
+        <w:t xml:space="preserve">Admin</w:t>
+      </w:r>
+      <w:r>
+        <w:t xml:space="preserve"> </w:t>
+      </w:r>
+      <w:r>
+        <w:t xml:space="preserve">(</w:t>
+      </w:r>
+      <w:r>
+        <w:rPr>
+          <w:rStyle w:val="VerbatimChar"/>
+        </w:rPr>
+        <w:t xml:space="preserve">admin</w:t>
+      </w:r>
+      <w:r>
+        <w:t xml:space="preserve">): Tổng quan → Giáo viên → thêm một giáo viên, xem mật khẩu tạm hiện một lần → Nhật ký thấy dòng "Tạo giáo viên".</w:t>
+      </w:r>
+    </w:p>
+    <w:p>
+      <w:pPr>
+        <w:pStyle w:val="Compact"/>
+        <w:numPr>
+          <w:ilvl w:val="0"/>
+          <w:numId w:val="1007"/>
+        </w:numPr>
+      </w:pPr>
+      <w:r>
+        <w:rPr>
+          <w:b/>
+          <w:bCs/>
+        </w:rPr>
+        <w:t xml:space="preserve">Giáo viên</w:t>
+      </w:r>
+      <w:r>
+        <w:t xml:space="preserve"> </w:t>
+      </w:r>
+      <w:r>
+        <w:t xml:space="preserve">(máy A): Lớp học → mở</w:t>
+      </w:r>
+      <w:r>
+        <w:t xml:space="preserve"> </w:t>
+      </w:r>
+      <w:r>
+        <w:rPr>
+          <w:rStyle w:val="VerbatimChar"/>
+        </w:rPr>
+        <w:t xml:space="preserve">DEMO-A</w:t>
+      </w:r>
+      <w:r>
+        <w:t xml:space="preserve"> </w:t>
+      </w:r>
+      <w:r>
+        <w:t xml:space="preserve">→ Import file mẫu đã điền vài sinh viên → xem kết quả, tải file tài khoản.</w:t>
+      </w:r>
+    </w:p>
+    <w:p>
+      <w:pPr>
+        <w:pStyle w:val="Compact"/>
+        <w:numPr>
+          <w:ilvl w:val="0"/>
+          <w:numId w:val="1007"/>
+        </w:numPr>
+      </w:pPr>
+      <w:r>
+        <w:t xml:space="preserve">Bài tập → mở</w:t>
+      </w:r>
+      <w:r>
+        <w:t xml:space="preserve"> </w:t>
+      </w:r>
+      <w:r>
+        <w:rPr>
+          <w:b/>
+          <w:bCs/>
+        </w:rPr>
+        <w:t xml:space="preserve">"Tuần 2"</w:t>
+      </w:r>
+      <w:r>
+        <w:t xml:space="preserve"> </w:t>
+      </w:r>
+      <w:r>
+        <w:t xml:space="preserve">(nháp) →</w:t>
+      </w:r>
+      <w:r>
+        <w:t xml:space="preserve"> </w:t>
+      </w:r>
+      <w:r>
+        <w:rPr>
+          <w:b/>
+          <w:bCs/>
+        </w:rPr>
+        <w:t xml:space="preserve">Giao bài &amp; phát hành</w:t>
+      </w:r>
+      <w:r>
+        <w:t xml:space="preserve"> </w:t>
+      </w:r>
+      <w:r>
+        <w:t xml:space="preserve">cho lớp</w:t>
+      </w:r>
+      <w:r>
+        <w:t xml:space="preserve"> </w:t>
+      </w:r>
+      <w:r>
+        <w:rPr>
+          <w:rStyle w:val="VerbatimChar"/>
+        </w:rPr>
+        <w:t xml:space="preserve">DEMO-A</w:t>
+      </w:r>
+      <w:r>
+        <w:t xml:space="preserve"> </w:t>
+      </w:r>
+      <w:r>
+        <w:t xml:space="preserve">→ máy B (</w:t>
+      </w:r>
+      <w:r>
+        <w:rPr>
+          <w:rStyle w:val="VerbatimChar"/>
+        </w:rPr>
+        <w:t xml:space="preserve">DEMO001</w:t>
+      </w:r>
+      <w:r>
+        <w:t xml:space="preserve">) thấy</w:t>
+      </w:r>
+      <w:r>
+        <w:t xml:space="preserve"> </w:t>
+      </w:r>
+      <w:r>
+        <w:rPr>
+          <w:b/>
+          <w:bCs/>
+        </w:rPr>
+        <w:t xml:space="preserve">thông báo bật lên ngay</w:t>
+      </w:r>
+      <w:r>
+        <w:t xml:space="preserve"> </w:t>
+      </w:r>
+      <w:r>
+        <w:t xml:space="preserve">và số trên chuông tăng.</w:t>
+      </w:r>
+    </w:p>
+    <w:p>
+      <w:pPr>
+        <w:pStyle w:val="Compact"/>
+        <w:numPr>
+          <w:ilvl w:val="0"/>
+          <w:numId w:val="1007"/>
+        </w:numPr>
+      </w:pPr>
+      <w:r>
+        <w:t xml:space="preserve">Tắt mạng máy B vài giây (hoặc khởi động lại backend) → thanh vàng "Mất kết nối… đang thử lại" → bật lại → tự kết nối.</w:t>
+      </w:r>
+    </w:p>
+    <w:p>
+      <w:pPr>
+        <w:pStyle w:val="Compact"/>
+        <w:numPr>
+          <w:ilvl w:val="0"/>
+          <w:numId w:val="1007"/>
+        </w:numPr>
+      </w:pPr>
+      <w:r>
+        <w:t xml:space="preserve">Đăng nhập</w:t>
+      </w:r>
+      <w:r>
+        <w:t xml:space="preserve"> </w:t>
+      </w:r>
+      <w:r>
+        <w:rPr>
+          <w:rStyle w:val="VerbatimChar"/>
+        </w:rPr>
+        <w:t xml:space="preserve">DEMO001</w:t>
+      </w:r>
+      <w:r>
+        <w:t xml:space="preserve"> </w:t>
+      </w:r>
+      <w:r>
+        <w:t xml:space="preserve">ở trình duyệt thứ ba → máy B hiện "Tài khoản vừa đăng nhập ở nơi khác".</w:t>
+      </w:r>
+    </w:p>
+    <w:p>
+      <w:pPr>
+        <w:pStyle w:val="FirstParagraph"/>
+      </w:pPr>
+      <w:r>
+        <w:t xml:space="preserve">Muốn làm lại từ đầu: xoá dữ liệu (Docker:</w:t>
+      </w:r>
+      <w:r>
+        <w:t xml:space="preserve"> </w:t>
+      </w:r>
+      <w:r>
+        <w:rPr>
+          <w:rStyle w:val="VerbatimChar"/>
+        </w:rPr>
+        <w:t xml:space="preserve">docker compose down -v</w:t>
+      </w:r>
+      <w:r>
+        <w:t xml:space="preserve">; trên máy: xoá và tạo lại DB</w:t>
+      </w:r>
+      <w:r>
+        <w:t xml:space="preserve"> </w:t>
+      </w:r>
+      <w:r>
+        <w:rPr>
+          <w:rStyle w:val="VerbatimChar"/>
+        </w:rPr>
+        <w:t xml:space="preserve">ielts</w:t>
+      </w:r>
+      <w:r>
+        <w:t xml:space="preserve">) rồi khởi động lại với profile</w:t>
+      </w:r>
+      <w:r>
+        <w:t xml:space="preserve"> </w:t>
+      </w:r>
+      <w:r>
+        <w:rPr>
+          <w:rStyle w:val="VerbatimChar"/>
+        </w:rPr>
+        <w:t xml:space="preserve">demo</w:t>
+      </w:r>
+      <w:r>
+        <w:t xml:space="preserve">.</w:t>
+      </w:r>
+    </w:p>
+    <w:p>
+      <w:r>
+        <w:pict>
+          <v:rect style="width:0;height:1.5pt" o:hralign="center" o:hrstd="t" o:hr="t"/>
+        </w:pict>
+      </w:r>
+    </w:p>
+    <w:bookmarkEnd w:id="31"/>
+    <w:bookmarkStart w:id="32" w:name="X2aaa61dde1ecd98f080cbe2f0cfb81c5163d5ab"/>
     <w:p>
       <w:pPr>
         <w:pStyle w:val="Heading2"/>
@@ -5266,8 +5495,8 @@
         </w:tc>
       </w:tr>
     </w:tbl>
-    <w:bookmarkEnd w:id="31"/>
     <w:bookmarkEnd w:id="32"/>
+    <w:bookmarkEnd w:id="33"/>
     <w:sectPr>
       <w:footnotePr>
         <w:numRestart w:val="eachSect"/>
@@ -5612,6 +5841,9 @@
     <w:abstractNumId w:val="991"/>
   </w:num>
   <w:num w:numId="1006">
+    <w:abstractNumId w:val="991"/>
+  </w:num>
+  <w:num w:numId="1007">
     <w:abstractNumId w:val="99411"/>
     <w:lvlOverride w:ilvl="0">
       <w:startOverride w:val="1"/>

</xml_diff>

<commit_message>
Frontend F4c: nháp offline bằng IndexedDB cho màn làm bài
- Mỗi lần gõ ghi IndexedDB (IndexedDB gốc, khoá theo người dùng + phần); lỗi mạng / 502–504 → OFFLINE, sự kiện online → gửi lại
- Nút nộp khoá khi mất mạng; mở lại màn còn bản chưa gửi → server chưa đổi thì gửi lên, đã đổi thì hỏi chọn bản
- Quy tắc khôi phục + nhận diện lỗi mạng có test (lib/utils/offlineDraft.ts); hook useOnlineStatus
- docs/10 mục 7.3; xuất lại Word

Co-Authored-By: Claude Opus 5.5 <noreply@anthropic.com>
</commit_message>
<xml_diff>
--- a/docx/10-huong-dan-su-dung.docx
+++ b/docx/10-huong-dan-su-dung.docx
@@ -258,7 +258,7 @@
               <w:pStyle w:val="Compact"/>
             </w:pPr>
             <w:r>
-              <w:t xml:space="preserve">Sinh viên: bài được giao, chi tiết bài, lịch sử nộp, làm bài, nộp bài</w:t>
+              <w:t xml:space="preserve">Sinh viên: bài được giao, chi tiết bài, lịch sử nộp, làm bài (cả khi mất mạng), nộp bài</w:t>
             </w:r>
           </w:p>
         </w:tc>
@@ -279,9 +279,6 @@
             <w:pPr>
               <w:pStyle w:val="Compact"/>
             </w:pPr>
-            <w:r>
-              <w:t xml:space="preserve">Nháp khi mất mạng chưa có (bước tiếp theo)</w:t>
-            </w:r>
           </w:p>
         </w:tc>
       </w:tr>
@@ -4660,10 +4657,10 @@
           <w:b/>
           <w:bCs/>
         </w:rPr>
-        <w:t xml:space="preserve">Mở cùng bài ở 2 tab / 2 máy</w:t>
-      </w:r>
-      <w:r>
-        <w:t xml:space="preserve">: khi một nơi lưu đè, nơi kia hiện hộp thoại cho xem cả hai bản (kèm số từ) để chọn</w:t>
+        <w:t xml:space="preserve">Mất mạng khi đang viết</w:t>
+      </w:r>
+      <w:r>
+        <w:t xml:space="preserve">: cứ viết tiếp, bài được giữ trên trình duyệt; dòng trạng thái ghi "Ngoại tuyến – đã lưu trên máy" và nút nộp tạm khoá ("Cần có mạng để nộp bài"). Có mạng lại, bài tự gửi lên máy chủ. Lỡ đóng trang khi chưa gửi được, mở lại màn làm bài trên</w:t>
       </w:r>
       <w:r>
         <w:t xml:space="preserve"> </w:t>
@@ -4673,26 +4670,13 @@
           <w:b/>
           <w:bCs/>
         </w:rPr>
-        <w:t xml:space="preserve">Dùng bản trên máy này</w:t>
-      </w:r>
-      <w:r>
-        <w:t xml:space="preserve"> </w:t>
-      </w:r>
-      <w:r>
-        <w:t xml:space="preserve">hoặc</w:t>
-      </w:r>
-      <w:r>
-        <w:t xml:space="preserve"> </w:t>
-      </w:r>
-      <w:r>
-        <w:rPr>
-          <w:b/>
-          <w:bCs/>
-        </w:rPr>
-        <w:t xml:space="preserve">Dùng bản trên máy chủ</w:t>
-      </w:r>
-      <w:r>
-        <w:t xml:space="preserve">.</w:t>
+        <w:t xml:space="preserve">cùng trình duyệt</w:t>
+      </w:r>
+      <w:r>
+        <w:t xml:space="preserve"> </w:t>
+      </w:r>
+      <w:r>
+        <w:t xml:space="preserve">thì bài được khôi phục (nếu trong lúc đó bài đã được sửa ở nơi khác, hệ thống hỏi chọn bản).</w:t>
       </w:r>
     </w:p>
     <w:p>
@@ -4708,10 +4692,10 @@
           <w:b/>
           <w:bCs/>
         </w:rPr>
-        <w:t xml:space="preserve">Nộp</w:t>
-      </w:r>
-      <w:r>
-        <w:t xml:space="preserve">: bấm</w:t>
+        <w:t xml:space="preserve">Mở cùng bài ở 2 tab / 2 máy</w:t>
+      </w:r>
+      <w:r>
+        <w:t xml:space="preserve">: khi một nơi lưu đè, nơi kia hiện hộp thoại cho xem cả hai bản (kèm số từ) để chọn</w:t>
       </w:r>
       <w:r>
         <w:t xml:space="preserve"> </w:t>
@@ -4721,13 +4705,13 @@
           <w:b/>
           <w:bCs/>
         </w:rPr>
-        <w:t xml:space="preserve">Nộp phần này</w:t>
-      </w:r>
-      <w:r>
-        <w:t xml:space="preserve"> </w:t>
-      </w:r>
-      <w:r>
-        <w:t xml:space="preserve">(đang "Cần sửa":</w:t>
+        <w:t xml:space="preserve">Dùng bản trên máy này</w:t>
+      </w:r>
+      <w:r>
+        <w:t xml:space="preserve"> </w:t>
+      </w:r>
+      <w:r>
+        <w:t xml:space="preserve">hoặc</w:t>
       </w:r>
       <w:r>
         <w:t xml:space="preserve"> </w:t>
@@ -4737,20 +4721,7 @@
           <w:b/>
           <w:bCs/>
         </w:rPr>
-        <w:t xml:space="preserve">Nộp bản sửa</w:t>
-      </w:r>
-      <w:r>
-        <w:t xml:space="preserve">). Bài ít hơn số từ tối thiểu thì hệ thống hỏi lại ("Viết tiếp" / "Vẫn nộp"). Nộp xong ô soạn chuyển sang chỉ đọc kèm giờ nộp; nộp sau hạn (khi bài cho phép) được ghi là</w:t>
-      </w:r>
-      <w:r>
-        <w:t xml:space="preserve"> </w:t>
-      </w:r>
-      <w:r>
-        <w:rPr>
-          <w:b/>
-          <w:bCs/>
-        </w:rPr>
-        <w:t xml:space="preserve">nộp muộn</w:t>
+        <w:t xml:space="preserve">Dùng bản trên máy chủ</w:t>
       </w:r>
       <w:r>
         <w:t xml:space="preserve">.</w:t>
@@ -4769,6 +4740,67 @@
           <w:b/>
           <w:bCs/>
         </w:rPr>
+        <w:t xml:space="preserve">Nộp</w:t>
+      </w:r>
+      <w:r>
+        <w:t xml:space="preserve">: bấm</w:t>
+      </w:r>
+      <w:r>
+        <w:t xml:space="preserve"> </w:t>
+      </w:r>
+      <w:r>
+        <w:rPr>
+          <w:b/>
+          <w:bCs/>
+        </w:rPr>
+        <w:t xml:space="preserve">Nộp phần này</w:t>
+      </w:r>
+      <w:r>
+        <w:t xml:space="preserve"> </w:t>
+      </w:r>
+      <w:r>
+        <w:t xml:space="preserve">(đang "Cần sửa":</w:t>
+      </w:r>
+      <w:r>
+        <w:t xml:space="preserve"> </w:t>
+      </w:r>
+      <w:r>
+        <w:rPr>
+          <w:b/>
+          <w:bCs/>
+        </w:rPr>
+        <w:t xml:space="preserve">Nộp bản sửa</w:t>
+      </w:r>
+      <w:r>
+        <w:t xml:space="preserve">). Bài ít hơn số từ tối thiểu thì hệ thống hỏi lại ("Viết tiếp" / "Vẫn nộp"). Nộp xong ô soạn chuyển sang chỉ đọc kèm giờ nộp; nộp sau hạn (khi bài cho phép) được ghi là</w:t>
+      </w:r>
+      <w:r>
+        <w:t xml:space="preserve"> </w:t>
+      </w:r>
+      <w:r>
+        <w:rPr>
+          <w:b/>
+          <w:bCs/>
+        </w:rPr>
+        <w:t xml:space="preserve">nộp muộn</w:t>
+      </w:r>
+      <w:r>
+        <w:t xml:space="preserve">.</w:t>
+      </w:r>
+    </w:p>
+    <w:p>
+      <w:pPr>
+        <w:pStyle w:val="Compact"/>
+        <w:numPr>
+          <w:ilvl w:val="0"/>
+          <w:numId w:val="1006"/>
+        </w:numPr>
+      </w:pPr>
+      <w:r>
+        <w:rPr>
+          <w:b/>
+          <w:bCs/>
+        </w:rPr>
         <w:t xml:space="preserve">Đồng hồ đếm ngược</w:t>
       </w:r>
       <w:r>
@@ -4797,20 +4829,7 @@
           <w:b/>
           <w:bCs/>
         </w:rPr>
-        <w:t xml:space="preserve">Giữ nháp khi mất mạng</w:t>
-      </w:r>
-      <w:r>
-        <w:t xml:space="preserve">,</w:t>
-      </w:r>
-      <w:r>
-        <w:t xml:space="preserve"> </w:t>
-      </w:r>
-      <w:r>
-        <w:rPr>
-          <w:b/>
-          <w:bCs/>
-        </w:rPr>
-        <w:t xml:space="preserve">xem kết quả chi tiết</w:t>
+        <w:t xml:space="preserve">Xem kết quả chi tiết</w:t>
       </w:r>
       <w:r>
         <w:t xml:space="preserve"> </w:t>

</xml_diff>

<commit_message>
Frontend F5a: giáo viên chấm bài — hàng đợi và màn chấm
- Hàng đợi: lọc bài tập / phần / lớp / từ khoá, tab trạng thái, bộ lọc trên URL
- Màn chấm: bài làm 58% / bảng chấm 42% (dưới 1024px thành 2 tab), cảnh báo số từ
- CriterionCard (checklist Đạt / Giới hạn điểm) + ScorePicker khoá mức vượt giới hạn, tự hạ điểm (BR-17, BR-18)
- Band xem trước (BR-12), chấm 0 có lý do (BR-19), tự lưu nháp 2 giây, trả bài, yêu cầu sửa (BR-10)
- Chọn lần nộp để xem lại, Trước / Sau theo hàng đợi, trả xong tự sang bài kế
- lib/utils/grading.ts có test; docs/10 mục 6.4 hướng dẫn chấm bài; xuất lại Word

Co-Authored-By: Claude Opus 5.5 <noreply@anthropic.com>
</commit_message>
<xml_diff>
--- a/docx/10-huong-dan-su-dung.docx
+++ b/docx/10-huong-dan-su-dung.docx
@@ -28,7 +28,7 @@
         </w:p>
       </w:sdtContent>
     </w:sdt>
-    <w:bookmarkStart w:id="33" w:name="X62b689528c743ccb8c3229542497059f4aa59b0"/>
+    <w:bookmarkStart w:id="34" w:name="X62b689528c743ccb8c3229542497059f4aa59b0"/>
     <w:p>
       <w:pPr>
         <w:pStyle w:val="Heading1"/>
@@ -223,7 +223,42 @@
               <w:pStyle w:val="Compact"/>
             </w:pPr>
             <w:r>
-              <w:t xml:space="preserve">Giáo viên: tiến độ, chấm bài, thống kê, trao đổi</w:t>
+              <w:t xml:space="preserve">Giáo viên: chấm bài (hàng đợi, chấm theo tiêu chí, trả bài, yêu cầu sửa)</w:t>
+            </w:r>
+          </w:p>
+        </w:tc>
+        <w:tc>
+          <w:tcPr/>
+          <w:p>
+            <w:pPr>
+              <w:pStyle w:val="Compact"/>
+            </w:pPr>
+            <w:r>
+              <w:t xml:space="preserve">✅ Dùng được</w:t>
+            </w:r>
+          </w:p>
+        </w:tc>
+        <w:tc>
+          <w:tcPr/>
+          <w:p>
+            <w:pPr>
+              <w:pStyle w:val="Compact"/>
+            </w:pPr>
+            <w:r>
+              <w:t xml:space="preserve">Nhận xét inline, ngân hàng nhận xét, so sánh 2 lần nộp: bước tiếp theo</w:t>
+            </w:r>
+          </w:p>
+        </w:tc>
+      </w:tr>
+      <w:tr>
+        <w:tc>
+          <w:tcPr/>
+          <w:p>
+            <w:pPr>
+              <w:pStyle w:val="Compact"/>
+            </w:pPr>
+            <w:r>
+              <w:t xml:space="preserve">Giáo viên: tiến độ, thống kê, trao đổi</w:t>
             </w:r>
           </w:p>
         </w:tc>
@@ -3130,7 +3165,7 @@
       </w:r>
     </w:p>
     <w:bookmarkEnd w:id="19"/>
-    <w:bookmarkStart w:id="25" w:name="Xb09ea090739f16ea647716f93f754b282728bef"/>
+    <w:bookmarkStart w:id="26" w:name="Xb09ea090739f16ea647716f93f754b282728bef"/>
     <w:p>
       <w:pPr>
         <w:pStyle w:val="Heading2"/>
@@ -4054,13 +4089,367 @@
       </w:r>
     </w:p>
     <w:bookmarkEnd w:id="23"/>
-    <w:bookmarkStart w:id="24" w:name="X7b8b21a7018f0faf6866fd4753739ec65bdaff1"/>
+    <w:bookmarkStart w:id="24" w:name="Xc3f2302343b4f1fa7977b63f3094e59b378a402"/>
     <w:p>
       <w:pPr>
         <w:pStyle w:val="Heading3"/>
       </w:pPr>
       <w:r>
-        <w:t xml:space="preserve">6.4. Đang làm</w:t>
+        <w:t xml:space="preserve">6.4. Chấm bài</w:t>
+      </w:r>
+    </w:p>
+    <w:p>
+      <w:pPr>
+        <w:pStyle w:val="Compact"/>
+        <w:numPr>
+          <w:ilvl w:val="0"/>
+          <w:numId w:val="1005"/>
+        </w:numPr>
+      </w:pPr>
+      <w:r>
+        <w:rPr>
+          <w:b/>
+          <w:bCs/>
+        </w:rPr>
+        <w:t xml:space="preserve">Hàng đợi</w:t>
+      </w:r>
+      <w:r>
+        <w:t xml:space="preserve"> </w:t>
+      </w:r>
+      <w:r>
+        <w:t xml:space="preserve">(menu</w:t>
+      </w:r>
+      <w:r>
+        <w:t xml:space="preserve"> </w:t>
+      </w:r>
+      <w:r>
+        <w:rPr>
+          <w:b/>
+          <w:bCs/>
+        </w:rPr>
+        <w:t xml:space="preserve">Chấm bài</w:t>
+      </w:r>
+      <w:r>
+        <w:t xml:space="preserve">, hoặc nút "Chấm bài" ở danh sách / chi tiết bài tập): lọc theo bài tập, phần, lớp, mã SV / họ tên; tab</w:t>
+      </w:r>
+      <w:r>
+        <w:t xml:space="preserve"> </w:t>
+      </w:r>
+      <w:r>
+        <w:rPr>
+          <w:b/>
+          <w:bCs/>
+        </w:rPr>
+        <w:t xml:space="preserve">Chờ chấm / Đang chấm / Đã trả / Cần sửa</w:t>
+      </w:r>
+      <w:r>
+        <w:t xml:space="preserve">. Bài nộp trước xếp trước; nhãn</w:t>
+      </w:r>
+      <w:r>
+        <w:t xml:space="preserve"> </w:t>
+      </w:r>
+      <w:r>
+        <w:rPr>
+          <w:rStyle w:val="VerbatimChar"/>
+        </w:rPr>
+        <w:t xml:space="preserve">v2</w:t>
+      </w:r>
+      <w:r>
+        <w:t xml:space="preserve"> </w:t>
+      </w:r>
+      <w:r>
+        <w:t xml:space="preserve">= bài nộp lại sau khi yêu cầu sửa, nhãn "Nộp muộn" nếu nộp sau hạn. Bấm</w:t>
+      </w:r>
+      <w:r>
+        <w:t xml:space="preserve"> </w:t>
+      </w:r>
+      <w:r>
+        <w:rPr>
+          <w:b/>
+          <w:bCs/>
+        </w:rPr>
+        <w:t xml:space="preserve">Chấm</w:t>
+      </w:r>
+      <w:r>
+        <w:t xml:space="preserve">.</w:t>
+      </w:r>
+    </w:p>
+    <w:p>
+      <w:pPr>
+        <w:pStyle w:val="Compact"/>
+        <w:numPr>
+          <w:ilvl w:val="0"/>
+          <w:numId w:val="1005"/>
+        </w:numPr>
+      </w:pPr>
+      <w:r>
+        <w:rPr>
+          <w:b/>
+          <w:bCs/>
+        </w:rPr>
+        <w:t xml:space="preserve">Màn chấm</w:t>
+      </w:r>
+      <w:r>
+        <w:t xml:space="preserve">: bài làm bên trái (cảnh báo khi bài ≤ 20 từ hoặc dưới số từ tối thiểu; bấm "Đề bài" để xem đề), bảng chấm bên phải. Màn hình nhỏ: chuyển giữa tab</w:t>
+      </w:r>
+      <w:r>
+        <w:t xml:space="preserve"> </w:t>
+      </w:r>
+      <w:r>
+        <w:rPr>
+          <w:b/>
+          <w:bCs/>
+        </w:rPr>
+        <w:t xml:space="preserve">Bài làm</w:t>
+      </w:r>
+      <w:r>
+        <w:t xml:space="preserve"> </w:t>
+      </w:r>
+      <w:r>
+        <w:t xml:space="preserve">/</w:t>
+      </w:r>
+      <w:r>
+        <w:t xml:space="preserve"> </w:t>
+      </w:r>
+      <w:r>
+        <w:rPr>
+          <w:b/>
+          <w:bCs/>
+        </w:rPr>
+        <w:t xml:space="preserve">Chấm điểm</w:t>
+      </w:r>
+      <w:r>
+        <w:t xml:space="preserve">.</w:t>
+      </w:r>
+    </w:p>
+    <w:p>
+      <w:pPr>
+        <w:pStyle w:val="Compact"/>
+        <w:numPr>
+          <w:ilvl w:val="1"/>
+          <w:numId w:val="1006"/>
+        </w:numPr>
+      </w:pPr>
+      <w:r>
+        <w:t xml:space="preserve">Mỗi tiêu chí: tick checklist, chọn điểm (bấm lại để bỏ chọn, hoặc dùng phím ← →), ghi nhận xét. Tick mục</w:t>
+      </w:r>
+      <w:r>
+        <w:t xml:space="preserve"> </w:t>
+      </w:r>
+      <w:r>
+        <w:rPr>
+          <w:b/>
+          <w:bCs/>
+        </w:rPr>
+        <w:t xml:space="preserve">"Giới hạn điểm"</w:t>
+      </w:r>
+      <w:r>
+        <w:t xml:space="preserve"> </w:t>
+      </w:r>
+      <w:r>
+        <w:t xml:space="preserve">(nhãn cam "Tối đa N") thì các mức cao hơn bị khoá kèm lý do, điểm đang chọn cao hơn sẽ tự hạ xuống. Bài ≤ 20 từ: mọi tiêu chí tối đa 1.</w:t>
+      </w:r>
+    </w:p>
+    <w:p>
+      <w:pPr>
+        <w:pStyle w:val="Compact"/>
+        <w:numPr>
+          <w:ilvl w:val="1"/>
+          <w:numId w:val="1006"/>
+        </w:numPr>
+      </w:pPr>
+      <w:r>
+        <w:rPr>
+          <w:b/>
+          <w:bCs/>
+        </w:rPr>
+        <w:t xml:space="preserve">Band của phần</w:t>
+      </w:r>
+      <w:r>
+        <w:t xml:space="preserve"> </w:t>
+      </w:r>
+      <w:r>
+        <w:t xml:space="preserve">hiện ngay khi chấm đủ (trung bình các tiêu chí, làm tròn kiểu IELTS .25 / .75).</w:t>
+      </w:r>
+    </w:p>
+    <w:p>
+      <w:pPr>
+        <w:pStyle w:val="Compact"/>
+        <w:numPr>
+          <w:ilvl w:val="1"/>
+          <w:numId w:val="1006"/>
+        </w:numPr>
+      </w:pPr>
+      <w:r>
+        <w:rPr>
+          <w:b/>
+          <w:bCs/>
+        </w:rPr>
+        <w:t xml:space="preserve">Chấm 0</w:t>
+      </w:r>
+      <w:r>
+        <w:t xml:space="preserve"> </w:t>
+      </w:r>
+      <w:r>
+        <w:t xml:space="preserve">(góc trên bảng chấm): chọn lý do Không làm bài / Không viết bằng tiếng Anh / Học thuộc hoàn toàn; bấm "Bỏ chấm 0" để chấm lại bình thường.</w:t>
+      </w:r>
+    </w:p>
+    <w:p>
+      <w:pPr>
+        <w:pStyle w:val="Compact"/>
+        <w:numPr>
+          <w:ilvl w:val="1"/>
+          <w:numId w:val="1006"/>
+        </w:numPr>
+      </w:pPr>
+      <w:r>
+        <w:t xml:space="preserve">Kết quả</w:t>
+      </w:r>
+      <w:r>
+        <w:t xml:space="preserve"> </w:t>
+      </w:r>
+      <w:r>
+        <w:rPr>
+          <w:b/>
+          <w:bCs/>
+        </w:rPr>
+        <w:t xml:space="preserve">tự lưu nháp</w:t>
+      </w:r>
+      <w:r>
+        <w:t xml:space="preserve"> </w:t>
+      </w:r>
+      <w:r>
+        <w:t xml:space="preserve">2 giây sau mỗi thay đổi (hoặc bấm</w:t>
+      </w:r>
+      <w:r>
+        <w:t xml:space="preserve"> </w:t>
+      </w:r>
+      <w:r>
+        <w:rPr>
+          <w:b/>
+          <w:bCs/>
+        </w:rPr>
+        <w:t xml:space="preserve">Lưu nháp</w:t>
+      </w:r>
+      <w:r>
+        <w:t xml:space="preserve">); sinh viên chưa thấy gì cho tới khi trả bài.</w:t>
+      </w:r>
+    </w:p>
+    <w:p>
+      <w:pPr>
+        <w:pStyle w:val="Compact"/>
+        <w:numPr>
+          <w:ilvl w:val="1"/>
+          <w:numId w:val="1006"/>
+        </w:numPr>
+      </w:pPr>
+      <w:r>
+        <w:rPr>
+          <w:b/>
+          <w:bCs/>
+        </w:rPr>
+        <w:t xml:space="preserve">Trả bài</w:t>
+      </w:r>
+      <w:r>
+        <w:t xml:space="preserve">: cần chấm đủ mọi tiêu chí. Sinh viên nhận thông báo và thấy band, nhận xét.</w:t>
+      </w:r>
+    </w:p>
+    <w:p>
+      <w:pPr>
+        <w:pStyle w:val="Compact"/>
+        <w:numPr>
+          <w:ilvl w:val="1"/>
+          <w:numId w:val="1006"/>
+        </w:numPr>
+      </w:pPr>
+      <w:r>
+        <w:rPr>
+          <w:b/>
+          <w:bCs/>
+        </w:rPr>
+        <w:t xml:space="preserve">Yêu cầu sửa</w:t>
+      </w:r>
+      <w:r>
+        <w:t xml:space="preserve">: nhập lời nhắn và hạn sửa; chỉ khi còn lượt sửa (theo cài đặt bài tập) và bài chưa đóng. Sinh viên nộp lại sẽ thành lần nộp mới (</w:t>
+      </w:r>
+      <w:r>
+        <w:rPr>
+          <w:rStyle w:val="VerbatimChar"/>
+        </w:rPr>
+        <w:t xml:space="preserve">v2</w:t>
+      </w:r>
+      <w:r>
+        <w:t xml:space="preserve">).</w:t>
+      </w:r>
+    </w:p>
+    <w:p>
+      <w:pPr>
+        <w:pStyle w:val="Compact"/>
+        <w:numPr>
+          <w:ilvl w:val="1"/>
+          <w:numId w:val="1006"/>
+        </w:numPr>
+      </w:pPr>
+      <w:r>
+        <w:t xml:space="preserve">Trả bài / yêu cầu sửa xong, màn tự chuyển sang</w:t>
+      </w:r>
+      <w:r>
+        <w:t xml:space="preserve"> </w:t>
+      </w:r>
+      <w:r>
+        <w:rPr>
+          <w:b/>
+          <w:bCs/>
+        </w:rPr>
+        <w:t xml:space="preserve">bài kế tiếp</w:t>
+      </w:r>
+      <w:r>
+        <w:t xml:space="preserve"> </w:t>
+      </w:r>
+      <w:r>
+        <w:t xml:space="preserve">trong hàng đợi. Nút</w:t>
+      </w:r>
+      <w:r>
+        <w:t xml:space="preserve"> </w:t>
+      </w:r>
+      <w:r>
+        <w:rPr>
+          <w:b/>
+          <w:bCs/>
+        </w:rPr>
+        <w:t xml:space="preserve">Trước / Sau</w:t>
+      </w:r>
+      <w:r>
+        <w:t xml:space="preserve"> </w:t>
+      </w:r>
+      <w:r>
+        <w:t xml:space="preserve">và số "3/12" đi theo bộ lọc của hàng đợi; ô chọn</w:t>
+      </w:r>
+      <w:r>
+        <w:t xml:space="preserve"> </w:t>
+      </w:r>
+      <w:r>
+        <w:rPr>
+          <w:b/>
+          <w:bCs/>
+        </w:rPr>
+        <w:t xml:space="preserve">Lần nộp</w:t>
+      </w:r>
+      <w:r>
+        <w:t xml:space="preserve"> </w:t>
+      </w:r>
+      <w:r>
+        <w:t xml:space="preserve">để xem lại các lần nộp cũ (chỉ xem).</w:t>
+      </w:r>
+    </w:p>
+    <w:bookmarkEnd w:id="24"/>
+    <w:bookmarkStart w:id="25" w:name="X6b492762c0885c215f1b682c1381e1b2b552abc"/>
+    <w:p>
+      <w:pPr>
+        <w:pStyle w:val="Heading3"/>
+      </w:pPr>
+      <w:r>
+        <w:t xml:space="preserve">6.5. Đang làm</w:t>
       </w:r>
     </w:p>
     <w:p>
@@ -4068,7 +4457,7 @@
         <w:pStyle w:val="FirstParagraph"/>
       </w:pPr>
       <w:r>
-        <w:t xml:space="preserve">Tiến độ realtime của lớp, chấm bài (checklist, band, nhận xét inline, trả bài / yêu cầu sửa), thống kê, xuất Excel và trao đổi (chat) đã có ở backend; giao diện sẽ có ở các bước tiếp theo.</w:t>
+        <w:t xml:space="preserve">Nhận xét trên bài (bôi đen → mã lỗi, gợi ý sửa), ngân hàng nhận xét, so sánh 2 lần nộp, tiến độ realtime của lớp, thống kê, xuất Excel và trao đổi (chat) đã có ở backend; giao diện sẽ có ở các bước tiếp theo.</w:t>
       </w:r>
     </w:p>
     <w:p>
@@ -4078,9 +4467,9 @@
         </w:pict>
       </w:r>
     </w:p>
-    <w:bookmarkEnd w:id="24"/>
     <w:bookmarkEnd w:id="25"/>
-    <w:bookmarkStart w:id="30" w:name="Xa4980557fe2b16e9ea1555bbc3e255ac8d44acd"/>
+    <w:bookmarkEnd w:id="26"/>
+    <w:bookmarkStart w:id="31" w:name="Xa4980557fe2b16e9ea1555bbc3e255ac8d44acd"/>
     <w:p>
       <w:pPr>
         <w:pStyle w:val="Heading2"/>
@@ -4089,7 +4478,7 @@
         <w:t xml:space="preserve">7. Sinh viên</w:t>
       </w:r>
     </w:p>
-    <w:bookmarkStart w:id="26" w:name="Xcffb4351e90d1c23fbec4b4d17fa845266992ba"/>
+    <w:bookmarkStart w:id="27" w:name="Xcffb4351e90d1c23fbec4b4d17fa845266992ba"/>
     <w:p>
       <w:pPr>
         <w:pStyle w:val="Heading3"/>
@@ -4349,8 +4738,8 @@
         <w:t xml:space="preserve">. Quá hạn mà bài không cho nộp muộn thì không còn nút "Làm bài".</w:t>
       </w:r>
     </w:p>
-    <w:bookmarkEnd w:id="26"/>
-    <w:bookmarkStart w:id="27" w:name="X005d57e46c787d0cadbca70fe6e284d1775213e"/>
+    <w:bookmarkEnd w:id="27"/>
+    <w:bookmarkStart w:id="28" w:name="X005d57e46c787d0cadbca70fe6e284d1775213e"/>
     <w:p>
       <w:pPr>
         <w:pStyle w:val="Heading3"/>
@@ -4365,559 +4754,6 @@
       </w:pPr>
       <w:r>
         <w:t xml:space="preserve">Bấm tên bài (hoặc bấm vào thông báo) để mở. Trang có:</w:t>
-      </w:r>
-    </w:p>
-    <w:p>
-      <w:pPr>
-        <w:pStyle w:val="Compact"/>
-        <w:numPr>
-          <w:ilvl w:val="0"/>
-          <w:numId w:val="1005"/>
-        </w:numPr>
-      </w:pPr>
-      <w:r>
-        <w:t xml:space="preserve">khung đỏ</w:t>
-      </w:r>
-      <w:r>
-        <w:t xml:space="preserve"> </w:t>
-      </w:r>
-      <w:r>
-        <w:rPr>
-          <w:b/>
-          <w:bCs/>
-        </w:rPr>
-        <w:t xml:space="preserve">"Giáo viên yêu cầu sửa …"</w:t>
-      </w:r>
-      <w:r>
-        <w:t xml:space="preserve"> </w:t>
-      </w:r>
-      <w:r>
-        <w:t xml:space="preserve">kèm hạn sửa, lời nhắn và nút</w:t>
-      </w:r>
-      <w:r>
-        <w:t xml:space="preserve"> </w:t>
-      </w:r>
-      <w:r>
-        <w:rPr>
-          <w:b/>
-          <w:bCs/>
-        </w:rPr>
-        <w:t xml:space="preserve">Sửa bài</w:t>
-      </w:r>
-      <w:r>
-        <w:t xml:space="preserve"> </w:t>
-      </w:r>
-      <w:r>
-        <w:t xml:space="preserve">(nếu có);</w:t>
-      </w:r>
-    </w:p>
-    <w:p>
-      <w:pPr>
-        <w:pStyle w:val="Compact"/>
-        <w:numPr>
-          <w:ilvl w:val="0"/>
-          <w:numId w:val="1005"/>
-        </w:numPr>
-      </w:pPr>
-      <w:r>
-        <w:t xml:space="preserve">từng phần trong một tab: trạng thái, loại đề, số từ tối thiểu, thời gian gợi ý, hạn nộp / hạn sửa, đề bài + hình,</w:t>
-      </w:r>
-      <w:r>
-        <w:t xml:space="preserve"> </w:t>
-      </w:r>
-      <w:r>
-        <w:rPr>
-          <w:b/>
-          <w:bCs/>
-        </w:rPr>
-        <w:t xml:space="preserve">tiêu chí chấm</w:t>
-      </w:r>
-      <w:r>
-        <w:t xml:space="preserve"> </w:t>
-      </w:r>
-      <w:r>
-        <w:t xml:space="preserve">(mở ra xem checklist, mục "Giới hạn điểm" ghi band tối đa); nút</w:t>
-      </w:r>
-      <w:r>
-        <w:t xml:space="preserve"> </w:t>
-      </w:r>
-      <w:r>
-        <w:rPr>
-          <w:b/>
-          <w:bCs/>
-        </w:rPr>
-        <w:t xml:space="preserve">Làm bài / Viết tiếp / Sửa bài</w:t>
-      </w:r>
-      <w:r>
-        <w:t xml:space="preserve">, hoặc</w:t>
-      </w:r>
-      <w:r>
-        <w:t xml:space="preserve"> </w:t>
-      </w:r>
-      <w:r>
-        <w:rPr>
-          <w:b/>
-          <w:bCs/>
-        </w:rPr>
-        <w:t xml:space="preserve">Xem bài đã nộp</w:t>
-      </w:r>
-      <w:r>
-        <w:t xml:space="preserve">;</w:t>
-      </w:r>
-    </w:p>
-    <w:p>
-      <w:pPr>
-        <w:pStyle w:val="Compact"/>
-        <w:numPr>
-          <w:ilvl w:val="0"/>
-          <w:numId w:val="1005"/>
-        </w:numPr>
-      </w:pPr>
-      <w:r>
-        <w:rPr>
-          <w:b/>
-          <w:bCs/>
-        </w:rPr>
-        <w:t xml:space="preserve">Lịch sử nộp</w:t>
-      </w:r>
-      <w:r>
-        <w:t xml:space="preserve"> </w:t>
-      </w:r>
-      <w:r>
-        <w:t xml:space="preserve">của từng phần: mỗi lần nộp, giờ nộp, số từ, nộp muộn, band nếu đã được trả bài (đang chấm thì ghi "Chờ kết quả");</w:t>
-      </w:r>
-    </w:p>
-    <w:p>
-      <w:pPr>
-        <w:pStyle w:val="Compact"/>
-        <w:numPr>
-          <w:ilvl w:val="0"/>
-          <w:numId w:val="1005"/>
-        </w:numPr>
-      </w:pPr>
-      <w:r>
-        <w:t xml:space="preserve">khung</w:t>
-      </w:r>
-      <w:r>
-        <w:t xml:space="preserve"> </w:t>
-      </w:r>
-      <w:r>
-        <w:rPr>
-          <w:b/>
-          <w:bCs/>
-        </w:rPr>
-        <w:t xml:space="preserve">Kết quả</w:t>
-      </w:r>
-      <w:r>
-        <w:t xml:space="preserve">: band từng phần và band cả bài (chỉ có khi mọi phần đã được trả; Task 2 tính gấp đôi Task 1);</w:t>
-      </w:r>
-    </w:p>
-    <w:p>
-      <w:pPr>
-        <w:pStyle w:val="Compact"/>
-        <w:numPr>
-          <w:ilvl w:val="0"/>
-          <w:numId w:val="1005"/>
-        </w:numPr>
-      </w:pPr>
-      <w:r>
-        <w:t xml:space="preserve">khung</w:t>
-      </w:r>
-      <w:r>
-        <w:t xml:space="preserve"> </w:t>
-      </w:r>
-      <w:r>
-        <w:rPr>
-          <w:b/>
-          <w:bCs/>
-        </w:rPr>
-        <w:t xml:space="preserve">Thời gian &amp; quy định</w:t>
-      </w:r>
-      <w:r>
-        <w:t xml:space="preserve">: hạn nộp, có cho nộp muộn không, số lần yêu cầu sửa tối đa.</w:t>
-      </w:r>
-    </w:p>
-    <w:bookmarkEnd w:id="27"/>
-    <w:bookmarkStart w:id="28" w:name="Xcdbbb1fe94ded6e0db335b0616309f1ec0255e9"/>
-    <w:p>
-      <w:pPr>
-        <w:pStyle w:val="Heading3"/>
-      </w:pPr>
-      <w:r>
-        <w:t xml:space="preserve">7.3. Làm bài và nộp bài</w:t>
-      </w:r>
-    </w:p>
-    <w:p>
-      <w:pPr>
-        <w:pStyle w:val="FirstParagraph"/>
-      </w:pPr>
-      <w:r>
-        <w:t xml:space="preserve">Bấm</w:t>
-      </w:r>
-      <w:r>
-        <w:t xml:space="preserve"> </w:t>
-      </w:r>
-      <w:r>
-        <w:rPr>
-          <w:b/>
-          <w:bCs/>
-        </w:rPr>
-        <w:t xml:space="preserve">Làm bài / Viết tiếp / Sửa bài</w:t>
-      </w:r>
-      <w:r>
-        <w:t xml:space="preserve"> </w:t>
-      </w:r>
-      <w:r>
-        <w:t xml:space="preserve">để mở màn làm bài toàn màn hình. Bài nhiều phần thì chọn phần ở hàng tab trên cùng (tab ghi trạng thái từng phần).</w:t>
-      </w:r>
-    </w:p>
-    <w:p>
-      <w:pPr>
-        <w:pStyle w:val="Compact"/>
-        <w:numPr>
-          <w:ilvl w:val="0"/>
-          <w:numId w:val="1006"/>
-        </w:numPr>
-      </w:pPr>
-      <w:r>
-        <w:rPr>
-          <w:b/>
-          <w:bCs/>
-        </w:rPr>
-        <w:t xml:space="preserve">Bên trái</w:t>
-      </w:r>
-      <w:r>
-        <w:t xml:space="preserve"> </w:t>
-      </w:r>
-      <w:r>
-        <w:t xml:space="preserve">là đề bài (trên điện thoại: bấm</w:t>
-      </w:r>
-      <w:r>
-        <w:t xml:space="preserve"> </w:t>
-      </w:r>
-      <w:r>
-        <w:rPr>
-          <w:b/>
-          <w:bCs/>
-        </w:rPr>
-        <w:t xml:space="preserve">Xem đề bài</w:t>
-      </w:r>
-      <w:r>
-        <w:t xml:space="preserve"> </w:t>
-      </w:r>
-      <w:r>
-        <w:t xml:space="preserve">để mở),</w:t>
-      </w:r>
-      <w:r>
-        <w:t xml:space="preserve"> </w:t>
-      </w:r>
-      <w:r>
-        <w:rPr>
-          <w:b/>
-          <w:bCs/>
-        </w:rPr>
-        <w:t xml:space="preserve">bên phải</w:t>
-      </w:r>
-      <w:r>
-        <w:t xml:space="preserve"> </w:t>
-      </w:r>
-      <w:r>
-        <w:t xml:space="preserve">là ô soạn. Số từ đếm ngay khi gõ (cùng cách đếm với máy chủ): màu cam khi chưa đủ tối thiểu, xanh khi đủ.</w:t>
-      </w:r>
-    </w:p>
-    <w:p>
-      <w:pPr>
-        <w:pStyle w:val="Compact"/>
-        <w:numPr>
-          <w:ilvl w:val="0"/>
-          <w:numId w:val="1006"/>
-        </w:numPr>
-      </w:pPr>
-      <w:r>
-        <w:rPr>
-          <w:b/>
-          <w:bCs/>
-        </w:rPr>
-        <w:t xml:space="preserve">Tự lưu nháp</w:t>
-      </w:r>
-      <w:r>
-        <w:t xml:space="preserve">: ngừng gõ 3 giây, chuyển sang tab khác hoặc đổi phần là bài được lưu; dòng trạng thái ghi "Chưa lưu" → "Đang lưu…" → "Đã lưu lúc hh:mm". Lưu lỗi thì bấm "Lỗi lưu – thử lại". Đóng trang khi còn thay đổi chưa lưu, trình duyệt sẽ hỏi lại.</w:t>
-      </w:r>
-    </w:p>
-    <w:p>
-      <w:pPr>
-        <w:pStyle w:val="Compact"/>
-        <w:numPr>
-          <w:ilvl w:val="0"/>
-          <w:numId w:val="1006"/>
-        </w:numPr>
-      </w:pPr>
-      <w:r>
-        <w:rPr>
-          <w:b/>
-          <w:bCs/>
-        </w:rPr>
-        <w:t xml:space="preserve">Mất mạng khi đang viết</w:t>
-      </w:r>
-      <w:r>
-        <w:t xml:space="preserve">: cứ viết tiếp, bài được giữ trên trình duyệt; dòng trạng thái ghi "Ngoại tuyến – đã lưu trên máy" và nút nộp tạm khoá ("Cần có mạng để nộp bài"). Có mạng lại, bài tự gửi lên máy chủ. Lỡ đóng trang khi chưa gửi được, mở lại màn làm bài trên</w:t>
-      </w:r>
-      <w:r>
-        <w:t xml:space="preserve"> </w:t>
-      </w:r>
-      <w:r>
-        <w:rPr>
-          <w:b/>
-          <w:bCs/>
-        </w:rPr>
-        <w:t xml:space="preserve">cùng trình duyệt</w:t>
-      </w:r>
-      <w:r>
-        <w:t xml:space="preserve"> </w:t>
-      </w:r>
-      <w:r>
-        <w:t xml:space="preserve">thì bài được khôi phục (nếu trong lúc đó bài đã được sửa ở nơi khác, hệ thống hỏi chọn bản).</w:t>
-      </w:r>
-    </w:p>
-    <w:p>
-      <w:pPr>
-        <w:pStyle w:val="Compact"/>
-        <w:numPr>
-          <w:ilvl w:val="0"/>
-          <w:numId w:val="1006"/>
-        </w:numPr>
-      </w:pPr>
-      <w:r>
-        <w:rPr>
-          <w:b/>
-          <w:bCs/>
-        </w:rPr>
-        <w:t xml:space="preserve">Mở cùng bài ở 2 tab / 2 máy</w:t>
-      </w:r>
-      <w:r>
-        <w:t xml:space="preserve">: khi một nơi lưu đè, nơi kia hiện hộp thoại cho xem cả hai bản (kèm số từ) để chọn</w:t>
-      </w:r>
-      <w:r>
-        <w:t xml:space="preserve"> </w:t>
-      </w:r>
-      <w:r>
-        <w:rPr>
-          <w:b/>
-          <w:bCs/>
-        </w:rPr>
-        <w:t xml:space="preserve">Dùng bản trên máy này</w:t>
-      </w:r>
-      <w:r>
-        <w:t xml:space="preserve"> </w:t>
-      </w:r>
-      <w:r>
-        <w:t xml:space="preserve">hoặc</w:t>
-      </w:r>
-      <w:r>
-        <w:t xml:space="preserve"> </w:t>
-      </w:r>
-      <w:r>
-        <w:rPr>
-          <w:b/>
-          <w:bCs/>
-        </w:rPr>
-        <w:t xml:space="preserve">Dùng bản trên máy chủ</w:t>
-      </w:r>
-      <w:r>
-        <w:t xml:space="preserve">.</w:t>
-      </w:r>
-    </w:p>
-    <w:p>
-      <w:pPr>
-        <w:pStyle w:val="Compact"/>
-        <w:numPr>
-          <w:ilvl w:val="0"/>
-          <w:numId w:val="1006"/>
-        </w:numPr>
-      </w:pPr>
-      <w:r>
-        <w:rPr>
-          <w:b/>
-          <w:bCs/>
-        </w:rPr>
-        <w:t xml:space="preserve">Nộp</w:t>
-      </w:r>
-      <w:r>
-        <w:t xml:space="preserve">: bấm</w:t>
-      </w:r>
-      <w:r>
-        <w:t xml:space="preserve"> </w:t>
-      </w:r>
-      <w:r>
-        <w:rPr>
-          <w:b/>
-          <w:bCs/>
-        </w:rPr>
-        <w:t xml:space="preserve">Nộp phần này</w:t>
-      </w:r>
-      <w:r>
-        <w:t xml:space="preserve"> </w:t>
-      </w:r>
-      <w:r>
-        <w:t xml:space="preserve">(đang "Cần sửa":</w:t>
-      </w:r>
-      <w:r>
-        <w:t xml:space="preserve"> </w:t>
-      </w:r>
-      <w:r>
-        <w:rPr>
-          <w:b/>
-          <w:bCs/>
-        </w:rPr>
-        <w:t xml:space="preserve">Nộp bản sửa</w:t>
-      </w:r>
-      <w:r>
-        <w:t xml:space="preserve">). Bài ít hơn số từ tối thiểu thì hệ thống hỏi lại ("Viết tiếp" / "Vẫn nộp"). Nộp xong ô soạn chuyển sang chỉ đọc kèm giờ nộp; nộp sau hạn (khi bài cho phép) được ghi là</w:t>
-      </w:r>
-      <w:r>
-        <w:t xml:space="preserve"> </w:t>
-      </w:r>
-      <w:r>
-        <w:rPr>
-          <w:b/>
-          <w:bCs/>
-        </w:rPr>
-        <w:t xml:space="preserve">nộp muộn</w:t>
-      </w:r>
-      <w:r>
-        <w:t xml:space="preserve">.</w:t>
-      </w:r>
-    </w:p>
-    <w:p>
-      <w:pPr>
-        <w:pStyle w:val="Compact"/>
-        <w:numPr>
-          <w:ilvl w:val="0"/>
-          <w:numId w:val="1006"/>
-        </w:numPr>
-      </w:pPr>
-      <w:r>
-        <w:rPr>
-          <w:b/>
-          <w:bCs/>
-        </w:rPr>
-        <w:t xml:space="preserve">Đồng hồ đếm ngược</w:t>
-      </w:r>
-      <w:r>
-        <w:t xml:space="preserve"> </w:t>
-      </w:r>
-      <w:r>
-        <w:t xml:space="preserve">theo giờ máy chủ (tự đồng bộ 5 phút một lần). Quá hạn mà bài không cho nộp muộn, hoặc bài đã đóng, thì ô soạn khoá lại và ghi lý do.</w:t>
-      </w:r>
-    </w:p>
-    <w:bookmarkEnd w:id="28"/>
-    <w:bookmarkStart w:id="29" w:name="X3b2aee35a6458aa45263b9eff75cd6a1e1138d6"/>
-    <w:p>
-      <w:pPr>
-        <w:pStyle w:val="Heading3"/>
-      </w:pPr>
-      <w:r>
-        <w:t xml:space="preserve">7.4. Đang làm</w:t>
-      </w:r>
-    </w:p>
-    <w:p>
-      <w:pPr>
-        <w:pStyle w:val="FirstParagraph"/>
-      </w:pPr>
-      <w:r>
-        <w:rPr>
-          <w:b/>
-          <w:bCs/>
-        </w:rPr>
-        <w:t xml:space="preserve">Xem kết quả chi tiết</w:t>
-      </w:r>
-      <w:r>
-        <w:t xml:space="preserve"> </w:t>
-      </w:r>
-      <w:r>
-        <w:t xml:space="preserve">(nhận xét trên bài, mã lỗi, so sánh các lần nộp),</w:t>
-      </w:r>
-      <w:r>
-        <w:t xml:space="preserve"> </w:t>
-      </w:r>
-      <w:r>
-        <w:rPr>
-          <w:b/>
-          <w:bCs/>
-        </w:rPr>
-        <w:t xml:space="preserve">kết quả học tập</w:t>
-      </w:r>
-      <w:r>
-        <w:t xml:space="preserve"> </w:t>
-      </w:r>
-      <w:r>
-        <w:t xml:space="preserve">và</w:t>
-      </w:r>
-      <w:r>
-        <w:t xml:space="preserve"> </w:t>
-      </w:r>
-      <w:r>
-        <w:rPr>
-          <w:b/>
-          <w:bCs/>
-        </w:rPr>
-        <w:t xml:space="preserve">trao đổi</w:t>
-      </w:r>
-      <w:r>
-        <w:t xml:space="preserve"> </w:t>
-      </w:r>
-      <w:r>
-        <w:t xml:space="preserve">sẽ có ở các bước tiếp theo.</w:t>
-      </w:r>
-    </w:p>
-    <w:p>
-      <w:r>
-        <w:pict>
-          <v:rect style="width:0;height:1.5pt" o:hralign="center" o:hrstd="t" o:hr="t"/>
-        </w:pict>
-      </w:r>
-    </w:p>
-    <w:bookmarkEnd w:id="29"/>
-    <w:bookmarkEnd w:id="30"/>
-    <w:bookmarkStart w:id="31" w:name="X27a74f3cf0506426a1a76b4e73d04f5d967bbd0"/>
-    <w:p>
-      <w:pPr>
-        <w:pStyle w:val="Heading2"/>
-      </w:pPr>
-      <w:r>
-        <w:t xml:space="preserve">8. Kịch bản demo gợi ý (~10 phút)</w:t>
-      </w:r>
-    </w:p>
-    <w:p>
-      <w:pPr>
-        <w:pStyle w:val="FirstParagraph"/>
-      </w:pPr>
-      <w:r>
-        <w:t xml:space="preserve">Mở hai trình duyệt (hoặc một cửa sổ ẩn danh): máy A đăng nhập</w:t>
-      </w:r>
-      <w:r>
-        <w:t xml:space="preserve"> </w:t>
-      </w:r>
-      <w:r>
-        <w:rPr>
-          <w:rStyle w:val="VerbatimChar"/>
-        </w:rPr>
-        <w:t xml:space="preserve">gv.demo</w:t>
-      </w:r>
-      <w:r>
-        <w:t xml:space="preserve">, máy B đăng nhập</w:t>
-      </w:r>
-      <w:r>
-        <w:t xml:space="preserve"> </w:t>
-      </w:r>
-      <w:r>
-        <w:rPr>
-          <w:rStyle w:val="VerbatimChar"/>
-        </w:rPr>
-        <w:t xml:space="preserve">DEMO001</w:t>
-      </w:r>
-      <w:r>
-        <w:t xml:space="preserve">.</w:t>
       </w:r>
     </w:p>
     <w:p>
@@ -4929,26 +4765,39 @@
         </w:numPr>
       </w:pPr>
       <w:r>
-        <w:rPr>
-          <w:b/>
-          <w:bCs/>
-        </w:rPr>
-        <w:t xml:space="preserve">Admin</w:t>
-      </w:r>
-      <w:r>
-        <w:t xml:space="preserve"> </w:t>
-      </w:r>
-      <w:r>
-        <w:t xml:space="preserve">(</w:t>
-      </w:r>
-      <w:r>
-        <w:rPr>
-          <w:rStyle w:val="VerbatimChar"/>
-        </w:rPr>
-        <w:t xml:space="preserve">admin</w:t>
-      </w:r>
-      <w:r>
-        <w:t xml:space="preserve">): Tổng quan → Giáo viên → thêm một giáo viên, xem mật khẩu tạm hiện một lần → Nhật ký thấy dòng "Tạo giáo viên".</w:t>
+        <w:t xml:space="preserve">khung đỏ</w:t>
+      </w:r>
+      <w:r>
+        <w:t xml:space="preserve"> </w:t>
+      </w:r>
+      <w:r>
+        <w:rPr>
+          <w:b/>
+          <w:bCs/>
+        </w:rPr>
+        <w:t xml:space="preserve">"Giáo viên yêu cầu sửa …"</w:t>
+      </w:r>
+      <w:r>
+        <w:t xml:space="preserve"> </w:t>
+      </w:r>
+      <w:r>
+        <w:t xml:space="preserve">kèm hạn sửa, lời nhắn và nút</w:t>
+      </w:r>
+      <w:r>
+        <w:t xml:space="preserve"> </w:t>
+      </w:r>
+      <w:r>
+        <w:rPr>
+          <w:b/>
+          <w:bCs/>
+        </w:rPr>
+        <w:t xml:space="preserve">Sửa bài</w:t>
+      </w:r>
+      <w:r>
+        <w:t xml:space="preserve"> </w:t>
+      </w:r>
+      <w:r>
+        <w:t xml:space="preserve">(nếu có);</w:t>
       </w:r>
     </w:p>
     <w:p>
@@ -4960,32 +4809,49 @@
         </w:numPr>
       </w:pPr>
       <w:r>
-        <w:rPr>
-          <w:b/>
-          <w:bCs/>
-        </w:rPr>
-        <w:t xml:space="preserve">Giáo viên</w:t>
-      </w:r>
-      <w:r>
-        <w:t xml:space="preserve"> </w:t>
-      </w:r>
-      <w:r>
-        <w:t xml:space="preserve">(máy A): Lớp học → mở</w:t>
-      </w:r>
-      <w:r>
-        <w:t xml:space="preserve"> </w:t>
-      </w:r>
-      <w:r>
-        <w:rPr>
-          <w:rStyle w:val="VerbatimChar"/>
-        </w:rPr>
-        <w:t xml:space="preserve">DEMO-A</w:t>
-      </w:r>
-      <w:r>
-        <w:t xml:space="preserve"> </w:t>
-      </w:r>
-      <w:r>
-        <w:t xml:space="preserve">→ Import file mẫu đã điền vài sinh viên → xem kết quả, tải file tài khoản.</w:t>
+        <w:t xml:space="preserve">từng phần trong một tab: trạng thái, loại đề, số từ tối thiểu, thời gian gợi ý, hạn nộp / hạn sửa, đề bài + hình,</w:t>
+      </w:r>
+      <w:r>
+        <w:t xml:space="preserve"> </w:t>
+      </w:r>
+      <w:r>
+        <w:rPr>
+          <w:b/>
+          <w:bCs/>
+        </w:rPr>
+        <w:t xml:space="preserve">tiêu chí chấm</w:t>
+      </w:r>
+      <w:r>
+        <w:t xml:space="preserve"> </w:t>
+      </w:r>
+      <w:r>
+        <w:t xml:space="preserve">(mở ra xem checklist, mục "Giới hạn điểm" ghi band tối đa); nút</w:t>
+      </w:r>
+      <w:r>
+        <w:t xml:space="preserve"> </w:t>
+      </w:r>
+      <w:r>
+        <w:rPr>
+          <w:b/>
+          <w:bCs/>
+        </w:rPr>
+        <w:t xml:space="preserve">Làm bài / Viết tiếp / Sửa bài</w:t>
+      </w:r>
+      <w:r>
+        <w:t xml:space="preserve">, hoặc</w:t>
+      </w:r>
+      <w:r>
+        <w:t xml:space="preserve"> </w:t>
+      </w:r>
+      <w:r>
+        <w:rPr>
+          <w:b/>
+          <w:bCs/>
+        </w:rPr>
+        <w:t xml:space="preserve">Xem bài đã nộp</w:t>
+      </w:r>
+      <w:r>
+        <w:t xml:space="preserve">;</w:t>
       </w:r>
     </w:p>
     <w:p>
@@ -4997,79 +4863,17 @@
         </w:numPr>
       </w:pPr>
       <w:r>
-        <w:t xml:space="preserve">Bài tập → mở</w:t>
-      </w:r>
-      <w:r>
-        <w:t xml:space="preserve"> </w:t>
-      </w:r>
-      <w:r>
-        <w:rPr>
-          <w:b/>
-          <w:bCs/>
-        </w:rPr>
-        <w:t xml:space="preserve">"Tuần 2"</w:t>
-      </w:r>
-      <w:r>
-        <w:t xml:space="preserve"> </w:t>
-      </w:r>
-      <w:r>
-        <w:t xml:space="preserve">(nháp) →</w:t>
-      </w:r>
-      <w:r>
-        <w:t xml:space="preserve"> </w:t>
-      </w:r>
-      <w:r>
-        <w:rPr>
-          <w:b/>
-          <w:bCs/>
-        </w:rPr>
-        <w:t xml:space="preserve">Giao bài &amp; phát hành</w:t>
-      </w:r>
-      <w:r>
-        <w:t xml:space="preserve"> </w:t>
-      </w:r>
-      <w:r>
-        <w:t xml:space="preserve">cho lớp</w:t>
-      </w:r>
-      <w:r>
-        <w:t xml:space="preserve"> </w:t>
-      </w:r>
-      <w:r>
-        <w:rPr>
-          <w:rStyle w:val="VerbatimChar"/>
-        </w:rPr>
-        <w:t xml:space="preserve">DEMO-A</w:t>
-      </w:r>
-      <w:r>
-        <w:t xml:space="preserve"> </w:t>
-      </w:r>
-      <w:r>
-        <w:t xml:space="preserve">→ máy B (</w:t>
-      </w:r>
-      <w:r>
-        <w:rPr>
-          <w:rStyle w:val="VerbatimChar"/>
-        </w:rPr>
-        <w:t xml:space="preserve">DEMO001</w:t>
-      </w:r>
-      <w:r>
-        <w:t xml:space="preserve">) thấy</w:t>
-      </w:r>
-      <w:r>
-        <w:t xml:space="preserve"> </w:t>
-      </w:r>
-      <w:r>
-        <w:rPr>
-          <w:b/>
-          <w:bCs/>
-        </w:rPr>
-        <w:t xml:space="preserve">thông báo bật lên ngay</w:t>
-      </w:r>
-      <w:r>
-        <w:t xml:space="preserve"> </w:t>
-      </w:r>
-      <w:r>
-        <w:t xml:space="preserve">và số trên chuông tăng.</w:t>
+        <w:rPr>
+          <w:b/>
+          <w:bCs/>
+        </w:rPr>
+        <w:t xml:space="preserve">Lịch sử nộp</w:t>
+      </w:r>
+      <w:r>
+        <w:t xml:space="preserve"> </w:t>
+      </w:r>
+      <w:r>
+        <w:t xml:space="preserve">của từng phần: mỗi lần nộp, giờ nộp, số từ, nộp muộn, band nếu đã được trả bài (đang chấm thì ghi "Chờ kết quả");</w:t>
       </w:r>
     </w:p>
     <w:p>
@@ -5081,7 +4885,20 @@
         </w:numPr>
       </w:pPr>
       <w:r>
-        <w:t xml:space="preserve">Tắt mạng máy B vài giây (hoặc khởi động lại backend) → thanh vàng "Mất kết nối… đang thử lại" → bật lại → tự kết nối.</w:t>
+        <w:t xml:space="preserve">khung</w:t>
+      </w:r>
+      <w:r>
+        <w:t xml:space="preserve"> </w:t>
+      </w:r>
+      <w:r>
+        <w:rPr>
+          <w:b/>
+          <w:bCs/>
+        </w:rPr>
+        <w:t xml:space="preserve">Kết quả</w:t>
+      </w:r>
+      <w:r>
+        <w:t xml:space="preserve">: band từng phần và band cả bài (chỉ có khi mọi phần đã được trả; Task 2 tính gấp đôi Task 1);</w:t>
       </w:r>
     </w:p>
     <w:p>
@@ -5093,22 +4910,30 @@
         </w:numPr>
       </w:pPr>
       <w:r>
-        <w:t xml:space="preserve">Đăng nhập</w:t>
-      </w:r>
-      <w:r>
-        <w:t xml:space="preserve"> </w:t>
-      </w:r>
-      <w:r>
-        <w:rPr>
-          <w:rStyle w:val="VerbatimChar"/>
-        </w:rPr>
-        <w:t xml:space="preserve">DEMO001</w:t>
-      </w:r>
-      <w:r>
-        <w:t xml:space="preserve"> </w:t>
-      </w:r>
-      <w:r>
-        <w:t xml:space="preserve">ở trình duyệt thứ ba → máy B hiện "Tài khoản vừa đăng nhập ở nơi khác".</w:t>
+        <w:t xml:space="preserve">khung</w:t>
+      </w:r>
+      <w:r>
+        <w:t xml:space="preserve"> </w:t>
+      </w:r>
+      <w:r>
+        <w:rPr>
+          <w:b/>
+          <w:bCs/>
+        </w:rPr>
+        <w:t xml:space="preserve">Thời gian &amp; quy định</w:t>
+      </w:r>
+      <w:r>
+        <w:t xml:space="preserve">: hạn nộp, có cho nộp muộn không, số lần yêu cầu sửa tối đa.</w:t>
+      </w:r>
+    </w:p>
+    <w:bookmarkEnd w:id="28"/>
+    <w:bookmarkStart w:id="29" w:name="Xcdbbb1fe94ded6e0db335b0616309f1ec0255e9"/>
+    <w:p>
+      <w:pPr>
+        <w:pStyle w:val="Heading3"/>
+      </w:pPr>
+      <w:r>
+        <w:t xml:space="preserve">7.3. Làm bài và nộp bài</w:t>
       </w:r>
     </w:p>
     <w:p>
@@ -5116,43 +4941,322 @@
         <w:pStyle w:val="FirstParagraph"/>
       </w:pPr>
       <w:r>
-        <w:t xml:space="preserve">Muốn làm lại từ đầu: xoá dữ liệu (Docker:</w:t>
-      </w:r>
-      <w:r>
-        <w:t xml:space="preserve"> </w:t>
-      </w:r>
-      <w:r>
-        <w:rPr>
-          <w:rStyle w:val="VerbatimChar"/>
-        </w:rPr>
-        <w:t xml:space="preserve">docker compose down -v</w:t>
-      </w:r>
-      <w:r>
-        <w:t xml:space="preserve">; trên máy: xoá và tạo lại DB</w:t>
-      </w:r>
-      <w:r>
-        <w:t xml:space="preserve"> </w:t>
-      </w:r>
-      <w:r>
-        <w:rPr>
-          <w:rStyle w:val="VerbatimChar"/>
-        </w:rPr>
-        <w:t xml:space="preserve">ielts</w:t>
-      </w:r>
-      <w:r>
-        <w:t xml:space="preserve">) rồi khởi động lại với profile</w:t>
-      </w:r>
-      <w:r>
-        <w:t xml:space="preserve"> </w:t>
-      </w:r>
-      <w:r>
-        <w:rPr>
-          <w:rStyle w:val="VerbatimChar"/>
-        </w:rPr>
-        <w:t xml:space="preserve">demo</w:t>
+        <w:t xml:space="preserve">Bấm</w:t>
+      </w:r>
+      <w:r>
+        <w:t xml:space="preserve"> </w:t>
+      </w:r>
+      <w:r>
+        <w:rPr>
+          <w:b/>
+          <w:bCs/>
+        </w:rPr>
+        <w:t xml:space="preserve">Làm bài / Viết tiếp / Sửa bài</w:t>
+      </w:r>
+      <w:r>
+        <w:t xml:space="preserve"> </w:t>
+      </w:r>
+      <w:r>
+        <w:t xml:space="preserve">để mở màn làm bài toàn màn hình. Bài nhiều phần thì chọn phần ở hàng tab trên cùng (tab ghi trạng thái từng phần).</w:t>
+      </w:r>
+    </w:p>
+    <w:p>
+      <w:pPr>
+        <w:pStyle w:val="Compact"/>
+        <w:numPr>
+          <w:ilvl w:val="0"/>
+          <w:numId w:val="1008"/>
+        </w:numPr>
+      </w:pPr>
+      <w:r>
+        <w:rPr>
+          <w:b/>
+          <w:bCs/>
+        </w:rPr>
+        <w:t xml:space="preserve">Bên trái</w:t>
+      </w:r>
+      <w:r>
+        <w:t xml:space="preserve"> </w:t>
+      </w:r>
+      <w:r>
+        <w:t xml:space="preserve">là đề bài (trên điện thoại: bấm</w:t>
+      </w:r>
+      <w:r>
+        <w:t xml:space="preserve"> </w:t>
+      </w:r>
+      <w:r>
+        <w:rPr>
+          <w:b/>
+          <w:bCs/>
+        </w:rPr>
+        <w:t xml:space="preserve">Xem đề bài</w:t>
+      </w:r>
+      <w:r>
+        <w:t xml:space="preserve"> </w:t>
+      </w:r>
+      <w:r>
+        <w:t xml:space="preserve">để mở),</w:t>
+      </w:r>
+      <w:r>
+        <w:t xml:space="preserve"> </w:t>
+      </w:r>
+      <w:r>
+        <w:rPr>
+          <w:b/>
+          <w:bCs/>
+        </w:rPr>
+        <w:t xml:space="preserve">bên phải</w:t>
+      </w:r>
+      <w:r>
+        <w:t xml:space="preserve"> </w:t>
+      </w:r>
+      <w:r>
+        <w:t xml:space="preserve">là ô soạn. Số từ đếm ngay khi gõ (cùng cách đếm với máy chủ): màu cam khi chưa đủ tối thiểu, xanh khi đủ.</w:t>
+      </w:r>
+    </w:p>
+    <w:p>
+      <w:pPr>
+        <w:pStyle w:val="Compact"/>
+        <w:numPr>
+          <w:ilvl w:val="0"/>
+          <w:numId w:val="1008"/>
+        </w:numPr>
+      </w:pPr>
+      <w:r>
+        <w:rPr>
+          <w:b/>
+          <w:bCs/>
+        </w:rPr>
+        <w:t xml:space="preserve">Tự lưu nháp</w:t>
+      </w:r>
+      <w:r>
+        <w:t xml:space="preserve">: ngừng gõ 3 giây, chuyển sang tab khác hoặc đổi phần là bài được lưu; dòng trạng thái ghi "Chưa lưu" → "Đang lưu…" → "Đã lưu lúc hh:mm". Lưu lỗi thì bấm "Lỗi lưu – thử lại". Đóng trang khi còn thay đổi chưa lưu, trình duyệt sẽ hỏi lại.</w:t>
+      </w:r>
+    </w:p>
+    <w:p>
+      <w:pPr>
+        <w:pStyle w:val="Compact"/>
+        <w:numPr>
+          <w:ilvl w:val="0"/>
+          <w:numId w:val="1008"/>
+        </w:numPr>
+      </w:pPr>
+      <w:r>
+        <w:rPr>
+          <w:b/>
+          <w:bCs/>
+        </w:rPr>
+        <w:t xml:space="preserve">Mất mạng khi đang viết</w:t>
+      </w:r>
+      <w:r>
+        <w:t xml:space="preserve">: cứ viết tiếp, bài được giữ trên trình duyệt; dòng trạng thái ghi "Ngoại tuyến – đã lưu trên máy" và nút nộp tạm khoá ("Cần có mạng để nộp bài"). Có mạng lại, bài tự gửi lên máy chủ. Lỡ đóng trang khi chưa gửi được, mở lại màn làm bài trên</w:t>
+      </w:r>
+      <w:r>
+        <w:t xml:space="preserve"> </w:t>
+      </w:r>
+      <w:r>
+        <w:rPr>
+          <w:b/>
+          <w:bCs/>
+        </w:rPr>
+        <w:t xml:space="preserve">cùng trình duyệt</w:t>
+      </w:r>
+      <w:r>
+        <w:t xml:space="preserve"> </w:t>
+      </w:r>
+      <w:r>
+        <w:t xml:space="preserve">thì bài được khôi phục (nếu trong lúc đó bài đã được sửa ở nơi khác, hệ thống hỏi chọn bản).</w:t>
+      </w:r>
+    </w:p>
+    <w:p>
+      <w:pPr>
+        <w:pStyle w:val="Compact"/>
+        <w:numPr>
+          <w:ilvl w:val="0"/>
+          <w:numId w:val="1008"/>
+        </w:numPr>
+      </w:pPr>
+      <w:r>
+        <w:rPr>
+          <w:b/>
+          <w:bCs/>
+        </w:rPr>
+        <w:t xml:space="preserve">Mở cùng bài ở 2 tab / 2 máy</w:t>
+      </w:r>
+      <w:r>
+        <w:t xml:space="preserve">: khi một nơi lưu đè, nơi kia hiện hộp thoại cho xem cả hai bản (kèm số từ) để chọn</w:t>
+      </w:r>
+      <w:r>
+        <w:t xml:space="preserve"> </w:t>
+      </w:r>
+      <w:r>
+        <w:rPr>
+          <w:b/>
+          <w:bCs/>
+        </w:rPr>
+        <w:t xml:space="preserve">Dùng bản trên máy này</w:t>
+      </w:r>
+      <w:r>
+        <w:t xml:space="preserve"> </w:t>
+      </w:r>
+      <w:r>
+        <w:t xml:space="preserve">hoặc</w:t>
+      </w:r>
+      <w:r>
+        <w:t xml:space="preserve"> </w:t>
+      </w:r>
+      <w:r>
+        <w:rPr>
+          <w:b/>
+          <w:bCs/>
+        </w:rPr>
+        <w:t xml:space="preserve">Dùng bản trên máy chủ</w:t>
       </w:r>
       <w:r>
         <w:t xml:space="preserve">.</w:t>
+      </w:r>
+    </w:p>
+    <w:p>
+      <w:pPr>
+        <w:pStyle w:val="Compact"/>
+        <w:numPr>
+          <w:ilvl w:val="0"/>
+          <w:numId w:val="1008"/>
+        </w:numPr>
+      </w:pPr>
+      <w:r>
+        <w:rPr>
+          <w:b/>
+          <w:bCs/>
+        </w:rPr>
+        <w:t xml:space="preserve">Nộp</w:t>
+      </w:r>
+      <w:r>
+        <w:t xml:space="preserve">: bấm</w:t>
+      </w:r>
+      <w:r>
+        <w:t xml:space="preserve"> </w:t>
+      </w:r>
+      <w:r>
+        <w:rPr>
+          <w:b/>
+          <w:bCs/>
+        </w:rPr>
+        <w:t xml:space="preserve">Nộp phần này</w:t>
+      </w:r>
+      <w:r>
+        <w:t xml:space="preserve"> </w:t>
+      </w:r>
+      <w:r>
+        <w:t xml:space="preserve">(đang "Cần sửa":</w:t>
+      </w:r>
+      <w:r>
+        <w:t xml:space="preserve"> </w:t>
+      </w:r>
+      <w:r>
+        <w:rPr>
+          <w:b/>
+          <w:bCs/>
+        </w:rPr>
+        <w:t xml:space="preserve">Nộp bản sửa</w:t>
+      </w:r>
+      <w:r>
+        <w:t xml:space="preserve">). Bài ít hơn số từ tối thiểu thì hệ thống hỏi lại ("Viết tiếp" / "Vẫn nộp"). Nộp xong ô soạn chuyển sang chỉ đọc kèm giờ nộp; nộp sau hạn (khi bài cho phép) được ghi là</w:t>
+      </w:r>
+      <w:r>
+        <w:t xml:space="preserve"> </w:t>
+      </w:r>
+      <w:r>
+        <w:rPr>
+          <w:b/>
+          <w:bCs/>
+        </w:rPr>
+        <w:t xml:space="preserve">nộp muộn</w:t>
+      </w:r>
+      <w:r>
+        <w:t xml:space="preserve">.</w:t>
+      </w:r>
+    </w:p>
+    <w:p>
+      <w:pPr>
+        <w:pStyle w:val="Compact"/>
+        <w:numPr>
+          <w:ilvl w:val="0"/>
+          <w:numId w:val="1008"/>
+        </w:numPr>
+      </w:pPr>
+      <w:r>
+        <w:rPr>
+          <w:b/>
+          <w:bCs/>
+        </w:rPr>
+        <w:t xml:space="preserve">Đồng hồ đếm ngược</w:t>
+      </w:r>
+      <w:r>
+        <w:t xml:space="preserve"> </w:t>
+      </w:r>
+      <w:r>
+        <w:t xml:space="preserve">theo giờ máy chủ (tự đồng bộ 5 phút một lần). Quá hạn mà bài không cho nộp muộn, hoặc bài đã đóng, thì ô soạn khoá lại và ghi lý do.</w:t>
+      </w:r>
+    </w:p>
+    <w:bookmarkEnd w:id="29"/>
+    <w:bookmarkStart w:id="30" w:name="X3b2aee35a6458aa45263b9eff75cd6a1e1138d6"/>
+    <w:p>
+      <w:pPr>
+        <w:pStyle w:val="Heading3"/>
+      </w:pPr>
+      <w:r>
+        <w:t xml:space="preserve">7.4. Đang làm</w:t>
+      </w:r>
+    </w:p>
+    <w:p>
+      <w:pPr>
+        <w:pStyle w:val="FirstParagraph"/>
+      </w:pPr>
+      <w:r>
+        <w:rPr>
+          <w:b/>
+          <w:bCs/>
+        </w:rPr>
+        <w:t xml:space="preserve">Xem kết quả chi tiết</w:t>
+      </w:r>
+      <w:r>
+        <w:t xml:space="preserve"> </w:t>
+      </w:r>
+      <w:r>
+        <w:t xml:space="preserve">(nhận xét trên bài, mã lỗi, so sánh các lần nộp),</w:t>
+      </w:r>
+      <w:r>
+        <w:t xml:space="preserve"> </w:t>
+      </w:r>
+      <w:r>
+        <w:rPr>
+          <w:b/>
+          <w:bCs/>
+        </w:rPr>
+        <w:t xml:space="preserve">kết quả học tập</w:t>
+      </w:r>
+      <w:r>
+        <w:t xml:space="preserve"> </w:t>
+      </w:r>
+      <w:r>
+        <w:t xml:space="preserve">và</w:t>
+      </w:r>
+      <w:r>
+        <w:t xml:space="preserve"> </w:t>
+      </w:r>
+      <w:r>
+        <w:rPr>
+          <w:b/>
+          <w:bCs/>
+        </w:rPr>
+        <w:t xml:space="preserve">trao đổi</w:t>
+      </w:r>
+      <w:r>
+        <w:t xml:space="preserve"> </w:t>
+      </w:r>
+      <w:r>
+        <w:t xml:space="preserve">sẽ có ở các bước tiếp theo.</w:t>
       </w:r>
     </w:p>
     <w:p>
@@ -5162,8 +5266,293 @@
         </w:pict>
       </w:r>
     </w:p>
+    <w:bookmarkEnd w:id="30"/>
     <w:bookmarkEnd w:id="31"/>
-    <w:bookmarkStart w:id="32" w:name="X2aaa61dde1ecd98f080cbe2f0cfb81c5163d5ab"/>
+    <w:bookmarkStart w:id="32" w:name="X27a74f3cf0506426a1a76b4e73d04f5d967bbd0"/>
+    <w:p>
+      <w:pPr>
+        <w:pStyle w:val="Heading2"/>
+      </w:pPr>
+      <w:r>
+        <w:t xml:space="preserve">8. Kịch bản demo gợi ý (~10 phút)</w:t>
+      </w:r>
+    </w:p>
+    <w:p>
+      <w:pPr>
+        <w:pStyle w:val="FirstParagraph"/>
+      </w:pPr>
+      <w:r>
+        <w:t xml:space="preserve">Mở hai trình duyệt (hoặc một cửa sổ ẩn danh): máy A đăng nhập</w:t>
+      </w:r>
+      <w:r>
+        <w:t xml:space="preserve"> </w:t>
+      </w:r>
+      <w:r>
+        <w:rPr>
+          <w:rStyle w:val="VerbatimChar"/>
+        </w:rPr>
+        <w:t xml:space="preserve">gv.demo</w:t>
+      </w:r>
+      <w:r>
+        <w:t xml:space="preserve">, máy B đăng nhập</w:t>
+      </w:r>
+      <w:r>
+        <w:t xml:space="preserve"> </w:t>
+      </w:r>
+      <w:r>
+        <w:rPr>
+          <w:rStyle w:val="VerbatimChar"/>
+        </w:rPr>
+        <w:t xml:space="preserve">DEMO001</w:t>
+      </w:r>
+      <w:r>
+        <w:t xml:space="preserve">.</w:t>
+      </w:r>
+    </w:p>
+    <w:p>
+      <w:pPr>
+        <w:pStyle w:val="Compact"/>
+        <w:numPr>
+          <w:ilvl w:val="0"/>
+          <w:numId w:val="1009"/>
+        </w:numPr>
+      </w:pPr>
+      <w:r>
+        <w:rPr>
+          <w:b/>
+          <w:bCs/>
+        </w:rPr>
+        <w:t xml:space="preserve">Admin</w:t>
+      </w:r>
+      <w:r>
+        <w:t xml:space="preserve"> </w:t>
+      </w:r>
+      <w:r>
+        <w:t xml:space="preserve">(</w:t>
+      </w:r>
+      <w:r>
+        <w:rPr>
+          <w:rStyle w:val="VerbatimChar"/>
+        </w:rPr>
+        <w:t xml:space="preserve">admin</w:t>
+      </w:r>
+      <w:r>
+        <w:t xml:space="preserve">): Tổng quan → Giáo viên → thêm một giáo viên, xem mật khẩu tạm hiện một lần → Nhật ký thấy dòng "Tạo giáo viên".</w:t>
+      </w:r>
+    </w:p>
+    <w:p>
+      <w:pPr>
+        <w:pStyle w:val="Compact"/>
+        <w:numPr>
+          <w:ilvl w:val="0"/>
+          <w:numId w:val="1009"/>
+        </w:numPr>
+      </w:pPr>
+      <w:r>
+        <w:rPr>
+          <w:b/>
+          <w:bCs/>
+        </w:rPr>
+        <w:t xml:space="preserve">Giáo viên</w:t>
+      </w:r>
+      <w:r>
+        <w:t xml:space="preserve"> </w:t>
+      </w:r>
+      <w:r>
+        <w:t xml:space="preserve">(máy A): Lớp học → mở</w:t>
+      </w:r>
+      <w:r>
+        <w:t xml:space="preserve"> </w:t>
+      </w:r>
+      <w:r>
+        <w:rPr>
+          <w:rStyle w:val="VerbatimChar"/>
+        </w:rPr>
+        <w:t xml:space="preserve">DEMO-A</w:t>
+      </w:r>
+      <w:r>
+        <w:t xml:space="preserve"> </w:t>
+      </w:r>
+      <w:r>
+        <w:t xml:space="preserve">→ Import file mẫu đã điền vài sinh viên → xem kết quả, tải file tài khoản.</w:t>
+      </w:r>
+    </w:p>
+    <w:p>
+      <w:pPr>
+        <w:pStyle w:val="Compact"/>
+        <w:numPr>
+          <w:ilvl w:val="0"/>
+          <w:numId w:val="1009"/>
+        </w:numPr>
+      </w:pPr>
+      <w:r>
+        <w:t xml:space="preserve">Bài tập → mở</w:t>
+      </w:r>
+      <w:r>
+        <w:t xml:space="preserve"> </w:t>
+      </w:r>
+      <w:r>
+        <w:rPr>
+          <w:b/>
+          <w:bCs/>
+        </w:rPr>
+        <w:t xml:space="preserve">"Tuần 2"</w:t>
+      </w:r>
+      <w:r>
+        <w:t xml:space="preserve"> </w:t>
+      </w:r>
+      <w:r>
+        <w:t xml:space="preserve">(nháp) →</w:t>
+      </w:r>
+      <w:r>
+        <w:t xml:space="preserve"> </w:t>
+      </w:r>
+      <w:r>
+        <w:rPr>
+          <w:b/>
+          <w:bCs/>
+        </w:rPr>
+        <w:t xml:space="preserve">Giao bài &amp; phát hành</w:t>
+      </w:r>
+      <w:r>
+        <w:t xml:space="preserve"> </w:t>
+      </w:r>
+      <w:r>
+        <w:t xml:space="preserve">cho lớp</w:t>
+      </w:r>
+      <w:r>
+        <w:t xml:space="preserve"> </w:t>
+      </w:r>
+      <w:r>
+        <w:rPr>
+          <w:rStyle w:val="VerbatimChar"/>
+        </w:rPr>
+        <w:t xml:space="preserve">DEMO-A</w:t>
+      </w:r>
+      <w:r>
+        <w:t xml:space="preserve"> </w:t>
+      </w:r>
+      <w:r>
+        <w:t xml:space="preserve">→ máy B (</w:t>
+      </w:r>
+      <w:r>
+        <w:rPr>
+          <w:rStyle w:val="VerbatimChar"/>
+        </w:rPr>
+        <w:t xml:space="preserve">DEMO001</w:t>
+      </w:r>
+      <w:r>
+        <w:t xml:space="preserve">) thấy</w:t>
+      </w:r>
+      <w:r>
+        <w:t xml:space="preserve"> </w:t>
+      </w:r>
+      <w:r>
+        <w:rPr>
+          <w:b/>
+          <w:bCs/>
+        </w:rPr>
+        <w:t xml:space="preserve">thông báo bật lên ngay</w:t>
+      </w:r>
+      <w:r>
+        <w:t xml:space="preserve"> </w:t>
+      </w:r>
+      <w:r>
+        <w:t xml:space="preserve">và số trên chuông tăng.</w:t>
+      </w:r>
+    </w:p>
+    <w:p>
+      <w:pPr>
+        <w:pStyle w:val="Compact"/>
+        <w:numPr>
+          <w:ilvl w:val="0"/>
+          <w:numId w:val="1009"/>
+        </w:numPr>
+      </w:pPr>
+      <w:r>
+        <w:t xml:space="preserve">Tắt mạng máy B vài giây (hoặc khởi động lại backend) → thanh vàng "Mất kết nối… đang thử lại" → bật lại → tự kết nối.</w:t>
+      </w:r>
+    </w:p>
+    <w:p>
+      <w:pPr>
+        <w:pStyle w:val="Compact"/>
+        <w:numPr>
+          <w:ilvl w:val="0"/>
+          <w:numId w:val="1009"/>
+        </w:numPr>
+      </w:pPr>
+      <w:r>
+        <w:t xml:space="preserve">Đăng nhập</w:t>
+      </w:r>
+      <w:r>
+        <w:t xml:space="preserve"> </w:t>
+      </w:r>
+      <w:r>
+        <w:rPr>
+          <w:rStyle w:val="VerbatimChar"/>
+        </w:rPr>
+        <w:t xml:space="preserve">DEMO001</w:t>
+      </w:r>
+      <w:r>
+        <w:t xml:space="preserve"> </w:t>
+      </w:r>
+      <w:r>
+        <w:t xml:space="preserve">ở trình duyệt thứ ba → máy B hiện "Tài khoản vừa đăng nhập ở nơi khác".</w:t>
+      </w:r>
+    </w:p>
+    <w:p>
+      <w:pPr>
+        <w:pStyle w:val="FirstParagraph"/>
+      </w:pPr>
+      <w:r>
+        <w:t xml:space="preserve">Muốn làm lại từ đầu: xoá dữ liệu (Docker:</w:t>
+      </w:r>
+      <w:r>
+        <w:t xml:space="preserve"> </w:t>
+      </w:r>
+      <w:r>
+        <w:rPr>
+          <w:rStyle w:val="VerbatimChar"/>
+        </w:rPr>
+        <w:t xml:space="preserve">docker compose down -v</w:t>
+      </w:r>
+      <w:r>
+        <w:t xml:space="preserve">; trên máy: xoá và tạo lại DB</w:t>
+      </w:r>
+      <w:r>
+        <w:t xml:space="preserve"> </w:t>
+      </w:r>
+      <w:r>
+        <w:rPr>
+          <w:rStyle w:val="VerbatimChar"/>
+        </w:rPr>
+        <w:t xml:space="preserve">ielts</w:t>
+      </w:r>
+      <w:r>
+        <w:t xml:space="preserve">) rồi khởi động lại với profile</w:t>
+      </w:r>
+      <w:r>
+        <w:t xml:space="preserve"> </w:t>
+      </w:r>
+      <w:r>
+        <w:rPr>
+          <w:rStyle w:val="VerbatimChar"/>
+        </w:rPr>
+        <w:t xml:space="preserve">demo</w:t>
+      </w:r>
+      <w:r>
+        <w:t xml:space="preserve">.</w:t>
+      </w:r>
+    </w:p>
+    <w:p>
+      <w:r>
+        <w:pict>
+          <v:rect style="width:0;height:1.5pt" o:hralign="center" o:hrstd="t" o:hr="t"/>
+        </w:pict>
+      </w:r>
+    </w:p>
+    <w:bookmarkEnd w:id="32"/>
+    <w:bookmarkStart w:id="33" w:name="X2aaa61dde1ecd98f080cbe2f0cfb81c5163d5ab"/>
     <w:p>
       <w:pPr>
         <w:pStyle w:val="Heading2"/>
@@ -5514,8 +5903,8 @@
         </w:tc>
       </w:tr>
     </w:tbl>
-    <w:bookmarkEnd w:id="32"/>
     <w:bookmarkEnd w:id="33"/>
+    <w:bookmarkEnd w:id="34"/>
     <w:sectPr>
       <w:footnotePr>
         <w:numRestart w:val="eachSect"/>
@@ -5857,12 +6246,45 @@
     <w:abstractNumId w:val="991"/>
   </w:num>
   <w:num w:numId="1005">
-    <w:abstractNumId w:val="991"/>
+    <w:abstractNumId w:val="99411"/>
+    <w:lvlOverride w:ilvl="0">
+      <w:startOverride w:val="1"/>
+    </w:lvlOverride>
+    <w:lvlOverride w:ilvl="1">
+      <w:startOverride w:val="1"/>
+    </w:lvlOverride>
+    <w:lvlOverride w:ilvl="2">
+      <w:startOverride w:val="1"/>
+    </w:lvlOverride>
+    <w:lvlOverride w:ilvl="3">
+      <w:startOverride w:val="1"/>
+    </w:lvlOverride>
+    <w:lvlOverride w:ilvl="4">
+      <w:startOverride w:val="1"/>
+    </w:lvlOverride>
+    <w:lvlOverride w:ilvl="5">
+      <w:startOverride w:val="1"/>
+    </w:lvlOverride>
+    <w:lvlOverride w:ilvl="6">
+      <w:startOverride w:val="1"/>
+    </w:lvlOverride>
+    <w:lvlOverride w:ilvl="7">
+      <w:startOverride w:val="1"/>
+    </w:lvlOverride>
+    <w:lvlOverride w:ilvl="8">
+      <w:startOverride w:val="1"/>
+    </w:lvlOverride>
   </w:num>
   <w:num w:numId="1006">
     <w:abstractNumId w:val="991"/>
   </w:num>
   <w:num w:numId="1007">
+    <w:abstractNumId w:val="991"/>
+  </w:num>
+  <w:num w:numId="1008">
+    <w:abstractNumId w:val="991"/>
+  </w:num>
+  <w:num w:numId="1009">
     <w:abstractNumId w:val="99411"/>
     <w:lvlOverride w:ilvl="0">
       <w:startOverride w:val="1"/>

</xml_diff>

<commit_message>
Module thông báo và nhắc hạn: job nhắc hạn tự động theo hai mốc 24 giờ và 2 giờ, thông báo khi phát hành bài
</commit_message>
<xml_diff>
--- a/docx/10-huong-dan-su-dung.docx
+++ b/docx/10-huong-dan-su-dung.docx
@@ -28,7 +28,7 @@
         </w:p>
       </w:sdtContent>
     </w:sdt>
-    <w:bookmarkStart w:id="32" w:name="X62b689528c743ccb8c3229542497059f4aa59b0"/>
+    <w:bookmarkStart w:id="33" w:name="X62b689528c743ccb8c3229542497059f4aa59b0"/>
     <w:p>
       <w:pPr>
         <w:pStyle w:val="Heading1"/>
@@ -258,7 +258,7 @@
               <w:pStyle w:val="Compact"/>
             </w:pPr>
             <w:r>
-              <w:t xml:space="preserve">Sinh viên: bài được giao, chi tiết bài, lịch sử nộp</w:t>
+              <w:t xml:space="preserve">Sinh viên: bài được giao, chi tiết bài, lịch sử nộp, làm bài, nộp bài</w:t>
             </w:r>
           </w:p>
         </w:tc>
@@ -279,6 +279,9 @@
             <w:pPr>
               <w:pStyle w:val="Compact"/>
             </w:pPr>
+            <w:r>
+              <w:t xml:space="preserve">Nháp khi mất mạng chưa có (bước tiếp theo)</w:t>
+            </w:r>
           </w:p>
         </w:tc>
       </w:tr>
@@ -290,7 +293,7 @@
               <w:pStyle w:val="Compact"/>
             </w:pPr>
             <w:r>
-              <w:t xml:space="preserve">Sinh viên: làm bài, nộp bài, xem kết quả chi tiết, trao đổi</w:t>
+              <w:t xml:space="preserve">Sinh viên: xem kết quả chi tiết, kết quả học tập, trao đổi</w:t>
             </w:r>
           </w:p>
         </w:tc>
@@ -311,9 +314,6 @@
             <w:pPr>
               <w:pStyle w:val="Compact"/>
             </w:pPr>
-            <w:r>
-              <w:t xml:space="preserve">Nút "Làm bài" mở màn làm bài (đang là khung trống)</w:t>
-            </w:r>
           </w:p>
         </w:tc>
       </w:tr>
@@ -4083,7 +4083,7 @@
     </w:p>
     <w:bookmarkEnd w:id="24"/>
     <w:bookmarkEnd w:id="25"/>
-    <w:bookmarkStart w:id="29" w:name="Xa4980557fe2b16e9ea1555bbc3e255ac8d44acd"/>
+    <w:bookmarkStart w:id="30" w:name="Xa4980557fe2b16e9ea1555bbc3e255ac8d44acd"/>
     <w:p>
       <w:pPr>
         <w:pStyle w:val="Heading2"/>
@@ -4541,13 +4541,13 @@
       </w:r>
     </w:p>
     <w:bookmarkEnd w:id="27"/>
-    <w:bookmarkStart w:id="28" w:name="X07fe456aeba9d24e1b08a5a30f0c57becaf912c"/>
+    <w:bookmarkStart w:id="28" w:name="Xcdbbb1fe94ded6e0db335b0616309f1ec0255e9"/>
     <w:p>
       <w:pPr>
         <w:pStyle w:val="Heading3"/>
       </w:pPr>
       <w:r>
-        <w:t xml:space="preserve">7.3. Đang làm</w:t>
+        <w:t xml:space="preserve">7.3. Làm bài và nộp bài</w:t>
       </w:r>
     </w:p>
     <w:p>
@@ -4555,7 +4555,7 @@
         <w:pStyle w:val="FirstParagraph"/>
       </w:pPr>
       <w:r>
-        <w:t xml:space="preserve">Màn</w:t>
+        <w:t xml:space="preserve">Bấm</w:t>
       </w:r>
       <w:r>
         <w:t xml:space="preserve"> </w:t>
@@ -4565,111 +4565,13 @@
           <w:b/>
           <w:bCs/>
         </w:rPr>
-        <w:t xml:space="preserve">làm bài</w:t>
-      </w:r>
-      <w:r>
-        <w:t xml:space="preserve"> </w:t>
-      </w:r>
-      <w:r>
-        <w:t xml:space="preserve">(đếm từ, tự lưu nháp, giữ bài khi mất mạng, nộp từng phần),</w:t>
-      </w:r>
-      <w:r>
-        <w:t xml:space="preserve"> </w:t>
-      </w:r>
-      <w:r>
-        <w:rPr>
-          <w:b/>
-          <w:bCs/>
-        </w:rPr>
-        <w:t xml:space="preserve">xem kết quả chi tiết</w:t>
-      </w:r>
-      <w:r>
-        <w:t xml:space="preserve"> </w:t>
-      </w:r>
-      <w:r>
-        <w:t xml:space="preserve">(nhận xét trên bài, mã lỗi, so sánh các lần nộp),</w:t>
-      </w:r>
-      <w:r>
-        <w:t xml:space="preserve"> </w:t>
-      </w:r>
-      <w:r>
-        <w:rPr>
-          <w:b/>
-          <w:bCs/>
-        </w:rPr>
-        <w:t xml:space="preserve">kết quả học tập</w:t>
-      </w:r>
-      <w:r>
-        <w:t xml:space="preserve"> </w:t>
-      </w:r>
-      <w:r>
-        <w:t xml:space="preserve">và</w:t>
-      </w:r>
-      <w:r>
-        <w:t xml:space="preserve"> </w:t>
-      </w:r>
-      <w:r>
-        <w:rPr>
-          <w:b/>
-          <w:bCs/>
-        </w:rPr>
-        <w:t xml:space="preserve">trao đổi</w:t>
-      </w:r>
-      <w:r>
-        <w:t xml:space="preserve"> </w:t>
-      </w:r>
-      <w:r>
-        <w:t xml:space="preserve">sẽ có ở các bước tiếp theo.</w:t>
-      </w:r>
-    </w:p>
-    <w:p>
-      <w:r>
-        <w:pict>
-          <v:rect style="width:0;height:1.5pt" o:hralign="center" o:hrstd="t" o:hr="t"/>
-        </w:pict>
-      </w:r>
-    </w:p>
-    <w:bookmarkEnd w:id="28"/>
-    <w:bookmarkEnd w:id="29"/>
-    <w:bookmarkStart w:id="30" w:name="X27a74f3cf0506426a1a76b4e73d04f5d967bbd0"/>
-    <w:p>
-      <w:pPr>
-        <w:pStyle w:val="Heading2"/>
-      </w:pPr>
-      <w:r>
-        <w:t xml:space="preserve">8. Kịch bản demo gợi ý (~10 phút)</w:t>
-      </w:r>
-    </w:p>
-    <w:p>
-      <w:pPr>
-        <w:pStyle w:val="FirstParagraph"/>
-      </w:pPr>
-      <w:r>
-        <w:t xml:space="preserve">Mở hai trình duyệt (hoặc một cửa sổ ẩn danh): máy A đăng nhập</w:t>
-      </w:r>
-      <w:r>
-        <w:t xml:space="preserve"> </w:t>
-      </w:r>
-      <w:r>
-        <w:rPr>
-          <w:rStyle w:val="VerbatimChar"/>
-        </w:rPr>
-        <w:t xml:space="preserve">gv.demo</w:t>
-      </w:r>
-      <w:r>
-        <w:t xml:space="preserve">, máy B đăng nhập</w:t>
-      </w:r>
-      <w:r>
-        <w:t xml:space="preserve"> </w:t>
-      </w:r>
-      <w:r>
-        <w:rPr>
-          <w:rStyle w:val="VerbatimChar"/>
-        </w:rPr>
-        <w:t xml:space="preserve">DEMO001</w:t>
-      </w:r>
-      <w:r>
-        <w:t xml:space="preserve">.</w:t>
+        <w:t xml:space="preserve">Làm bài / Viết tiếp / Sửa bài</w:t>
+      </w:r>
+      <w:r>
+        <w:t xml:space="preserve"> </w:t>
+      </w:r>
+      <w:r>
+        <w:t xml:space="preserve">để mở màn làm bài toàn màn hình. Bài nhiều phần thì chọn phần ở hàng tab trên cùng (tab ghi trạng thái từng phần).</w:t>
       </w:r>
     </w:p>
     <w:p>
@@ -4685,22 +4587,45 @@
           <w:b/>
           <w:bCs/>
         </w:rPr>
-        <w:t xml:space="preserve">Admin</w:t>
-      </w:r>
-      <w:r>
-        <w:t xml:space="preserve"> </w:t>
-      </w:r>
-      <w:r>
-        <w:t xml:space="preserve">(</w:t>
-      </w:r>
-      <w:r>
-        <w:rPr>
-          <w:rStyle w:val="VerbatimChar"/>
-        </w:rPr>
-        <w:t xml:space="preserve">admin</w:t>
-      </w:r>
-      <w:r>
-        <w:t xml:space="preserve">): Tổng quan → Giáo viên → thêm một giáo viên, xem mật khẩu tạm hiện một lần → Nhật ký thấy dòng "Tạo giáo viên".</w:t>
+        <w:t xml:space="preserve">Bên trái</w:t>
+      </w:r>
+      <w:r>
+        <w:t xml:space="preserve"> </w:t>
+      </w:r>
+      <w:r>
+        <w:t xml:space="preserve">là đề bài (trên điện thoại: bấm</w:t>
+      </w:r>
+      <w:r>
+        <w:t xml:space="preserve"> </w:t>
+      </w:r>
+      <w:r>
+        <w:rPr>
+          <w:b/>
+          <w:bCs/>
+        </w:rPr>
+        <w:t xml:space="preserve">Xem đề bài</w:t>
+      </w:r>
+      <w:r>
+        <w:t xml:space="preserve"> </w:t>
+      </w:r>
+      <w:r>
+        <w:t xml:space="preserve">để mở),</w:t>
+      </w:r>
+      <w:r>
+        <w:t xml:space="preserve"> </w:t>
+      </w:r>
+      <w:r>
+        <w:rPr>
+          <w:b/>
+          <w:bCs/>
+        </w:rPr>
+        <w:t xml:space="preserve">bên phải</w:t>
+      </w:r>
+      <w:r>
+        <w:t xml:space="preserve"> </w:t>
+      </w:r>
+      <w:r>
+        <w:t xml:space="preserve">là ô soạn. Số từ đếm ngay khi gõ (cùng cách đếm với máy chủ): màu cam khi chưa đủ tối thiểu, xanh khi đủ.</w:t>
       </w:r>
     </w:p>
     <w:p>
@@ -4716,28 +4641,10 @@
           <w:b/>
           <w:bCs/>
         </w:rPr>
-        <w:t xml:space="preserve">Giáo viên</w:t>
-      </w:r>
-      <w:r>
-        <w:t xml:space="preserve"> </w:t>
-      </w:r>
-      <w:r>
-        <w:t xml:space="preserve">(máy A): Lớp học → mở</w:t>
-      </w:r>
-      <w:r>
-        <w:t xml:space="preserve"> </w:t>
-      </w:r>
-      <w:r>
-        <w:rPr>
-          <w:rStyle w:val="VerbatimChar"/>
-        </w:rPr>
-        <w:t xml:space="preserve">DEMO-A</w:t>
-      </w:r>
-      <w:r>
-        <w:t xml:space="preserve"> </w:t>
-      </w:r>
-      <w:r>
-        <w:t xml:space="preserve">→ Import file mẫu đã điền vài sinh viên → xem kết quả, tải file tài khoản.</w:t>
+        <w:t xml:space="preserve">Tự lưu nháp</w:t>
+      </w:r>
+      <w:r>
+        <w:t xml:space="preserve">: ngừng gõ 3 giây, chuyển sang tab khác hoặc đổi phần là bài được lưu; dòng trạng thái ghi "Chưa lưu" → "Đang lưu…" → "Đã lưu lúc hh:mm". Lưu lỗi thì bấm "Lỗi lưu – thử lại". Đóng trang khi còn thay đổi chưa lưu, trình duyệt sẽ hỏi lại.</w:t>
       </w:r>
     </w:p>
     <w:p>
@@ -4749,23 +4656,14 @@
         </w:numPr>
       </w:pPr>
       <w:r>
-        <w:t xml:space="preserve">Bài tập → mở</w:t>
-      </w:r>
-      <w:r>
-        <w:t xml:space="preserve"> </w:t>
-      </w:r>
-      <w:r>
         <w:rPr>
           <w:b/>
           <w:bCs/>
         </w:rPr>
-        <w:t xml:space="preserve">"Tuần 2"</w:t>
-      </w:r>
-      <w:r>
-        <w:t xml:space="preserve"> </w:t>
-      </w:r>
-      <w:r>
-        <w:t xml:space="preserve">(nháp) →</w:t>
+        <w:t xml:space="preserve">Mở cùng bài ở 2 tab / 2 máy</w:t>
+      </w:r>
+      <w:r>
+        <w:t xml:space="preserve">: khi một nơi lưu đè, nơi kia hiện hộp thoại cho xem cả hai bản (kèm số từ) để chọn</w:t>
       </w:r>
       <w:r>
         <w:t xml:space="preserve"> </w:t>
@@ -4775,37 +4673,13 @@
           <w:b/>
           <w:bCs/>
         </w:rPr>
-        <w:t xml:space="preserve">Giao bài &amp; phát hành</w:t>
-      </w:r>
-      <w:r>
-        <w:t xml:space="preserve"> </w:t>
-      </w:r>
-      <w:r>
-        <w:t xml:space="preserve">cho lớp</w:t>
-      </w:r>
-      <w:r>
-        <w:t xml:space="preserve"> </w:t>
-      </w:r>
-      <w:r>
-        <w:rPr>
-          <w:rStyle w:val="VerbatimChar"/>
-        </w:rPr>
-        <w:t xml:space="preserve">DEMO-A</w:t>
-      </w:r>
-      <w:r>
-        <w:t xml:space="preserve"> </w:t>
-      </w:r>
-      <w:r>
-        <w:t xml:space="preserve">→ máy B (</w:t>
-      </w:r>
-      <w:r>
-        <w:rPr>
-          <w:rStyle w:val="VerbatimChar"/>
-        </w:rPr>
-        <w:t xml:space="preserve">DEMO001</w:t>
-      </w:r>
-      <w:r>
-        <w:t xml:space="preserve">) thấy</w:t>
+        <w:t xml:space="preserve">Dùng bản trên máy này</w:t>
+      </w:r>
+      <w:r>
+        <w:t xml:space="preserve"> </w:t>
+      </w:r>
+      <w:r>
+        <w:t xml:space="preserve">hoặc</w:t>
       </w:r>
       <w:r>
         <w:t xml:space="preserve"> </w:t>
@@ -4815,13 +4689,10 @@
           <w:b/>
           <w:bCs/>
         </w:rPr>
-        <w:t xml:space="preserve">thông báo bật lên ngay</w:t>
-      </w:r>
-      <w:r>
-        <w:t xml:space="preserve"> </w:t>
-      </w:r>
-      <w:r>
-        <w:t xml:space="preserve">và số trên chuông tăng.</w:t>
+        <w:t xml:space="preserve">Dùng bản trên máy chủ</w:t>
+      </w:r>
+      <w:r>
+        <w:t xml:space="preserve">.</w:t>
       </w:r>
     </w:p>
     <w:p>
@@ -4833,7 +4704,56 @@
         </w:numPr>
       </w:pPr>
       <w:r>
-        <w:t xml:space="preserve">Tắt mạng máy B vài giây (hoặc khởi động lại backend) → thanh vàng "Mất kết nối… đang thử lại" → bật lại → tự kết nối.</w:t>
+        <w:rPr>
+          <w:b/>
+          <w:bCs/>
+        </w:rPr>
+        <w:t xml:space="preserve">Nộp</w:t>
+      </w:r>
+      <w:r>
+        <w:t xml:space="preserve">: bấm</w:t>
+      </w:r>
+      <w:r>
+        <w:t xml:space="preserve"> </w:t>
+      </w:r>
+      <w:r>
+        <w:rPr>
+          <w:b/>
+          <w:bCs/>
+        </w:rPr>
+        <w:t xml:space="preserve">Nộp phần này</w:t>
+      </w:r>
+      <w:r>
+        <w:t xml:space="preserve"> </w:t>
+      </w:r>
+      <w:r>
+        <w:t xml:space="preserve">(đang "Cần sửa":</w:t>
+      </w:r>
+      <w:r>
+        <w:t xml:space="preserve"> </w:t>
+      </w:r>
+      <w:r>
+        <w:rPr>
+          <w:b/>
+          <w:bCs/>
+        </w:rPr>
+        <w:t xml:space="preserve">Nộp bản sửa</w:t>
+      </w:r>
+      <w:r>
+        <w:t xml:space="preserve">). Bài ít hơn số từ tối thiểu thì hệ thống hỏi lại ("Viết tiếp" / "Vẫn nộp"). Nộp xong ô soạn chuyển sang chỉ đọc kèm giờ nộp; nộp sau hạn (khi bài cho phép) được ghi là</w:t>
+      </w:r>
+      <w:r>
+        <w:t xml:space="preserve"> </w:t>
+      </w:r>
+      <w:r>
+        <w:rPr>
+          <w:b/>
+          <w:bCs/>
+        </w:rPr>
+        <w:t xml:space="preserve">nộp muộn</w:t>
+      </w:r>
+      <w:r>
+        <w:t xml:space="preserve">.</w:t>
       </w:r>
     </w:p>
     <w:p>
@@ -4845,22 +4765,27 @@
         </w:numPr>
       </w:pPr>
       <w:r>
-        <w:t xml:space="preserve">Đăng nhập</w:t>
-      </w:r>
-      <w:r>
-        <w:t xml:space="preserve"> </w:t>
-      </w:r>
-      <w:r>
-        <w:rPr>
-          <w:rStyle w:val="VerbatimChar"/>
-        </w:rPr>
-        <w:t xml:space="preserve">DEMO001</w:t>
-      </w:r>
-      <w:r>
-        <w:t xml:space="preserve"> </w:t>
-      </w:r>
-      <w:r>
-        <w:t xml:space="preserve">ở trình duyệt thứ ba → máy B hiện "Tài khoản vừa đăng nhập ở nơi khác".</w:t>
+        <w:rPr>
+          <w:b/>
+          <w:bCs/>
+        </w:rPr>
+        <w:t xml:space="preserve">Đồng hồ đếm ngược</w:t>
+      </w:r>
+      <w:r>
+        <w:t xml:space="preserve"> </w:t>
+      </w:r>
+      <w:r>
+        <w:t xml:space="preserve">theo giờ máy chủ (tự đồng bộ 5 phút một lần). Quá hạn mà bài không cho nộp muộn, hoặc bài đã đóng, thì ô soạn khoá lại và ghi lý do.</w:t>
+      </w:r>
+    </w:p>
+    <w:bookmarkEnd w:id="28"/>
+    <w:bookmarkStart w:id="29" w:name="X3b2aee35a6458aa45263b9eff75cd6a1e1138d6"/>
+    <w:p>
+      <w:pPr>
+        <w:pStyle w:val="Heading3"/>
+      </w:pPr>
+      <w:r>
+        <w:t xml:space="preserve">7.4. Đang làm</w:t>
       </w:r>
     </w:p>
     <w:p>
@@ -4868,43 +4793,62 @@
         <w:pStyle w:val="FirstParagraph"/>
       </w:pPr>
       <w:r>
-        <w:t xml:space="preserve">Muốn làm lại từ đầu: xoá dữ liệu (Docker:</w:t>
-      </w:r>
-      <w:r>
-        <w:t xml:space="preserve"> </w:t>
-      </w:r>
-      <w:r>
-        <w:rPr>
-          <w:rStyle w:val="VerbatimChar"/>
-        </w:rPr>
-        <w:t xml:space="preserve">docker compose down -v</w:t>
-      </w:r>
-      <w:r>
-        <w:t xml:space="preserve">; trên máy: xoá và tạo lại DB</w:t>
-      </w:r>
-      <w:r>
-        <w:t xml:space="preserve"> </w:t>
-      </w:r>
-      <w:r>
-        <w:rPr>
-          <w:rStyle w:val="VerbatimChar"/>
-        </w:rPr>
-        <w:t xml:space="preserve">ielts</w:t>
-      </w:r>
-      <w:r>
-        <w:t xml:space="preserve">) rồi khởi động lại với profile</w:t>
-      </w:r>
-      <w:r>
-        <w:t xml:space="preserve"> </w:t>
-      </w:r>
-      <w:r>
-        <w:rPr>
-          <w:rStyle w:val="VerbatimChar"/>
-        </w:rPr>
-        <w:t xml:space="preserve">demo</w:t>
-      </w:r>
-      <w:r>
-        <w:t xml:space="preserve">.</w:t>
+        <w:rPr>
+          <w:b/>
+          <w:bCs/>
+        </w:rPr>
+        <w:t xml:space="preserve">Giữ nháp khi mất mạng</w:t>
+      </w:r>
+      <w:r>
+        <w:t xml:space="preserve">,</w:t>
+      </w:r>
+      <w:r>
+        <w:t xml:space="preserve"> </w:t>
+      </w:r>
+      <w:r>
+        <w:rPr>
+          <w:b/>
+          <w:bCs/>
+        </w:rPr>
+        <w:t xml:space="preserve">xem kết quả chi tiết</w:t>
+      </w:r>
+      <w:r>
+        <w:t xml:space="preserve"> </w:t>
+      </w:r>
+      <w:r>
+        <w:t xml:space="preserve">(nhận xét trên bài, mã lỗi, so sánh các lần nộp),</w:t>
+      </w:r>
+      <w:r>
+        <w:t xml:space="preserve"> </w:t>
+      </w:r>
+      <w:r>
+        <w:rPr>
+          <w:b/>
+          <w:bCs/>
+        </w:rPr>
+        <w:t xml:space="preserve">kết quả học tập</w:t>
+      </w:r>
+      <w:r>
+        <w:t xml:space="preserve"> </w:t>
+      </w:r>
+      <w:r>
+        <w:t xml:space="preserve">và</w:t>
+      </w:r>
+      <w:r>
+        <w:t xml:space="preserve"> </w:t>
+      </w:r>
+      <w:r>
+        <w:rPr>
+          <w:b/>
+          <w:bCs/>
+        </w:rPr>
+        <w:t xml:space="preserve">trao đổi</w:t>
+      </w:r>
+      <w:r>
+        <w:t xml:space="preserve"> </w:t>
+      </w:r>
+      <w:r>
+        <w:t xml:space="preserve">sẽ có ở các bước tiếp theo.</w:t>
       </w:r>
     </w:p>
     <w:p>
@@ -4914,8 +4858,293 @@
         </w:pict>
       </w:r>
     </w:p>
+    <w:bookmarkEnd w:id="29"/>
     <w:bookmarkEnd w:id="30"/>
-    <w:bookmarkStart w:id="31" w:name="X2aaa61dde1ecd98f080cbe2f0cfb81c5163d5ab"/>
+    <w:bookmarkStart w:id="31" w:name="X27a74f3cf0506426a1a76b4e73d04f5d967bbd0"/>
+    <w:p>
+      <w:pPr>
+        <w:pStyle w:val="Heading2"/>
+      </w:pPr>
+      <w:r>
+        <w:t xml:space="preserve">8. Kịch bản demo gợi ý (~10 phút)</w:t>
+      </w:r>
+    </w:p>
+    <w:p>
+      <w:pPr>
+        <w:pStyle w:val="FirstParagraph"/>
+      </w:pPr>
+      <w:r>
+        <w:t xml:space="preserve">Mở hai trình duyệt (hoặc một cửa sổ ẩn danh): máy A đăng nhập</w:t>
+      </w:r>
+      <w:r>
+        <w:t xml:space="preserve"> </w:t>
+      </w:r>
+      <w:r>
+        <w:rPr>
+          <w:rStyle w:val="VerbatimChar"/>
+        </w:rPr>
+        <w:t xml:space="preserve">gv.demo</w:t>
+      </w:r>
+      <w:r>
+        <w:t xml:space="preserve">, máy B đăng nhập</w:t>
+      </w:r>
+      <w:r>
+        <w:t xml:space="preserve"> </w:t>
+      </w:r>
+      <w:r>
+        <w:rPr>
+          <w:rStyle w:val="VerbatimChar"/>
+        </w:rPr>
+        <w:t xml:space="preserve">DEMO001</w:t>
+      </w:r>
+      <w:r>
+        <w:t xml:space="preserve">.</w:t>
+      </w:r>
+    </w:p>
+    <w:p>
+      <w:pPr>
+        <w:pStyle w:val="Compact"/>
+        <w:numPr>
+          <w:ilvl w:val="0"/>
+          <w:numId w:val="1007"/>
+        </w:numPr>
+      </w:pPr>
+      <w:r>
+        <w:rPr>
+          <w:b/>
+          <w:bCs/>
+        </w:rPr>
+        <w:t xml:space="preserve">Admin</w:t>
+      </w:r>
+      <w:r>
+        <w:t xml:space="preserve"> </w:t>
+      </w:r>
+      <w:r>
+        <w:t xml:space="preserve">(</w:t>
+      </w:r>
+      <w:r>
+        <w:rPr>
+          <w:rStyle w:val="VerbatimChar"/>
+        </w:rPr>
+        <w:t xml:space="preserve">admin</w:t>
+      </w:r>
+      <w:r>
+        <w:t xml:space="preserve">): Tổng quan → Giáo viên → thêm một giáo viên, xem mật khẩu tạm hiện một lần → Nhật ký thấy dòng "Tạo giáo viên".</w:t>
+      </w:r>
+    </w:p>
+    <w:p>
+      <w:pPr>
+        <w:pStyle w:val="Compact"/>
+        <w:numPr>
+          <w:ilvl w:val="0"/>
+          <w:numId w:val="1007"/>
+        </w:numPr>
+      </w:pPr>
+      <w:r>
+        <w:rPr>
+          <w:b/>
+          <w:bCs/>
+        </w:rPr>
+        <w:t xml:space="preserve">Giáo viên</w:t>
+      </w:r>
+      <w:r>
+        <w:t xml:space="preserve"> </w:t>
+      </w:r>
+      <w:r>
+        <w:t xml:space="preserve">(máy A): Lớp học → mở</w:t>
+      </w:r>
+      <w:r>
+        <w:t xml:space="preserve"> </w:t>
+      </w:r>
+      <w:r>
+        <w:rPr>
+          <w:rStyle w:val="VerbatimChar"/>
+        </w:rPr>
+        <w:t xml:space="preserve">DEMO-A</w:t>
+      </w:r>
+      <w:r>
+        <w:t xml:space="preserve"> </w:t>
+      </w:r>
+      <w:r>
+        <w:t xml:space="preserve">→ Import file mẫu đã điền vài sinh viên → xem kết quả, tải file tài khoản.</w:t>
+      </w:r>
+    </w:p>
+    <w:p>
+      <w:pPr>
+        <w:pStyle w:val="Compact"/>
+        <w:numPr>
+          <w:ilvl w:val="0"/>
+          <w:numId w:val="1007"/>
+        </w:numPr>
+      </w:pPr>
+      <w:r>
+        <w:t xml:space="preserve">Bài tập → mở</w:t>
+      </w:r>
+      <w:r>
+        <w:t xml:space="preserve"> </w:t>
+      </w:r>
+      <w:r>
+        <w:rPr>
+          <w:b/>
+          <w:bCs/>
+        </w:rPr>
+        <w:t xml:space="preserve">"Tuần 2"</w:t>
+      </w:r>
+      <w:r>
+        <w:t xml:space="preserve"> </w:t>
+      </w:r>
+      <w:r>
+        <w:t xml:space="preserve">(nháp) →</w:t>
+      </w:r>
+      <w:r>
+        <w:t xml:space="preserve"> </w:t>
+      </w:r>
+      <w:r>
+        <w:rPr>
+          <w:b/>
+          <w:bCs/>
+        </w:rPr>
+        <w:t xml:space="preserve">Giao bài &amp; phát hành</w:t>
+      </w:r>
+      <w:r>
+        <w:t xml:space="preserve"> </w:t>
+      </w:r>
+      <w:r>
+        <w:t xml:space="preserve">cho lớp</w:t>
+      </w:r>
+      <w:r>
+        <w:t xml:space="preserve"> </w:t>
+      </w:r>
+      <w:r>
+        <w:rPr>
+          <w:rStyle w:val="VerbatimChar"/>
+        </w:rPr>
+        <w:t xml:space="preserve">DEMO-A</w:t>
+      </w:r>
+      <w:r>
+        <w:t xml:space="preserve"> </w:t>
+      </w:r>
+      <w:r>
+        <w:t xml:space="preserve">→ máy B (</w:t>
+      </w:r>
+      <w:r>
+        <w:rPr>
+          <w:rStyle w:val="VerbatimChar"/>
+        </w:rPr>
+        <w:t xml:space="preserve">DEMO001</w:t>
+      </w:r>
+      <w:r>
+        <w:t xml:space="preserve">) thấy</w:t>
+      </w:r>
+      <w:r>
+        <w:t xml:space="preserve"> </w:t>
+      </w:r>
+      <w:r>
+        <w:rPr>
+          <w:b/>
+          <w:bCs/>
+        </w:rPr>
+        <w:t xml:space="preserve">thông báo bật lên ngay</w:t>
+      </w:r>
+      <w:r>
+        <w:t xml:space="preserve"> </w:t>
+      </w:r>
+      <w:r>
+        <w:t xml:space="preserve">và số trên chuông tăng.</w:t>
+      </w:r>
+    </w:p>
+    <w:p>
+      <w:pPr>
+        <w:pStyle w:val="Compact"/>
+        <w:numPr>
+          <w:ilvl w:val="0"/>
+          <w:numId w:val="1007"/>
+        </w:numPr>
+      </w:pPr>
+      <w:r>
+        <w:t xml:space="preserve">Tắt mạng máy B vài giây (hoặc khởi động lại backend) → thanh vàng "Mất kết nối… đang thử lại" → bật lại → tự kết nối.</w:t>
+      </w:r>
+    </w:p>
+    <w:p>
+      <w:pPr>
+        <w:pStyle w:val="Compact"/>
+        <w:numPr>
+          <w:ilvl w:val="0"/>
+          <w:numId w:val="1007"/>
+        </w:numPr>
+      </w:pPr>
+      <w:r>
+        <w:t xml:space="preserve">Đăng nhập</w:t>
+      </w:r>
+      <w:r>
+        <w:t xml:space="preserve"> </w:t>
+      </w:r>
+      <w:r>
+        <w:rPr>
+          <w:rStyle w:val="VerbatimChar"/>
+        </w:rPr>
+        <w:t xml:space="preserve">DEMO001</w:t>
+      </w:r>
+      <w:r>
+        <w:t xml:space="preserve"> </w:t>
+      </w:r>
+      <w:r>
+        <w:t xml:space="preserve">ở trình duyệt thứ ba → máy B hiện "Tài khoản vừa đăng nhập ở nơi khác".</w:t>
+      </w:r>
+    </w:p>
+    <w:p>
+      <w:pPr>
+        <w:pStyle w:val="FirstParagraph"/>
+      </w:pPr>
+      <w:r>
+        <w:t xml:space="preserve">Muốn làm lại từ đầu: xoá dữ liệu (Docker:</w:t>
+      </w:r>
+      <w:r>
+        <w:t xml:space="preserve"> </w:t>
+      </w:r>
+      <w:r>
+        <w:rPr>
+          <w:rStyle w:val="VerbatimChar"/>
+        </w:rPr>
+        <w:t xml:space="preserve">docker compose down -v</w:t>
+      </w:r>
+      <w:r>
+        <w:t xml:space="preserve">; trên máy: xoá và tạo lại DB</w:t>
+      </w:r>
+      <w:r>
+        <w:t xml:space="preserve"> </w:t>
+      </w:r>
+      <w:r>
+        <w:rPr>
+          <w:rStyle w:val="VerbatimChar"/>
+        </w:rPr>
+        <w:t xml:space="preserve">ielts</w:t>
+      </w:r>
+      <w:r>
+        <w:t xml:space="preserve">) rồi khởi động lại với profile</w:t>
+      </w:r>
+      <w:r>
+        <w:t xml:space="preserve"> </w:t>
+      </w:r>
+      <w:r>
+        <w:rPr>
+          <w:rStyle w:val="VerbatimChar"/>
+        </w:rPr>
+        <w:t xml:space="preserve">demo</w:t>
+      </w:r>
+      <w:r>
+        <w:t xml:space="preserve">.</w:t>
+      </w:r>
+    </w:p>
+    <w:p>
+      <w:r>
+        <w:pict>
+          <v:rect style="width:0;height:1.5pt" o:hralign="center" o:hrstd="t" o:hr="t"/>
+        </w:pict>
+      </w:r>
+    </w:p>
+    <w:bookmarkEnd w:id="31"/>
+    <w:bookmarkStart w:id="32" w:name="X2aaa61dde1ecd98f080cbe2f0cfb81c5163d5ab"/>
     <w:p>
       <w:pPr>
         <w:pStyle w:val="Heading2"/>
@@ -5266,8 +5495,8 @@
         </w:tc>
       </w:tr>
     </w:tbl>
-    <w:bookmarkEnd w:id="31"/>
     <w:bookmarkEnd w:id="32"/>
+    <w:bookmarkEnd w:id="33"/>
     <w:sectPr>
       <w:footnotePr>
         <w:numRestart w:val="eachSect"/>
@@ -5612,6 +5841,9 @@
     <w:abstractNumId w:val="991"/>
   </w:num>
   <w:num w:numId="1006">
+    <w:abstractNumId w:val="991"/>
+  </w:num>
+  <w:num w:numId="1007">
     <w:abstractNumId w:val="99411"/>
     <w:lvlOverride w:ilvl="0">
       <w:startOverride w:val="1"/>

</xml_diff>

<commit_message>
Module viết bài và nộp bài: nháp offline bằng IndexedDB, tự đồng bộ khi có mạng lại
</commit_message>
<xml_diff>
--- a/docx/10-huong-dan-su-dung.docx
+++ b/docx/10-huong-dan-su-dung.docx
@@ -258,7 +258,7 @@
               <w:pStyle w:val="Compact"/>
             </w:pPr>
             <w:r>
-              <w:t xml:space="preserve">Sinh viên: bài được giao, chi tiết bài, lịch sử nộp, làm bài, nộp bài</w:t>
+              <w:t xml:space="preserve">Sinh viên: bài được giao, chi tiết bài, lịch sử nộp, làm bài (cả khi mất mạng), nộp bài</w:t>
             </w:r>
           </w:p>
         </w:tc>
@@ -279,9 +279,6 @@
             <w:pPr>
               <w:pStyle w:val="Compact"/>
             </w:pPr>
-            <w:r>
-              <w:t xml:space="preserve">Nháp khi mất mạng chưa có (bước tiếp theo)</w:t>
-            </w:r>
           </w:p>
         </w:tc>
       </w:tr>
@@ -4660,10 +4657,10 @@
           <w:b/>
           <w:bCs/>
         </w:rPr>
-        <w:t xml:space="preserve">Mở cùng bài ở 2 tab / 2 máy</w:t>
-      </w:r>
-      <w:r>
-        <w:t xml:space="preserve">: khi một nơi lưu đè, nơi kia hiện hộp thoại cho xem cả hai bản (kèm số từ) để chọn</w:t>
+        <w:t xml:space="preserve">Mất mạng khi đang viết</w:t>
+      </w:r>
+      <w:r>
+        <w:t xml:space="preserve">: cứ viết tiếp, bài được giữ trên trình duyệt; dòng trạng thái ghi "Ngoại tuyến – đã lưu trên máy" và nút nộp tạm khoá ("Cần có mạng để nộp bài"). Có mạng lại, bài tự gửi lên máy chủ. Lỡ đóng trang khi chưa gửi được, mở lại màn làm bài trên</w:t>
       </w:r>
       <w:r>
         <w:t xml:space="preserve"> </w:t>
@@ -4673,26 +4670,13 @@
           <w:b/>
           <w:bCs/>
         </w:rPr>
-        <w:t xml:space="preserve">Dùng bản trên máy này</w:t>
-      </w:r>
-      <w:r>
-        <w:t xml:space="preserve"> </w:t>
-      </w:r>
-      <w:r>
-        <w:t xml:space="preserve">hoặc</w:t>
-      </w:r>
-      <w:r>
-        <w:t xml:space="preserve"> </w:t>
-      </w:r>
-      <w:r>
-        <w:rPr>
-          <w:b/>
-          <w:bCs/>
-        </w:rPr>
-        <w:t xml:space="preserve">Dùng bản trên máy chủ</w:t>
-      </w:r>
-      <w:r>
-        <w:t xml:space="preserve">.</w:t>
+        <w:t xml:space="preserve">cùng trình duyệt</w:t>
+      </w:r>
+      <w:r>
+        <w:t xml:space="preserve"> </w:t>
+      </w:r>
+      <w:r>
+        <w:t xml:space="preserve">thì bài được khôi phục (nếu trong lúc đó bài đã được sửa ở nơi khác, hệ thống hỏi chọn bản).</w:t>
       </w:r>
     </w:p>
     <w:p>
@@ -4708,10 +4692,10 @@
           <w:b/>
           <w:bCs/>
         </w:rPr>
-        <w:t xml:space="preserve">Nộp</w:t>
-      </w:r>
-      <w:r>
-        <w:t xml:space="preserve">: bấm</w:t>
+        <w:t xml:space="preserve">Mở cùng bài ở 2 tab / 2 máy</w:t>
+      </w:r>
+      <w:r>
+        <w:t xml:space="preserve">: khi một nơi lưu đè, nơi kia hiện hộp thoại cho xem cả hai bản (kèm số từ) để chọn</w:t>
       </w:r>
       <w:r>
         <w:t xml:space="preserve"> </w:t>
@@ -4721,13 +4705,13 @@
           <w:b/>
           <w:bCs/>
         </w:rPr>
-        <w:t xml:space="preserve">Nộp phần này</w:t>
-      </w:r>
-      <w:r>
-        <w:t xml:space="preserve"> </w:t>
-      </w:r>
-      <w:r>
-        <w:t xml:space="preserve">(đang "Cần sửa":</w:t>
+        <w:t xml:space="preserve">Dùng bản trên máy này</w:t>
+      </w:r>
+      <w:r>
+        <w:t xml:space="preserve"> </w:t>
+      </w:r>
+      <w:r>
+        <w:t xml:space="preserve">hoặc</w:t>
       </w:r>
       <w:r>
         <w:t xml:space="preserve"> </w:t>
@@ -4737,20 +4721,7 @@
           <w:b/>
           <w:bCs/>
         </w:rPr>
-        <w:t xml:space="preserve">Nộp bản sửa</w:t>
-      </w:r>
-      <w:r>
-        <w:t xml:space="preserve">). Bài ít hơn số từ tối thiểu thì hệ thống hỏi lại ("Viết tiếp" / "Vẫn nộp"). Nộp xong ô soạn chuyển sang chỉ đọc kèm giờ nộp; nộp sau hạn (khi bài cho phép) được ghi là</w:t>
-      </w:r>
-      <w:r>
-        <w:t xml:space="preserve"> </w:t>
-      </w:r>
-      <w:r>
-        <w:rPr>
-          <w:b/>
-          <w:bCs/>
-        </w:rPr>
-        <w:t xml:space="preserve">nộp muộn</w:t>
+        <w:t xml:space="preserve">Dùng bản trên máy chủ</w:t>
       </w:r>
       <w:r>
         <w:t xml:space="preserve">.</w:t>
@@ -4769,6 +4740,67 @@
           <w:b/>
           <w:bCs/>
         </w:rPr>
+        <w:t xml:space="preserve">Nộp</w:t>
+      </w:r>
+      <w:r>
+        <w:t xml:space="preserve">: bấm</w:t>
+      </w:r>
+      <w:r>
+        <w:t xml:space="preserve"> </w:t>
+      </w:r>
+      <w:r>
+        <w:rPr>
+          <w:b/>
+          <w:bCs/>
+        </w:rPr>
+        <w:t xml:space="preserve">Nộp phần này</w:t>
+      </w:r>
+      <w:r>
+        <w:t xml:space="preserve"> </w:t>
+      </w:r>
+      <w:r>
+        <w:t xml:space="preserve">(đang "Cần sửa":</w:t>
+      </w:r>
+      <w:r>
+        <w:t xml:space="preserve"> </w:t>
+      </w:r>
+      <w:r>
+        <w:rPr>
+          <w:b/>
+          <w:bCs/>
+        </w:rPr>
+        <w:t xml:space="preserve">Nộp bản sửa</w:t>
+      </w:r>
+      <w:r>
+        <w:t xml:space="preserve">). Bài ít hơn số từ tối thiểu thì hệ thống hỏi lại ("Viết tiếp" / "Vẫn nộp"). Nộp xong ô soạn chuyển sang chỉ đọc kèm giờ nộp; nộp sau hạn (khi bài cho phép) được ghi là</w:t>
+      </w:r>
+      <w:r>
+        <w:t xml:space="preserve"> </w:t>
+      </w:r>
+      <w:r>
+        <w:rPr>
+          <w:b/>
+          <w:bCs/>
+        </w:rPr>
+        <w:t xml:space="preserve">nộp muộn</w:t>
+      </w:r>
+      <w:r>
+        <w:t xml:space="preserve">.</w:t>
+      </w:r>
+    </w:p>
+    <w:p>
+      <w:pPr>
+        <w:pStyle w:val="Compact"/>
+        <w:numPr>
+          <w:ilvl w:val="0"/>
+          <w:numId w:val="1006"/>
+        </w:numPr>
+      </w:pPr>
+      <w:r>
+        <w:rPr>
+          <w:b/>
+          <w:bCs/>
+        </w:rPr>
         <w:t xml:space="preserve">Đồng hồ đếm ngược</w:t>
       </w:r>
       <w:r>
@@ -4797,20 +4829,7 @@
           <w:b/>
           <w:bCs/>
         </w:rPr>
-        <w:t xml:space="preserve">Giữ nháp khi mất mạng</w:t>
-      </w:r>
-      <w:r>
-        <w:t xml:space="preserve">,</w:t>
-      </w:r>
-      <w:r>
-        <w:t xml:space="preserve"> </w:t>
-      </w:r>
-      <w:r>
-        <w:rPr>
-          <w:b/>
-          <w:bCs/>
-        </w:rPr>
-        <w:t xml:space="preserve">xem kết quả chi tiết</w:t>
+        <w:t xml:space="preserve">Xem kết quả chi tiết</w:t>
       </w:r>
       <w:r>
         <w:t xml:space="preserve"> </w:t>

</xml_diff>

<commit_message>
Module viết bài và nộp bài: nộp từng phần, phiên bản nộp bất biến, khóa nháp lạc quan (409 khi xung đột)
</commit_message>
<xml_diff>
--- a/docx/10-huong-dan-su-dung.docx
+++ b/docx/10-huong-dan-su-dung.docx
@@ -28,7 +28,7 @@
         </w:p>
       </w:sdtContent>
     </w:sdt>
-    <w:bookmarkStart w:id="33" w:name="X62b689528c743ccb8c3229542497059f4aa59b0"/>
+    <w:bookmarkStart w:id="34" w:name="X62b689528c743ccb8c3229542497059f4aa59b0"/>
     <w:p>
       <w:pPr>
         <w:pStyle w:val="Heading1"/>
@@ -223,7 +223,42 @@
               <w:pStyle w:val="Compact"/>
             </w:pPr>
             <w:r>
-              <w:t xml:space="preserve">Giáo viên: tiến độ, chấm bài, thống kê, trao đổi</w:t>
+              <w:t xml:space="preserve">Giáo viên: chấm bài (hàng đợi, chấm theo tiêu chí, trả bài, yêu cầu sửa)</w:t>
+            </w:r>
+          </w:p>
+        </w:tc>
+        <w:tc>
+          <w:tcPr/>
+          <w:p>
+            <w:pPr>
+              <w:pStyle w:val="Compact"/>
+            </w:pPr>
+            <w:r>
+              <w:t xml:space="preserve">✅ Dùng được</w:t>
+            </w:r>
+          </w:p>
+        </w:tc>
+        <w:tc>
+          <w:tcPr/>
+          <w:p>
+            <w:pPr>
+              <w:pStyle w:val="Compact"/>
+            </w:pPr>
+            <w:r>
+              <w:t xml:space="preserve">Nhận xét inline, ngân hàng nhận xét, so sánh 2 lần nộp: bước tiếp theo</w:t>
+            </w:r>
+          </w:p>
+        </w:tc>
+      </w:tr>
+      <w:tr>
+        <w:tc>
+          <w:tcPr/>
+          <w:p>
+            <w:pPr>
+              <w:pStyle w:val="Compact"/>
+            </w:pPr>
+            <w:r>
+              <w:t xml:space="preserve">Giáo viên: tiến độ, thống kê, trao đổi</w:t>
             </w:r>
           </w:p>
         </w:tc>
@@ -3130,7 +3165,7 @@
       </w:r>
     </w:p>
     <w:bookmarkEnd w:id="19"/>
-    <w:bookmarkStart w:id="25" w:name="Xb09ea090739f16ea647716f93f754b282728bef"/>
+    <w:bookmarkStart w:id="26" w:name="Xb09ea090739f16ea647716f93f754b282728bef"/>
     <w:p>
       <w:pPr>
         <w:pStyle w:val="Heading2"/>
@@ -4054,13 +4089,367 @@
       </w:r>
     </w:p>
     <w:bookmarkEnd w:id="23"/>
-    <w:bookmarkStart w:id="24" w:name="X7b8b21a7018f0faf6866fd4753739ec65bdaff1"/>
+    <w:bookmarkStart w:id="24" w:name="Xc3f2302343b4f1fa7977b63f3094e59b378a402"/>
     <w:p>
       <w:pPr>
         <w:pStyle w:val="Heading3"/>
       </w:pPr>
       <w:r>
-        <w:t xml:space="preserve">6.4. Đang làm</w:t>
+        <w:t xml:space="preserve">6.4. Chấm bài</w:t>
+      </w:r>
+    </w:p>
+    <w:p>
+      <w:pPr>
+        <w:pStyle w:val="Compact"/>
+        <w:numPr>
+          <w:ilvl w:val="0"/>
+          <w:numId w:val="1005"/>
+        </w:numPr>
+      </w:pPr>
+      <w:r>
+        <w:rPr>
+          <w:b/>
+          <w:bCs/>
+        </w:rPr>
+        <w:t xml:space="preserve">Hàng đợi</w:t>
+      </w:r>
+      <w:r>
+        <w:t xml:space="preserve"> </w:t>
+      </w:r>
+      <w:r>
+        <w:t xml:space="preserve">(menu</w:t>
+      </w:r>
+      <w:r>
+        <w:t xml:space="preserve"> </w:t>
+      </w:r>
+      <w:r>
+        <w:rPr>
+          <w:b/>
+          <w:bCs/>
+        </w:rPr>
+        <w:t xml:space="preserve">Chấm bài</w:t>
+      </w:r>
+      <w:r>
+        <w:t xml:space="preserve">, hoặc nút "Chấm bài" ở danh sách / chi tiết bài tập): lọc theo bài tập, phần, lớp, mã SV / họ tên; tab</w:t>
+      </w:r>
+      <w:r>
+        <w:t xml:space="preserve"> </w:t>
+      </w:r>
+      <w:r>
+        <w:rPr>
+          <w:b/>
+          <w:bCs/>
+        </w:rPr>
+        <w:t xml:space="preserve">Chờ chấm / Đang chấm / Đã trả / Cần sửa</w:t>
+      </w:r>
+      <w:r>
+        <w:t xml:space="preserve">. Bài nộp trước xếp trước; nhãn</w:t>
+      </w:r>
+      <w:r>
+        <w:t xml:space="preserve"> </w:t>
+      </w:r>
+      <w:r>
+        <w:rPr>
+          <w:rStyle w:val="VerbatimChar"/>
+        </w:rPr>
+        <w:t xml:space="preserve">v2</w:t>
+      </w:r>
+      <w:r>
+        <w:t xml:space="preserve"> </w:t>
+      </w:r>
+      <w:r>
+        <w:t xml:space="preserve">= bài nộp lại sau khi yêu cầu sửa, nhãn "Nộp muộn" nếu nộp sau hạn. Bấm</w:t>
+      </w:r>
+      <w:r>
+        <w:t xml:space="preserve"> </w:t>
+      </w:r>
+      <w:r>
+        <w:rPr>
+          <w:b/>
+          <w:bCs/>
+        </w:rPr>
+        <w:t xml:space="preserve">Chấm</w:t>
+      </w:r>
+      <w:r>
+        <w:t xml:space="preserve">.</w:t>
+      </w:r>
+    </w:p>
+    <w:p>
+      <w:pPr>
+        <w:pStyle w:val="Compact"/>
+        <w:numPr>
+          <w:ilvl w:val="0"/>
+          <w:numId w:val="1005"/>
+        </w:numPr>
+      </w:pPr>
+      <w:r>
+        <w:rPr>
+          <w:b/>
+          <w:bCs/>
+        </w:rPr>
+        <w:t xml:space="preserve">Màn chấm</w:t>
+      </w:r>
+      <w:r>
+        <w:t xml:space="preserve">: bài làm bên trái (cảnh báo khi bài ≤ 20 từ hoặc dưới số từ tối thiểu; bấm "Đề bài" để xem đề), bảng chấm bên phải. Màn hình nhỏ: chuyển giữa tab</w:t>
+      </w:r>
+      <w:r>
+        <w:t xml:space="preserve"> </w:t>
+      </w:r>
+      <w:r>
+        <w:rPr>
+          <w:b/>
+          <w:bCs/>
+        </w:rPr>
+        <w:t xml:space="preserve">Bài làm</w:t>
+      </w:r>
+      <w:r>
+        <w:t xml:space="preserve"> </w:t>
+      </w:r>
+      <w:r>
+        <w:t xml:space="preserve">/</w:t>
+      </w:r>
+      <w:r>
+        <w:t xml:space="preserve"> </w:t>
+      </w:r>
+      <w:r>
+        <w:rPr>
+          <w:b/>
+          <w:bCs/>
+        </w:rPr>
+        <w:t xml:space="preserve">Chấm điểm</w:t>
+      </w:r>
+      <w:r>
+        <w:t xml:space="preserve">.</w:t>
+      </w:r>
+    </w:p>
+    <w:p>
+      <w:pPr>
+        <w:pStyle w:val="Compact"/>
+        <w:numPr>
+          <w:ilvl w:val="1"/>
+          <w:numId w:val="1006"/>
+        </w:numPr>
+      </w:pPr>
+      <w:r>
+        <w:t xml:space="preserve">Mỗi tiêu chí: tick checklist, chọn điểm (bấm lại để bỏ chọn, hoặc dùng phím ← →), ghi nhận xét. Tick mục</w:t>
+      </w:r>
+      <w:r>
+        <w:t xml:space="preserve"> </w:t>
+      </w:r>
+      <w:r>
+        <w:rPr>
+          <w:b/>
+          <w:bCs/>
+        </w:rPr>
+        <w:t xml:space="preserve">"Giới hạn điểm"</w:t>
+      </w:r>
+      <w:r>
+        <w:t xml:space="preserve"> </w:t>
+      </w:r>
+      <w:r>
+        <w:t xml:space="preserve">(nhãn cam "Tối đa N") thì các mức cao hơn bị khoá kèm lý do, điểm đang chọn cao hơn sẽ tự hạ xuống. Bài ≤ 20 từ: mọi tiêu chí tối đa 1.</w:t>
+      </w:r>
+    </w:p>
+    <w:p>
+      <w:pPr>
+        <w:pStyle w:val="Compact"/>
+        <w:numPr>
+          <w:ilvl w:val="1"/>
+          <w:numId w:val="1006"/>
+        </w:numPr>
+      </w:pPr>
+      <w:r>
+        <w:rPr>
+          <w:b/>
+          <w:bCs/>
+        </w:rPr>
+        <w:t xml:space="preserve">Band của phần</w:t>
+      </w:r>
+      <w:r>
+        <w:t xml:space="preserve"> </w:t>
+      </w:r>
+      <w:r>
+        <w:t xml:space="preserve">hiện ngay khi chấm đủ (trung bình các tiêu chí, làm tròn kiểu IELTS .25 / .75).</w:t>
+      </w:r>
+    </w:p>
+    <w:p>
+      <w:pPr>
+        <w:pStyle w:val="Compact"/>
+        <w:numPr>
+          <w:ilvl w:val="1"/>
+          <w:numId w:val="1006"/>
+        </w:numPr>
+      </w:pPr>
+      <w:r>
+        <w:rPr>
+          <w:b/>
+          <w:bCs/>
+        </w:rPr>
+        <w:t xml:space="preserve">Chấm 0</w:t>
+      </w:r>
+      <w:r>
+        <w:t xml:space="preserve"> </w:t>
+      </w:r>
+      <w:r>
+        <w:t xml:space="preserve">(góc trên bảng chấm): chọn lý do Không làm bài / Không viết bằng tiếng Anh / Học thuộc hoàn toàn; bấm "Bỏ chấm 0" để chấm lại bình thường.</w:t>
+      </w:r>
+    </w:p>
+    <w:p>
+      <w:pPr>
+        <w:pStyle w:val="Compact"/>
+        <w:numPr>
+          <w:ilvl w:val="1"/>
+          <w:numId w:val="1006"/>
+        </w:numPr>
+      </w:pPr>
+      <w:r>
+        <w:t xml:space="preserve">Kết quả</w:t>
+      </w:r>
+      <w:r>
+        <w:t xml:space="preserve"> </w:t>
+      </w:r>
+      <w:r>
+        <w:rPr>
+          <w:b/>
+          <w:bCs/>
+        </w:rPr>
+        <w:t xml:space="preserve">tự lưu nháp</w:t>
+      </w:r>
+      <w:r>
+        <w:t xml:space="preserve"> </w:t>
+      </w:r>
+      <w:r>
+        <w:t xml:space="preserve">2 giây sau mỗi thay đổi (hoặc bấm</w:t>
+      </w:r>
+      <w:r>
+        <w:t xml:space="preserve"> </w:t>
+      </w:r>
+      <w:r>
+        <w:rPr>
+          <w:b/>
+          <w:bCs/>
+        </w:rPr>
+        <w:t xml:space="preserve">Lưu nháp</w:t>
+      </w:r>
+      <w:r>
+        <w:t xml:space="preserve">); sinh viên chưa thấy gì cho tới khi trả bài.</w:t>
+      </w:r>
+    </w:p>
+    <w:p>
+      <w:pPr>
+        <w:pStyle w:val="Compact"/>
+        <w:numPr>
+          <w:ilvl w:val="1"/>
+          <w:numId w:val="1006"/>
+        </w:numPr>
+      </w:pPr>
+      <w:r>
+        <w:rPr>
+          <w:b/>
+          <w:bCs/>
+        </w:rPr>
+        <w:t xml:space="preserve">Trả bài</w:t>
+      </w:r>
+      <w:r>
+        <w:t xml:space="preserve">: cần chấm đủ mọi tiêu chí. Sinh viên nhận thông báo và thấy band, nhận xét.</w:t>
+      </w:r>
+    </w:p>
+    <w:p>
+      <w:pPr>
+        <w:pStyle w:val="Compact"/>
+        <w:numPr>
+          <w:ilvl w:val="1"/>
+          <w:numId w:val="1006"/>
+        </w:numPr>
+      </w:pPr>
+      <w:r>
+        <w:rPr>
+          <w:b/>
+          <w:bCs/>
+        </w:rPr>
+        <w:t xml:space="preserve">Yêu cầu sửa</w:t>
+      </w:r>
+      <w:r>
+        <w:t xml:space="preserve">: nhập lời nhắn và hạn sửa; chỉ khi còn lượt sửa (theo cài đặt bài tập) và bài chưa đóng. Sinh viên nộp lại sẽ thành lần nộp mới (</w:t>
+      </w:r>
+      <w:r>
+        <w:rPr>
+          <w:rStyle w:val="VerbatimChar"/>
+        </w:rPr>
+        <w:t xml:space="preserve">v2</w:t>
+      </w:r>
+      <w:r>
+        <w:t xml:space="preserve">).</w:t>
+      </w:r>
+    </w:p>
+    <w:p>
+      <w:pPr>
+        <w:pStyle w:val="Compact"/>
+        <w:numPr>
+          <w:ilvl w:val="1"/>
+          <w:numId w:val="1006"/>
+        </w:numPr>
+      </w:pPr>
+      <w:r>
+        <w:t xml:space="preserve">Trả bài / yêu cầu sửa xong, màn tự chuyển sang</w:t>
+      </w:r>
+      <w:r>
+        <w:t xml:space="preserve"> </w:t>
+      </w:r>
+      <w:r>
+        <w:rPr>
+          <w:b/>
+          <w:bCs/>
+        </w:rPr>
+        <w:t xml:space="preserve">bài kế tiếp</w:t>
+      </w:r>
+      <w:r>
+        <w:t xml:space="preserve"> </w:t>
+      </w:r>
+      <w:r>
+        <w:t xml:space="preserve">trong hàng đợi. Nút</w:t>
+      </w:r>
+      <w:r>
+        <w:t xml:space="preserve"> </w:t>
+      </w:r>
+      <w:r>
+        <w:rPr>
+          <w:b/>
+          <w:bCs/>
+        </w:rPr>
+        <w:t xml:space="preserve">Trước / Sau</w:t>
+      </w:r>
+      <w:r>
+        <w:t xml:space="preserve"> </w:t>
+      </w:r>
+      <w:r>
+        <w:t xml:space="preserve">và số "3/12" đi theo bộ lọc của hàng đợi; ô chọn</w:t>
+      </w:r>
+      <w:r>
+        <w:t xml:space="preserve"> </w:t>
+      </w:r>
+      <w:r>
+        <w:rPr>
+          <w:b/>
+          <w:bCs/>
+        </w:rPr>
+        <w:t xml:space="preserve">Lần nộp</w:t>
+      </w:r>
+      <w:r>
+        <w:t xml:space="preserve"> </w:t>
+      </w:r>
+      <w:r>
+        <w:t xml:space="preserve">để xem lại các lần nộp cũ (chỉ xem).</w:t>
+      </w:r>
+    </w:p>
+    <w:bookmarkEnd w:id="24"/>
+    <w:bookmarkStart w:id="25" w:name="X6b492762c0885c215f1b682c1381e1b2b552abc"/>
+    <w:p>
+      <w:pPr>
+        <w:pStyle w:val="Heading3"/>
+      </w:pPr>
+      <w:r>
+        <w:t xml:space="preserve">6.5. Đang làm</w:t>
       </w:r>
     </w:p>
     <w:p>
@@ -4068,7 +4457,7 @@
         <w:pStyle w:val="FirstParagraph"/>
       </w:pPr>
       <w:r>
-        <w:t xml:space="preserve">Tiến độ realtime của lớp, chấm bài (checklist, band, nhận xét inline, trả bài / yêu cầu sửa), thống kê, xuất Excel và trao đổi (chat) đã có ở backend; giao diện sẽ có ở các bước tiếp theo.</w:t>
+        <w:t xml:space="preserve">Nhận xét trên bài (bôi đen → mã lỗi, gợi ý sửa), ngân hàng nhận xét, so sánh 2 lần nộp, tiến độ realtime của lớp, thống kê, xuất Excel và trao đổi (chat) đã có ở backend; giao diện sẽ có ở các bước tiếp theo.</w:t>
       </w:r>
     </w:p>
     <w:p>
@@ -4078,9 +4467,9 @@
         </w:pict>
       </w:r>
     </w:p>
-    <w:bookmarkEnd w:id="24"/>
     <w:bookmarkEnd w:id="25"/>
-    <w:bookmarkStart w:id="30" w:name="Xa4980557fe2b16e9ea1555bbc3e255ac8d44acd"/>
+    <w:bookmarkEnd w:id="26"/>
+    <w:bookmarkStart w:id="31" w:name="Xa4980557fe2b16e9ea1555bbc3e255ac8d44acd"/>
     <w:p>
       <w:pPr>
         <w:pStyle w:val="Heading2"/>
@@ -4089,7 +4478,7 @@
         <w:t xml:space="preserve">7. Sinh viên</w:t>
       </w:r>
     </w:p>
-    <w:bookmarkStart w:id="26" w:name="Xcffb4351e90d1c23fbec4b4d17fa845266992ba"/>
+    <w:bookmarkStart w:id="27" w:name="Xcffb4351e90d1c23fbec4b4d17fa845266992ba"/>
     <w:p>
       <w:pPr>
         <w:pStyle w:val="Heading3"/>
@@ -4349,8 +4738,8 @@
         <w:t xml:space="preserve">. Quá hạn mà bài không cho nộp muộn thì không còn nút "Làm bài".</w:t>
       </w:r>
     </w:p>
-    <w:bookmarkEnd w:id="26"/>
-    <w:bookmarkStart w:id="27" w:name="X005d57e46c787d0cadbca70fe6e284d1775213e"/>
+    <w:bookmarkEnd w:id="27"/>
+    <w:bookmarkStart w:id="28" w:name="X005d57e46c787d0cadbca70fe6e284d1775213e"/>
     <w:p>
       <w:pPr>
         <w:pStyle w:val="Heading3"/>
@@ -4365,559 +4754,6 @@
       </w:pPr>
       <w:r>
         <w:t xml:space="preserve">Bấm tên bài (hoặc bấm vào thông báo) để mở. Trang có:</w:t>
-      </w:r>
-    </w:p>
-    <w:p>
-      <w:pPr>
-        <w:pStyle w:val="Compact"/>
-        <w:numPr>
-          <w:ilvl w:val="0"/>
-          <w:numId w:val="1005"/>
-        </w:numPr>
-      </w:pPr>
-      <w:r>
-        <w:t xml:space="preserve">khung đỏ</w:t>
-      </w:r>
-      <w:r>
-        <w:t xml:space="preserve"> </w:t>
-      </w:r>
-      <w:r>
-        <w:rPr>
-          <w:b/>
-          <w:bCs/>
-        </w:rPr>
-        <w:t xml:space="preserve">"Giáo viên yêu cầu sửa …"</w:t>
-      </w:r>
-      <w:r>
-        <w:t xml:space="preserve"> </w:t>
-      </w:r>
-      <w:r>
-        <w:t xml:space="preserve">kèm hạn sửa, lời nhắn và nút</w:t>
-      </w:r>
-      <w:r>
-        <w:t xml:space="preserve"> </w:t>
-      </w:r>
-      <w:r>
-        <w:rPr>
-          <w:b/>
-          <w:bCs/>
-        </w:rPr>
-        <w:t xml:space="preserve">Sửa bài</w:t>
-      </w:r>
-      <w:r>
-        <w:t xml:space="preserve"> </w:t>
-      </w:r>
-      <w:r>
-        <w:t xml:space="preserve">(nếu có);</w:t>
-      </w:r>
-    </w:p>
-    <w:p>
-      <w:pPr>
-        <w:pStyle w:val="Compact"/>
-        <w:numPr>
-          <w:ilvl w:val="0"/>
-          <w:numId w:val="1005"/>
-        </w:numPr>
-      </w:pPr>
-      <w:r>
-        <w:t xml:space="preserve">từng phần trong một tab: trạng thái, loại đề, số từ tối thiểu, thời gian gợi ý, hạn nộp / hạn sửa, đề bài + hình,</w:t>
-      </w:r>
-      <w:r>
-        <w:t xml:space="preserve"> </w:t>
-      </w:r>
-      <w:r>
-        <w:rPr>
-          <w:b/>
-          <w:bCs/>
-        </w:rPr>
-        <w:t xml:space="preserve">tiêu chí chấm</w:t>
-      </w:r>
-      <w:r>
-        <w:t xml:space="preserve"> </w:t>
-      </w:r>
-      <w:r>
-        <w:t xml:space="preserve">(mở ra xem checklist, mục "Giới hạn điểm" ghi band tối đa); nút</w:t>
-      </w:r>
-      <w:r>
-        <w:t xml:space="preserve"> </w:t>
-      </w:r>
-      <w:r>
-        <w:rPr>
-          <w:b/>
-          <w:bCs/>
-        </w:rPr>
-        <w:t xml:space="preserve">Làm bài / Viết tiếp / Sửa bài</w:t>
-      </w:r>
-      <w:r>
-        <w:t xml:space="preserve">, hoặc</w:t>
-      </w:r>
-      <w:r>
-        <w:t xml:space="preserve"> </w:t>
-      </w:r>
-      <w:r>
-        <w:rPr>
-          <w:b/>
-          <w:bCs/>
-        </w:rPr>
-        <w:t xml:space="preserve">Xem bài đã nộp</w:t>
-      </w:r>
-      <w:r>
-        <w:t xml:space="preserve">;</w:t>
-      </w:r>
-    </w:p>
-    <w:p>
-      <w:pPr>
-        <w:pStyle w:val="Compact"/>
-        <w:numPr>
-          <w:ilvl w:val="0"/>
-          <w:numId w:val="1005"/>
-        </w:numPr>
-      </w:pPr>
-      <w:r>
-        <w:rPr>
-          <w:b/>
-          <w:bCs/>
-        </w:rPr>
-        <w:t xml:space="preserve">Lịch sử nộp</w:t>
-      </w:r>
-      <w:r>
-        <w:t xml:space="preserve"> </w:t>
-      </w:r>
-      <w:r>
-        <w:t xml:space="preserve">của từng phần: mỗi lần nộp, giờ nộp, số từ, nộp muộn, band nếu đã được trả bài (đang chấm thì ghi "Chờ kết quả");</w:t>
-      </w:r>
-    </w:p>
-    <w:p>
-      <w:pPr>
-        <w:pStyle w:val="Compact"/>
-        <w:numPr>
-          <w:ilvl w:val="0"/>
-          <w:numId w:val="1005"/>
-        </w:numPr>
-      </w:pPr>
-      <w:r>
-        <w:t xml:space="preserve">khung</w:t>
-      </w:r>
-      <w:r>
-        <w:t xml:space="preserve"> </w:t>
-      </w:r>
-      <w:r>
-        <w:rPr>
-          <w:b/>
-          <w:bCs/>
-        </w:rPr>
-        <w:t xml:space="preserve">Kết quả</w:t>
-      </w:r>
-      <w:r>
-        <w:t xml:space="preserve">: band từng phần và band cả bài (chỉ có khi mọi phần đã được trả; Task 2 tính gấp đôi Task 1);</w:t>
-      </w:r>
-    </w:p>
-    <w:p>
-      <w:pPr>
-        <w:pStyle w:val="Compact"/>
-        <w:numPr>
-          <w:ilvl w:val="0"/>
-          <w:numId w:val="1005"/>
-        </w:numPr>
-      </w:pPr>
-      <w:r>
-        <w:t xml:space="preserve">khung</w:t>
-      </w:r>
-      <w:r>
-        <w:t xml:space="preserve"> </w:t>
-      </w:r>
-      <w:r>
-        <w:rPr>
-          <w:b/>
-          <w:bCs/>
-        </w:rPr>
-        <w:t xml:space="preserve">Thời gian &amp; quy định</w:t>
-      </w:r>
-      <w:r>
-        <w:t xml:space="preserve">: hạn nộp, có cho nộp muộn không, số lần yêu cầu sửa tối đa.</w:t>
-      </w:r>
-    </w:p>
-    <w:bookmarkEnd w:id="27"/>
-    <w:bookmarkStart w:id="28" w:name="Xcdbbb1fe94ded6e0db335b0616309f1ec0255e9"/>
-    <w:p>
-      <w:pPr>
-        <w:pStyle w:val="Heading3"/>
-      </w:pPr>
-      <w:r>
-        <w:t xml:space="preserve">7.3. Làm bài và nộp bài</w:t>
-      </w:r>
-    </w:p>
-    <w:p>
-      <w:pPr>
-        <w:pStyle w:val="FirstParagraph"/>
-      </w:pPr>
-      <w:r>
-        <w:t xml:space="preserve">Bấm</w:t>
-      </w:r>
-      <w:r>
-        <w:t xml:space="preserve"> </w:t>
-      </w:r>
-      <w:r>
-        <w:rPr>
-          <w:b/>
-          <w:bCs/>
-        </w:rPr>
-        <w:t xml:space="preserve">Làm bài / Viết tiếp / Sửa bài</w:t>
-      </w:r>
-      <w:r>
-        <w:t xml:space="preserve"> </w:t>
-      </w:r>
-      <w:r>
-        <w:t xml:space="preserve">để mở màn làm bài toàn màn hình. Bài nhiều phần thì chọn phần ở hàng tab trên cùng (tab ghi trạng thái từng phần).</w:t>
-      </w:r>
-    </w:p>
-    <w:p>
-      <w:pPr>
-        <w:pStyle w:val="Compact"/>
-        <w:numPr>
-          <w:ilvl w:val="0"/>
-          <w:numId w:val="1006"/>
-        </w:numPr>
-      </w:pPr>
-      <w:r>
-        <w:rPr>
-          <w:b/>
-          <w:bCs/>
-        </w:rPr>
-        <w:t xml:space="preserve">Bên trái</w:t>
-      </w:r>
-      <w:r>
-        <w:t xml:space="preserve"> </w:t>
-      </w:r>
-      <w:r>
-        <w:t xml:space="preserve">là đề bài (trên điện thoại: bấm</w:t>
-      </w:r>
-      <w:r>
-        <w:t xml:space="preserve"> </w:t>
-      </w:r>
-      <w:r>
-        <w:rPr>
-          <w:b/>
-          <w:bCs/>
-        </w:rPr>
-        <w:t xml:space="preserve">Xem đề bài</w:t>
-      </w:r>
-      <w:r>
-        <w:t xml:space="preserve"> </w:t>
-      </w:r>
-      <w:r>
-        <w:t xml:space="preserve">để mở),</w:t>
-      </w:r>
-      <w:r>
-        <w:t xml:space="preserve"> </w:t>
-      </w:r>
-      <w:r>
-        <w:rPr>
-          <w:b/>
-          <w:bCs/>
-        </w:rPr>
-        <w:t xml:space="preserve">bên phải</w:t>
-      </w:r>
-      <w:r>
-        <w:t xml:space="preserve"> </w:t>
-      </w:r>
-      <w:r>
-        <w:t xml:space="preserve">là ô soạn. Số từ đếm ngay khi gõ (cùng cách đếm với máy chủ): màu cam khi chưa đủ tối thiểu, xanh khi đủ.</w:t>
-      </w:r>
-    </w:p>
-    <w:p>
-      <w:pPr>
-        <w:pStyle w:val="Compact"/>
-        <w:numPr>
-          <w:ilvl w:val="0"/>
-          <w:numId w:val="1006"/>
-        </w:numPr>
-      </w:pPr>
-      <w:r>
-        <w:rPr>
-          <w:b/>
-          <w:bCs/>
-        </w:rPr>
-        <w:t xml:space="preserve">Tự lưu nháp</w:t>
-      </w:r>
-      <w:r>
-        <w:t xml:space="preserve">: ngừng gõ 3 giây, chuyển sang tab khác hoặc đổi phần là bài được lưu; dòng trạng thái ghi "Chưa lưu" → "Đang lưu…" → "Đã lưu lúc hh:mm". Lưu lỗi thì bấm "Lỗi lưu – thử lại". Đóng trang khi còn thay đổi chưa lưu, trình duyệt sẽ hỏi lại.</w:t>
-      </w:r>
-    </w:p>
-    <w:p>
-      <w:pPr>
-        <w:pStyle w:val="Compact"/>
-        <w:numPr>
-          <w:ilvl w:val="0"/>
-          <w:numId w:val="1006"/>
-        </w:numPr>
-      </w:pPr>
-      <w:r>
-        <w:rPr>
-          <w:b/>
-          <w:bCs/>
-        </w:rPr>
-        <w:t xml:space="preserve">Mất mạng khi đang viết</w:t>
-      </w:r>
-      <w:r>
-        <w:t xml:space="preserve">: cứ viết tiếp, bài được giữ trên trình duyệt; dòng trạng thái ghi "Ngoại tuyến – đã lưu trên máy" và nút nộp tạm khoá ("Cần có mạng để nộp bài"). Có mạng lại, bài tự gửi lên máy chủ. Lỡ đóng trang khi chưa gửi được, mở lại màn làm bài trên</w:t>
-      </w:r>
-      <w:r>
-        <w:t xml:space="preserve"> </w:t>
-      </w:r>
-      <w:r>
-        <w:rPr>
-          <w:b/>
-          <w:bCs/>
-        </w:rPr>
-        <w:t xml:space="preserve">cùng trình duyệt</w:t>
-      </w:r>
-      <w:r>
-        <w:t xml:space="preserve"> </w:t>
-      </w:r>
-      <w:r>
-        <w:t xml:space="preserve">thì bài được khôi phục (nếu trong lúc đó bài đã được sửa ở nơi khác, hệ thống hỏi chọn bản).</w:t>
-      </w:r>
-    </w:p>
-    <w:p>
-      <w:pPr>
-        <w:pStyle w:val="Compact"/>
-        <w:numPr>
-          <w:ilvl w:val="0"/>
-          <w:numId w:val="1006"/>
-        </w:numPr>
-      </w:pPr>
-      <w:r>
-        <w:rPr>
-          <w:b/>
-          <w:bCs/>
-        </w:rPr>
-        <w:t xml:space="preserve">Mở cùng bài ở 2 tab / 2 máy</w:t>
-      </w:r>
-      <w:r>
-        <w:t xml:space="preserve">: khi một nơi lưu đè, nơi kia hiện hộp thoại cho xem cả hai bản (kèm số từ) để chọn</w:t>
-      </w:r>
-      <w:r>
-        <w:t xml:space="preserve"> </w:t>
-      </w:r>
-      <w:r>
-        <w:rPr>
-          <w:b/>
-          <w:bCs/>
-        </w:rPr>
-        <w:t xml:space="preserve">Dùng bản trên máy này</w:t>
-      </w:r>
-      <w:r>
-        <w:t xml:space="preserve"> </w:t>
-      </w:r>
-      <w:r>
-        <w:t xml:space="preserve">hoặc</w:t>
-      </w:r>
-      <w:r>
-        <w:t xml:space="preserve"> </w:t>
-      </w:r>
-      <w:r>
-        <w:rPr>
-          <w:b/>
-          <w:bCs/>
-        </w:rPr>
-        <w:t xml:space="preserve">Dùng bản trên máy chủ</w:t>
-      </w:r>
-      <w:r>
-        <w:t xml:space="preserve">.</w:t>
-      </w:r>
-    </w:p>
-    <w:p>
-      <w:pPr>
-        <w:pStyle w:val="Compact"/>
-        <w:numPr>
-          <w:ilvl w:val="0"/>
-          <w:numId w:val="1006"/>
-        </w:numPr>
-      </w:pPr>
-      <w:r>
-        <w:rPr>
-          <w:b/>
-          <w:bCs/>
-        </w:rPr>
-        <w:t xml:space="preserve">Nộp</w:t>
-      </w:r>
-      <w:r>
-        <w:t xml:space="preserve">: bấm</w:t>
-      </w:r>
-      <w:r>
-        <w:t xml:space="preserve"> </w:t>
-      </w:r>
-      <w:r>
-        <w:rPr>
-          <w:b/>
-          <w:bCs/>
-        </w:rPr>
-        <w:t xml:space="preserve">Nộp phần này</w:t>
-      </w:r>
-      <w:r>
-        <w:t xml:space="preserve"> </w:t>
-      </w:r>
-      <w:r>
-        <w:t xml:space="preserve">(đang "Cần sửa":</w:t>
-      </w:r>
-      <w:r>
-        <w:t xml:space="preserve"> </w:t>
-      </w:r>
-      <w:r>
-        <w:rPr>
-          <w:b/>
-          <w:bCs/>
-        </w:rPr>
-        <w:t xml:space="preserve">Nộp bản sửa</w:t>
-      </w:r>
-      <w:r>
-        <w:t xml:space="preserve">). Bài ít hơn số từ tối thiểu thì hệ thống hỏi lại ("Viết tiếp" / "Vẫn nộp"). Nộp xong ô soạn chuyển sang chỉ đọc kèm giờ nộp; nộp sau hạn (khi bài cho phép) được ghi là</w:t>
-      </w:r>
-      <w:r>
-        <w:t xml:space="preserve"> </w:t>
-      </w:r>
-      <w:r>
-        <w:rPr>
-          <w:b/>
-          <w:bCs/>
-        </w:rPr>
-        <w:t xml:space="preserve">nộp muộn</w:t>
-      </w:r>
-      <w:r>
-        <w:t xml:space="preserve">.</w:t>
-      </w:r>
-    </w:p>
-    <w:p>
-      <w:pPr>
-        <w:pStyle w:val="Compact"/>
-        <w:numPr>
-          <w:ilvl w:val="0"/>
-          <w:numId w:val="1006"/>
-        </w:numPr>
-      </w:pPr>
-      <w:r>
-        <w:rPr>
-          <w:b/>
-          <w:bCs/>
-        </w:rPr>
-        <w:t xml:space="preserve">Đồng hồ đếm ngược</w:t>
-      </w:r>
-      <w:r>
-        <w:t xml:space="preserve"> </w:t>
-      </w:r>
-      <w:r>
-        <w:t xml:space="preserve">theo giờ máy chủ (tự đồng bộ 5 phút một lần). Quá hạn mà bài không cho nộp muộn, hoặc bài đã đóng, thì ô soạn khoá lại và ghi lý do.</w:t>
-      </w:r>
-    </w:p>
-    <w:bookmarkEnd w:id="28"/>
-    <w:bookmarkStart w:id="29" w:name="X3b2aee35a6458aa45263b9eff75cd6a1e1138d6"/>
-    <w:p>
-      <w:pPr>
-        <w:pStyle w:val="Heading3"/>
-      </w:pPr>
-      <w:r>
-        <w:t xml:space="preserve">7.4. Đang làm</w:t>
-      </w:r>
-    </w:p>
-    <w:p>
-      <w:pPr>
-        <w:pStyle w:val="FirstParagraph"/>
-      </w:pPr>
-      <w:r>
-        <w:rPr>
-          <w:b/>
-          <w:bCs/>
-        </w:rPr>
-        <w:t xml:space="preserve">Xem kết quả chi tiết</w:t>
-      </w:r>
-      <w:r>
-        <w:t xml:space="preserve"> </w:t>
-      </w:r>
-      <w:r>
-        <w:t xml:space="preserve">(nhận xét trên bài, mã lỗi, so sánh các lần nộp),</w:t>
-      </w:r>
-      <w:r>
-        <w:t xml:space="preserve"> </w:t>
-      </w:r>
-      <w:r>
-        <w:rPr>
-          <w:b/>
-          <w:bCs/>
-        </w:rPr>
-        <w:t xml:space="preserve">kết quả học tập</w:t>
-      </w:r>
-      <w:r>
-        <w:t xml:space="preserve"> </w:t>
-      </w:r>
-      <w:r>
-        <w:t xml:space="preserve">và</w:t>
-      </w:r>
-      <w:r>
-        <w:t xml:space="preserve"> </w:t>
-      </w:r>
-      <w:r>
-        <w:rPr>
-          <w:b/>
-          <w:bCs/>
-        </w:rPr>
-        <w:t xml:space="preserve">trao đổi</w:t>
-      </w:r>
-      <w:r>
-        <w:t xml:space="preserve"> </w:t>
-      </w:r>
-      <w:r>
-        <w:t xml:space="preserve">sẽ có ở các bước tiếp theo.</w:t>
-      </w:r>
-    </w:p>
-    <w:p>
-      <w:r>
-        <w:pict>
-          <v:rect style="width:0;height:1.5pt" o:hralign="center" o:hrstd="t" o:hr="t"/>
-        </w:pict>
-      </w:r>
-    </w:p>
-    <w:bookmarkEnd w:id="29"/>
-    <w:bookmarkEnd w:id="30"/>
-    <w:bookmarkStart w:id="31" w:name="X27a74f3cf0506426a1a76b4e73d04f5d967bbd0"/>
-    <w:p>
-      <w:pPr>
-        <w:pStyle w:val="Heading2"/>
-      </w:pPr>
-      <w:r>
-        <w:t xml:space="preserve">8. Kịch bản demo gợi ý (~10 phút)</w:t>
-      </w:r>
-    </w:p>
-    <w:p>
-      <w:pPr>
-        <w:pStyle w:val="FirstParagraph"/>
-      </w:pPr>
-      <w:r>
-        <w:t xml:space="preserve">Mở hai trình duyệt (hoặc một cửa sổ ẩn danh): máy A đăng nhập</w:t>
-      </w:r>
-      <w:r>
-        <w:t xml:space="preserve"> </w:t>
-      </w:r>
-      <w:r>
-        <w:rPr>
-          <w:rStyle w:val="VerbatimChar"/>
-        </w:rPr>
-        <w:t xml:space="preserve">gv.demo</w:t>
-      </w:r>
-      <w:r>
-        <w:t xml:space="preserve">, máy B đăng nhập</w:t>
-      </w:r>
-      <w:r>
-        <w:t xml:space="preserve"> </w:t>
-      </w:r>
-      <w:r>
-        <w:rPr>
-          <w:rStyle w:val="VerbatimChar"/>
-        </w:rPr>
-        <w:t xml:space="preserve">DEMO001</w:t>
-      </w:r>
-      <w:r>
-        <w:t xml:space="preserve">.</w:t>
       </w:r>
     </w:p>
     <w:p>
@@ -4929,26 +4765,39 @@
         </w:numPr>
       </w:pPr>
       <w:r>
-        <w:rPr>
-          <w:b/>
-          <w:bCs/>
-        </w:rPr>
-        <w:t xml:space="preserve">Admin</w:t>
-      </w:r>
-      <w:r>
-        <w:t xml:space="preserve"> </w:t>
-      </w:r>
-      <w:r>
-        <w:t xml:space="preserve">(</w:t>
-      </w:r>
-      <w:r>
-        <w:rPr>
-          <w:rStyle w:val="VerbatimChar"/>
-        </w:rPr>
-        <w:t xml:space="preserve">admin</w:t>
-      </w:r>
-      <w:r>
-        <w:t xml:space="preserve">): Tổng quan → Giáo viên → thêm một giáo viên, xem mật khẩu tạm hiện một lần → Nhật ký thấy dòng "Tạo giáo viên".</w:t>
+        <w:t xml:space="preserve">khung đỏ</w:t>
+      </w:r>
+      <w:r>
+        <w:t xml:space="preserve"> </w:t>
+      </w:r>
+      <w:r>
+        <w:rPr>
+          <w:b/>
+          <w:bCs/>
+        </w:rPr>
+        <w:t xml:space="preserve">"Giáo viên yêu cầu sửa …"</w:t>
+      </w:r>
+      <w:r>
+        <w:t xml:space="preserve"> </w:t>
+      </w:r>
+      <w:r>
+        <w:t xml:space="preserve">kèm hạn sửa, lời nhắn và nút</w:t>
+      </w:r>
+      <w:r>
+        <w:t xml:space="preserve"> </w:t>
+      </w:r>
+      <w:r>
+        <w:rPr>
+          <w:b/>
+          <w:bCs/>
+        </w:rPr>
+        <w:t xml:space="preserve">Sửa bài</w:t>
+      </w:r>
+      <w:r>
+        <w:t xml:space="preserve"> </w:t>
+      </w:r>
+      <w:r>
+        <w:t xml:space="preserve">(nếu có);</w:t>
       </w:r>
     </w:p>
     <w:p>
@@ -4960,32 +4809,49 @@
         </w:numPr>
       </w:pPr>
       <w:r>
-        <w:rPr>
-          <w:b/>
-          <w:bCs/>
-        </w:rPr>
-        <w:t xml:space="preserve">Giáo viên</w:t>
-      </w:r>
-      <w:r>
-        <w:t xml:space="preserve"> </w:t>
-      </w:r>
-      <w:r>
-        <w:t xml:space="preserve">(máy A): Lớp học → mở</w:t>
-      </w:r>
-      <w:r>
-        <w:t xml:space="preserve"> </w:t>
-      </w:r>
-      <w:r>
-        <w:rPr>
-          <w:rStyle w:val="VerbatimChar"/>
-        </w:rPr>
-        <w:t xml:space="preserve">DEMO-A</w:t>
-      </w:r>
-      <w:r>
-        <w:t xml:space="preserve"> </w:t>
-      </w:r>
-      <w:r>
-        <w:t xml:space="preserve">→ Import file mẫu đã điền vài sinh viên → xem kết quả, tải file tài khoản.</w:t>
+        <w:t xml:space="preserve">từng phần trong một tab: trạng thái, loại đề, số từ tối thiểu, thời gian gợi ý, hạn nộp / hạn sửa, đề bài + hình,</w:t>
+      </w:r>
+      <w:r>
+        <w:t xml:space="preserve"> </w:t>
+      </w:r>
+      <w:r>
+        <w:rPr>
+          <w:b/>
+          <w:bCs/>
+        </w:rPr>
+        <w:t xml:space="preserve">tiêu chí chấm</w:t>
+      </w:r>
+      <w:r>
+        <w:t xml:space="preserve"> </w:t>
+      </w:r>
+      <w:r>
+        <w:t xml:space="preserve">(mở ra xem checklist, mục "Giới hạn điểm" ghi band tối đa); nút</w:t>
+      </w:r>
+      <w:r>
+        <w:t xml:space="preserve"> </w:t>
+      </w:r>
+      <w:r>
+        <w:rPr>
+          <w:b/>
+          <w:bCs/>
+        </w:rPr>
+        <w:t xml:space="preserve">Làm bài / Viết tiếp / Sửa bài</w:t>
+      </w:r>
+      <w:r>
+        <w:t xml:space="preserve">, hoặc</w:t>
+      </w:r>
+      <w:r>
+        <w:t xml:space="preserve"> </w:t>
+      </w:r>
+      <w:r>
+        <w:rPr>
+          <w:b/>
+          <w:bCs/>
+        </w:rPr>
+        <w:t xml:space="preserve">Xem bài đã nộp</w:t>
+      </w:r>
+      <w:r>
+        <w:t xml:space="preserve">;</w:t>
       </w:r>
     </w:p>
     <w:p>
@@ -4997,79 +4863,17 @@
         </w:numPr>
       </w:pPr>
       <w:r>
-        <w:t xml:space="preserve">Bài tập → mở</w:t>
-      </w:r>
-      <w:r>
-        <w:t xml:space="preserve"> </w:t>
-      </w:r>
-      <w:r>
-        <w:rPr>
-          <w:b/>
-          <w:bCs/>
-        </w:rPr>
-        <w:t xml:space="preserve">"Tuần 2"</w:t>
-      </w:r>
-      <w:r>
-        <w:t xml:space="preserve"> </w:t>
-      </w:r>
-      <w:r>
-        <w:t xml:space="preserve">(nháp) →</w:t>
-      </w:r>
-      <w:r>
-        <w:t xml:space="preserve"> </w:t>
-      </w:r>
-      <w:r>
-        <w:rPr>
-          <w:b/>
-          <w:bCs/>
-        </w:rPr>
-        <w:t xml:space="preserve">Giao bài &amp; phát hành</w:t>
-      </w:r>
-      <w:r>
-        <w:t xml:space="preserve"> </w:t>
-      </w:r>
-      <w:r>
-        <w:t xml:space="preserve">cho lớp</w:t>
-      </w:r>
-      <w:r>
-        <w:t xml:space="preserve"> </w:t>
-      </w:r>
-      <w:r>
-        <w:rPr>
-          <w:rStyle w:val="VerbatimChar"/>
-        </w:rPr>
-        <w:t xml:space="preserve">DEMO-A</w:t>
-      </w:r>
-      <w:r>
-        <w:t xml:space="preserve"> </w:t>
-      </w:r>
-      <w:r>
-        <w:t xml:space="preserve">→ máy B (</w:t>
-      </w:r>
-      <w:r>
-        <w:rPr>
-          <w:rStyle w:val="VerbatimChar"/>
-        </w:rPr>
-        <w:t xml:space="preserve">DEMO001</w:t>
-      </w:r>
-      <w:r>
-        <w:t xml:space="preserve">) thấy</w:t>
-      </w:r>
-      <w:r>
-        <w:t xml:space="preserve"> </w:t>
-      </w:r>
-      <w:r>
-        <w:rPr>
-          <w:b/>
-          <w:bCs/>
-        </w:rPr>
-        <w:t xml:space="preserve">thông báo bật lên ngay</w:t>
-      </w:r>
-      <w:r>
-        <w:t xml:space="preserve"> </w:t>
-      </w:r>
-      <w:r>
-        <w:t xml:space="preserve">và số trên chuông tăng.</w:t>
+        <w:rPr>
+          <w:b/>
+          <w:bCs/>
+        </w:rPr>
+        <w:t xml:space="preserve">Lịch sử nộp</w:t>
+      </w:r>
+      <w:r>
+        <w:t xml:space="preserve"> </w:t>
+      </w:r>
+      <w:r>
+        <w:t xml:space="preserve">của từng phần: mỗi lần nộp, giờ nộp, số từ, nộp muộn, band nếu đã được trả bài (đang chấm thì ghi "Chờ kết quả");</w:t>
       </w:r>
     </w:p>
     <w:p>
@@ -5081,7 +4885,20 @@
         </w:numPr>
       </w:pPr>
       <w:r>
-        <w:t xml:space="preserve">Tắt mạng máy B vài giây (hoặc khởi động lại backend) → thanh vàng "Mất kết nối… đang thử lại" → bật lại → tự kết nối.</w:t>
+        <w:t xml:space="preserve">khung</w:t>
+      </w:r>
+      <w:r>
+        <w:t xml:space="preserve"> </w:t>
+      </w:r>
+      <w:r>
+        <w:rPr>
+          <w:b/>
+          <w:bCs/>
+        </w:rPr>
+        <w:t xml:space="preserve">Kết quả</w:t>
+      </w:r>
+      <w:r>
+        <w:t xml:space="preserve">: band từng phần và band cả bài (chỉ có khi mọi phần đã được trả; Task 2 tính gấp đôi Task 1);</w:t>
       </w:r>
     </w:p>
     <w:p>
@@ -5093,22 +4910,30 @@
         </w:numPr>
       </w:pPr>
       <w:r>
-        <w:t xml:space="preserve">Đăng nhập</w:t>
-      </w:r>
-      <w:r>
-        <w:t xml:space="preserve"> </w:t>
-      </w:r>
-      <w:r>
-        <w:rPr>
-          <w:rStyle w:val="VerbatimChar"/>
-        </w:rPr>
-        <w:t xml:space="preserve">DEMO001</w:t>
-      </w:r>
-      <w:r>
-        <w:t xml:space="preserve"> </w:t>
-      </w:r>
-      <w:r>
-        <w:t xml:space="preserve">ở trình duyệt thứ ba → máy B hiện "Tài khoản vừa đăng nhập ở nơi khác".</w:t>
+        <w:t xml:space="preserve">khung</w:t>
+      </w:r>
+      <w:r>
+        <w:t xml:space="preserve"> </w:t>
+      </w:r>
+      <w:r>
+        <w:rPr>
+          <w:b/>
+          <w:bCs/>
+        </w:rPr>
+        <w:t xml:space="preserve">Thời gian &amp; quy định</w:t>
+      </w:r>
+      <w:r>
+        <w:t xml:space="preserve">: hạn nộp, có cho nộp muộn không, số lần yêu cầu sửa tối đa.</w:t>
+      </w:r>
+    </w:p>
+    <w:bookmarkEnd w:id="28"/>
+    <w:bookmarkStart w:id="29" w:name="Xcdbbb1fe94ded6e0db335b0616309f1ec0255e9"/>
+    <w:p>
+      <w:pPr>
+        <w:pStyle w:val="Heading3"/>
+      </w:pPr>
+      <w:r>
+        <w:t xml:space="preserve">7.3. Làm bài và nộp bài</w:t>
       </w:r>
     </w:p>
     <w:p>
@@ -5116,43 +4941,322 @@
         <w:pStyle w:val="FirstParagraph"/>
       </w:pPr>
       <w:r>
-        <w:t xml:space="preserve">Muốn làm lại từ đầu: xoá dữ liệu (Docker:</w:t>
-      </w:r>
-      <w:r>
-        <w:t xml:space="preserve"> </w:t>
-      </w:r>
-      <w:r>
-        <w:rPr>
-          <w:rStyle w:val="VerbatimChar"/>
-        </w:rPr>
-        <w:t xml:space="preserve">docker compose down -v</w:t>
-      </w:r>
-      <w:r>
-        <w:t xml:space="preserve">; trên máy: xoá và tạo lại DB</w:t>
-      </w:r>
-      <w:r>
-        <w:t xml:space="preserve"> </w:t>
-      </w:r>
-      <w:r>
-        <w:rPr>
-          <w:rStyle w:val="VerbatimChar"/>
-        </w:rPr>
-        <w:t xml:space="preserve">ielts</w:t>
-      </w:r>
-      <w:r>
-        <w:t xml:space="preserve">) rồi khởi động lại với profile</w:t>
-      </w:r>
-      <w:r>
-        <w:t xml:space="preserve"> </w:t>
-      </w:r>
-      <w:r>
-        <w:rPr>
-          <w:rStyle w:val="VerbatimChar"/>
-        </w:rPr>
-        <w:t xml:space="preserve">demo</w:t>
+        <w:t xml:space="preserve">Bấm</w:t>
+      </w:r>
+      <w:r>
+        <w:t xml:space="preserve"> </w:t>
+      </w:r>
+      <w:r>
+        <w:rPr>
+          <w:b/>
+          <w:bCs/>
+        </w:rPr>
+        <w:t xml:space="preserve">Làm bài / Viết tiếp / Sửa bài</w:t>
+      </w:r>
+      <w:r>
+        <w:t xml:space="preserve"> </w:t>
+      </w:r>
+      <w:r>
+        <w:t xml:space="preserve">để mở màn làm bài toàn màn hình. Bài nhiều phần thì chọn phần ở hàng tab trên cùng (tab ghi trạng thái từng phần).</w:t>
+      </w:r>
+    </w:p>
+    <w:p>
+      <w:pPr>
+        <w:pStyle w:val="Compact"/>
+        <w:numPr>
+          <w:ilvl w:val="0"/>
+          <w:numId w:val="1008"/>
+        </w:numPr>
+      </w:pPr>
+      <w:r>
+        <w:rPr>
+          <w:b/>
+          <w:bCs/>
+        </w:rPr>
+        <w:t xml:space="preserve">Bên trái</w:t>
+      </w:r>
+      <w:r>
+        <w:t xml:space="preserve"> </w:t>
+      </w:r>
+      <w:r>
+        <w:t xml:space="preserve">là đề bài (trên điện thoại: bấm</w:t>
+      </w:r>
+      <w:r>
+        <w:t xml:space="preserve"> </w:t>
+      </w:r>
+      <w:r>
+        <w:rPr>
+          <w:b/>
+          <w:bCs/>
+        </w:rPr>
+        <w:t xml:space="preserve">Xem đề bài</w:t>
+      </w:r>
+      <w:r>
+        <w:t xml:space="preserve"> </w:t>
+      </w:r>
+      <w:r>
+        <w:t xml:space="preserve">để mở),</w:t>
+      </w:r>
+      <w:r>
+        <w:t xml:space="preserve"> </w:t>
+      </w:r>
+      <w:r>
+        <w:rPr>
+          <w:b/>
+          <w:bCs/>
+        </w:rPr>
+        <w:t xml:space="preserve">bên phải</w:t>
+      </w:r>
+      <w:r>
+        <w:t xml:space="preserve"> </w:t>
+      </w:r>
+      <w:r>
+        <w:t xml:space="preserve">là ô soạn. Số từ đếm ngay khi gõ (cùng cách đếm với máy chủ): màu cam khi chưa đủ tối thiểu, xanh khi đủ.</w:t>
+      </w:r>
+    </w:p>
+    <w:p>
+      <w:pPr>
+        <w:pStyle w:val="Compact"/>
+        <w:numPr>
+          <w:ilvl w:val="0"/>
+          <w:numId w:val="1008"/>
+        </w:numPr>
+      </w:pPr>
+      <w:r>
+        <w:rPr>
+          <w:b/>
+          <w:bCs/>
+        </w:rPr>
+        <w:t xml:space="preserve">Tự lưu nháp</w:t>
+      </w:r>
+      <w:r>
+        <w:t xml:space="preserve">: ngừng gõ 3 giây, chuyển sang tab khác hoặc đổi phần là bài được lưu; dòng trạng thái ghi "Chưa lưu" → "Đang lưu…" → "Đã lưu lúc hh:mm". Lưu lỗi thì bấm "Lỗi lưu – thử lại". Đóng trang khi còn thay đổi chưa lưu, trình duyệt sẽ hỏi lại.</w:t>
+      </w:r>
+    </w:p>
+    <w:p>
+      <w:pPr>
+        <w:pStyle w:val="Compact"/>
+        <w:numPr>
+          <w:ilvl w:val="0"/>
+          <w:numId w:val="1008"/>
+        </w:numPr>
+      </w:pPr>
+      <w:r>
+        <w:rPr>
+          <w:b/>
+          <w:bCs/>
+        </w:rPr>
+        <w:t xml:space="preserve">Mất mạng khi đang viết</w:t>
+      </w:r>
+      <w:r>
+        <w:t xml:space="preserve">: cứ viết tiếp, bài được giữ trên trình duyệt; dòng trạng thái ghi "Ngoại tuyến – đã lưu trên máy" và nút nộp tạm khoá ("Cần có mạng để nộp bài"). Có mạng lại, bài tự gửi lên máy chủ. Lỡ đóng trang khi chưa gửi được, mở lại màn làm bài trên</w:t>
+      </w:r>
+      <w:r>
+        <w:t xml:space="preserve"> </w:t>
+      </w:r>
+      <w:r>
+        <w:rPr>
+          <w:b/>
+          <w:bCs/>
+        </w:rPr>
+        <w:t xml:space="preserve">cùng trình duyệt</w:t>
+      </w:r>
+      <w:r>
+        <w:t xml:space="preserve"> </w:t>
+      </w:r>
+      <w:r>
+        <w:t xml:space="preserve">thì bài được khôi phục (nếu trong lúc đó bài đã được sửa ở nơi khác, hệ thống hỏi chọn bản).</w:t>
+      </w:r>
+    </w:p>
+    <w:p>
+      <w:pPr>
+        <w:pStyle w:val="Compact"/>
+        <w:numPr>
+          <w:ilvl w:val="0"/>
+          <w:numId w:val="1008"/>
+        </w:numPr>
+      </w:pPr>
+      <w:r>
+        <w:rPr>
+          <w:b/>
+          <w:bCs/>
+        </w:rPr>
+        <w:t xml:space="preserve">Mở cùng bài ở 2 tab / 2 máy</w:t>
+      </w:r>
+      <w:r>
+        <w:t xml:space="preserve">: khi một nơi lưu đè, nơi kia hiện hộp thoại cho xem cả hai bản (kèm số từ) để chọn</w:t>
+      </w:r>
+      <w:r>
+        <w:t xml:space="preserve"> </w:t>
+      </w:r>
+      <w:r>
+        <w:rPr>
+          <w:b/>
+          <w:bCs/>
+        </w:rPr>
+        <w:t xml:space="preserve">Dùng bản trên máy này</w:t>
+      </w:r>
+      <w:r>
+        <w:t xml:space="preserve"> </w:t>
+      </w:r>
+      <w:r>
+        <w:t xml:space="preserve">hoặc</w:t>
+      </w:r>
+      <w:r>
+        <w:t xml:space="preserve"> </w:t>
+      </w:r>
+      <w:r>
+        <w:rPr>
+          <w:b/>
+          <w:bCs/>
+        </w:rPr>
+        <w:t xml:space="preserve">Dùng bản trên máy chủ</w:t>
       </w:r>
       <w:r>
         <w:t xml:space="preserve">.</w:t>
+      </w:r>
+    </w:p>
+    <w:p>
+      <w:pPr>
+        <w:pStyle w:val="Compact"/>
+        <w:numPr>
+          <w:ilvl w:val="0"/>
+          <w:numId w:val="1008"/>
+        </w:numPr>
+      </w:pPr>
+      <w:r>
+        <w:rPr>
+          <w:b/>
+          <w:bCs/>
+        </w:rPr>
+        <w:t xml:space="preserve">Nộp</w:t>
+      </w:r>
+      <w:r>
+        <w:t xml:space="preserve">: bấm</w:t>
+      </w:r>
+      <w:r>
+        <w:t xml:space="preserve"> </w:t>
+      </w:r>
+      <w:r>
+        <w:rPr>
+          <w:b/>
+          <w:bCs/>
+        </w:rPr>
+        <w:t xml:space="preserve">Nộp phần này</w:t>
+      </w:r>
+      <w:r>
+        <w:t xml:space="preserve"> </w:t>
+      </w:r>
+      <w:r>
+        <w:t xml:space="preserve">(đang "Cần sửa":</w:t>
+      </w:r>
+      <w:r>
+        <w:t xml:space="preserve"> </w:t>
+      </w:r>
+      <w:r>
+        <w:rPr>
+          <w:b/>
+          <w:bCs/>
+        </w:rPr>
+        <w:t xml:space="preserve">Nộp bản sửa</w:t>
+      </w:r>
+      <w:r>
+        <w:t xml:space="preserve">). Bài ít hơn số từ tối thiểu thì hệ thống hỏi lại ("Viết tiếp" / "Vẫn nộp"). Nộp xong ô soạn chuyển sang chỉ đọc kèm giờ nộp; nộp sau hạn (khi bài cho phép) được ghi là</w:t>
+      </w:r>
+      <w:r>
+        <w:t xml:space="preserve"> </w:t>
+      </w:r>
+      <w:r>
+        <w:rPr>
+          <w:b/>
+          <w:bCs/>
+        </w:rPr>
+        <w:t xml:space="preserve">nộp muộn</w:t>
+      </w:r>
+      <w:r>
+        <w:t xml:space="preserve">.</w:t>
+      </w:r>
+    </w:p>
+    <w:p>
+      <w:pPr>
+        <w:pStyle w:val="Compact"/>
+        <w:numPr>
+          <w:ilvl w:val="0"/>
+          <w:numId w:val="1008"/>
+        </w:numPr>
+      </w:pPr>
+      <w:r>
+        <w:rPr>
+          <w:b/>
+          <w:bCs/>
+        </w:rPr>
+        <w:t xml:space="preserve">Đồng hồ đếm ngược</w:t>
+      </w:r>
+      <w:r>
+        <w:t xml:space="preserve"> </w:t>
+      </w:r>
+      <w:r>
+        <w:t xml:space="preserve">theo giờ máy chủ (tự đồng bộ 5 phút một lần). Quá hạn mà bài không cho nộp muộn, hoặc bài đã đóng, thì ô soạn khoá lại và ghi lý do.</w:t>
+      </w:r>
+    </w:p>
+    <w:bookmarkEnd w:id="29"/>
+    <w:bookmarkStart w:id="30" w:name="X3b2aee35a6458aa45263b9eff75cd6a1e1138d6"/>
+    <w:p>
+      <w:pPr>
+        <w:pStyle w:val="Heading3"/>
+      </w:pPr>
+      <w:r>
+        <w:t xml:space="preserve">7.4. Đang làm</w:t>
+      </w:r>
+    </w:p>
+    <w:p>
+      <w:pPr>
+        <w:pStyle w:val="FirstParagraph"/>
+      </w:pPr>
+      <w:r>
+        <w:rPr>
+          <w:b/>
+          <w:bCs/>
+        </w:rPr>
+        <w:t xml:space="preserve">Xem kết quả chi tiết</w:t>
+      </w:r>
+      <w:r>
+        <w:t xml:space="preserve"> </w:t>
+      </w:r>
+      <w:r>
+        <w:t xml:space="preserve">(nhận xét trên bài, mã lỗi, so sánh các lần nộp),</w:t>
+      </w:r>
+      <w:r>
+        <w:t xml:space="preserve"> </w:t>
+      </w:r>
+      <w:r>
+        <w:rPr>
+          <w:b/>
+          <w:bCs/>
+        </w:rPr>
+        <w:t xml:space="preserve">kết quả học tập</w:t>
+      </w:r>
+      <w:r>
+        <w:t xml:space="preserve"> </w:t>
+      </w:r>
+      <w:r>
+        <w:t xml:space="preserve">và</w:t>
+      </w:r>
+      <w:r>
+        <w:t xml:space="preserve"> </w:t>
+      </w:r>
+      <w:r>
+        <w:rPr>
+          <w:b/>
+          <w:bCs/>
+        </w:rPr>
+        <w:t xml:space="preserve">trao đổi</w:t>
+      </w:r>
+      <w:r>
+        <w:t xml:space="preserve"> </w:t>
+      </w:r>
+      <w:r>
+        <w:t xml:space="preserve">sẽ có ở các bước tiếp theo.</w:t>
       </w:r>
     </w:p>
     <w:p>
@@ -5162,8 +5266,293 @@
         </w:pict>
       </w:r>
     </w:p>
+    <w:bookmarkEnd w:id="30"/>
     <w:bookmarkEnd w:id="31"/>
-    <w:bookmarkStart w:id="32" w:name="X2aaa61dde1ecd98f080cbe2f0cfb81c5163d5ab"/>
+    <w:bookmarkStart w:id="32" w:name="X27a74f3cf0506426a1a76b4e73d04f5d967bbd0"/>
+    <w:p>
+      <w:pPr>
+        <w:pStyle w:val="Heading2"/>
+      </w:pPr>
+      <w:r>
+        <w:t xml:space="preserve">8. Kịch bản demo gợi ý (~10 phút)</w:t>
+      </w:r>
+    </w:p>
+    <w:p>
+      <w:pPr>
+        <w:pStyle w:val="FirstParagraph"/>
+      </w:pPr>
+      <w:r>
+        <w:t xml:space="preserve">Mở hai trình duyệt (hoặc một cửa sổ ẩn danh): máy A đăng nhập</w:t>
+      </w:r>
+      <w:r>
+        <w:t xml:space="preserve"> </w:t>
+      </w:r>
+      <w:r>
+        <w:rPr>
+          <w:rStyle w:val="VerbatimChar"/>
+        </w:rPr>
+        <w:t xml:space="preserve">gv.demo</w:t>
+      </w:r>
+      <w:r>
+        <w:t xml:space="preserve">, máy B đăng nhập</w:t>
+      </w:r>
+      <w:r>
+        <w:t xml:space="preserve"> </w:t>
+      </w:r>
+      <w:r>
+        <w:rPr>
+          <w:rStyle w:val="VerbatimChar"/>
+        </w:rPr>
+        <w:t xml:space="preserve">DEMO001</w:t>
+      </w:r>
+      <w:r>
+        <w:t xml:space="preserve">.</w:t>
+      </w:r>
+    </w:p>
+    <w:p>
+      <w:pPr>
+        <w:pStyle w:val="Compact"/>
+        <w:numPr>
+          <w:ilvl w:val="0"/>
+          <w:numId w:val="1009"/>
+        </w:numPr>
+      </w:pPr>
+      <w:r>
+        <w:rPr>
+          <w:b/>
+          <w:bCs/>
+        </w:rPr>
+        <w:t xml:space="preserve">Admin</w:t>
+      </w:r>
+      <w:r>
+        <w:t xml:space="preserve"> </w:t>
+      </w:r>
+      <w:r>
+        <w:t xml:space="preserve">(</w:t>
+      </w:r>
+      <w:r>
+        <w:rPr>
+          <w:rStyle w:val="VerbatimChar"/>
+        </w:rPr>
+        <w:t xml:space="preserve">admin</w:t>
+      </w:r>
+      <w:r>
+        <w:t xml:space="preserve">): Tổng quan → Giáo viên → thêm một giáo viên, xem mật khẩu tạm hiện một lần → Nhật ký thấy dòng "Tạo giáo viên".</w:t>
+      </w:r>
+    </w:p>
+    <w:p>
+      <w:pPr>
+        <w:pStyle w:val="Compact"/>
+        <w:numPr>
+          <w:ilvl w:val="0"/>
+          <w:numId w:val="1009"/>
+        </w:numPr>
+      </w:pPr>
+      <w:r>
+        <w:rPr>
+          <w:b/>
+          <w:bCs/>
+        </w:rPr>
+        <w:t xml:space="preserve">Giáo viên</w:t>
+      </w:r>
+      <w:r>
+        <w:t xml:space="preserve"> </w:t>
+      </w:r>
+      <w:r>
+        <w:t xml:space="preserve">(máy A): Lớp học → mở</w:t>
+      </w:r>
+      <w:r>
+        <w:t xml:space="preserve"> </w:t>
+      </w:r>
+      <w:r>
+        <w:rPr>
+          <w:rStyle w:val="VerbatimChar"/>
+        </w:rPr>
+        <w:t xml:space="preserve">DEMO-A</w:t>
+      </w:r>
+      <w:r>
+        <w:t xml:space="preserve"> </w:t>
+      </w:r>
+      <w:r>
+        <w:t xml:space="preserve">→ Import file mẫu đã điền vài sinh viên → xem kết quả, tải file tài khoản.</w:t>
+      </w:r>
+    </w:p>
+    <w:p>
+      <w:pPr>
+        <w:pStyle w:val="Compact"/>
+        <w:numPr>
+          <w:ilvl w:val="0"/>
+          <w:numId w:val="1009"/>
+        </w:numPr>
+      </w:pPr>
+      <w:r>
+        <w:t xml:space="preserve">Bài tập → mở</w:t>
+      </w:r>
+      <w:r>
+        <w:t xml:space="preserve"> </w:t>
+      </w:r>
+      <w:r>
+        <w:rPr>
+          <w:b/>
+          <w:bCs/>
+        </w:rPr>
+        <w:t xml:space="preserve">"Tuần 2"</w:t>
+      </w:r>
+      <w:r>
+        <w:t xml:space="preserve"> </w:t>
+      </w:r>
+      <w:r>
+        <w:t xml:space="preserve">(nháp) →</w:t>
+      </w:r>
+      <w:r>
+        <w:t xml:space="preserve"> </w:t>
+      </w:r>
+      <w:r>
+        <w:rPr>
+          <w:b/>
+          <w:bCs/>
+        </w:rPr>
+        <w:t xml:space="preserve">Giao bài &amp; phát hành</w:t>
+      </w:r>
+      <w:r>
+        <w:t xml:space="preserve"> </w:t>
+      </w:r>
+      <w:r>
+        <w:t xml:space="preserve">cho lớp</w:t>
+      </w:r>
+      <w:r>
+        <w:t xml:space="preserve"> </w:t>
+      </w:r>
+      <w:r>
+        <w:rPr>
+          <w:rStyle w:val="VerbatimChar"/>
+        </w:rPr>
+        <w:t xml:space="preserve">DEMO-A</w:t>
+      </w:r>
+      <w:r>
+        <w:t xml:space="preserve"> </w:t>
+      </w:r>
+      <w:r>
+        <w:t xml:space="preserve">→ máy B (</w:t>
+      </w:r>
+      <w:r>
+        <w:rPr>
+          <w:rStyle w:val="VerbatimChar"/>
+        </w:rPr>
+        <w:t xml:space="preserve">DEMO001</w:t>
+      </w:r>
+      <w:r>
+        <w:t xml:space="preserve">) thấy</w:t>
+      </w:r>
+      <w:r>
+        <w:t xml:space="preserve"> </w:t>
+      </w:r>
+      <w:r>
+        <w:rPr>
+          <w:b/>
+          <w:bCs/>
+        </w:rPr>
+        <w:t xml:space="preserve">thông báo bật lên ngay</w:t>
+      </w:r>
+      <w:r>
+        <w:t xml:space="preserve"> </w:t>
+      </w:r>
+      <w:r>
+        <w:t xml:space="preserve">và số trên chuông tăng.</w:t>
+      </w:r>
+    </w:p>
+    <w:p>
+      <w:pPr>
+        <w:pStyle w:val="Compact"/>
+        <w:numPr>
+          <w:ilvl w:val="0"/>
+          <w:numId w:val="1009"/>
+        </w:numPr>
+      </w:pPr>
+      <w:r>
+        <w:t xml:space="preserve">Tắt mạng máy B vài giây (hoặc khởi động lại backend) → thanh vàng "Mất kết nối… đang thử lại" → bật lại → tự kết nối.</w:t>
+      </w:r>
+    </w:p>
+    <w:p>
+      <w:pPr>
+        <w:pStyle w:val="Compact"/>
+        <w:numPr>
+          <w:ilvl w:val="0"/>
+          <w:numId w:val="1009"/>
+        </w:numPr>
+      </w:pPr>
+      <w:r>
+        <w:t xml:space="preserve">Đăng nhập</w:t>
+      </w:r>
+      <w:r>
+        <w:t xml:space="preserve"> </w:t>
+      </w:r>
+      <w:r>
+        <w:rPr>
+          <w:rStyle w:val="VerbatimChar"/>
+        </w:rPr>
+        <w:t xml:space="preserve">DEMO001</w:t>
+      </w:r>
+      <w:r>
+        <w:t xml:space="preserve"> </w:t>
+      </w:r>
+      <w:r>
+        <w:t xml:space="preserve">ở trình duyệt thứ ba → máy B hiện "Tài khoản vừa đăng nhập ở nơi khác".</w:t>
+      </w:r>
+    </w:p>
+    <w:p>
+      <w:pPr>
+        <w:pStyle w:val="FirstParagraph"/>
+      </w:pPr>
+      <w:r>
+        <w:t xml:space="preserve">Muốn làm lại từ đầu: xoá dữ liệu (Docker:</w:t>
+      </w:r>
+      <w:r>
+        <w:t xml:space="preserve"> </w:t>
+      </w:r>
+      <w:r>
+        <w:rPr>
+          <w:rStyle w:val="VerbatimChar"/>
+        </w:rPr>
+        <w:t xml:space="preserve">docker compose down -v</w:t>
+      </w:r>
+      <w:r>
+        <w:t xml:space="preserve">; trên máy: xoá và tạo lại DB</w:t>
+      </w:r>
+      <w:r>
+        <w:t xml:space="preserve"> </w:t>
+      </w:r>
+      <w:r>
+        <w:rPr>
+          <w:rStyle w:val="VerbatimChar"/>
+        </w:rPr>
+        <w:t xml:space="preserve">ielts</w:t>
+      </w:r>
+      <w:r>
+        <w:t xml:space="preserve">) rồi khởi động lại với profile</w:t>
+      </w:r>
+      <w:r>
+        <w:t xml:space="preserve"> </w:t>
+      </w:r>
+      <w:r>
+        <w:rPr>
+          <w:rStyle w:val="VerbatimChar"/>
+        </w:rPr>
+        <w:t xml:space="preserve">demo</w:t>
+      </w:r>
+      <w:r>
+        <w:t xml:space="preserve">.</w:t>
+      </w:r>
+    </w:p>
+    <w:p>
+      <w:r>
+        <w:pict>
+          <v:rect style="width:0;height:1.5pt" o:hralign="center" o:hrstd="t" o:hr="t"/>
+        </w:pict>
+      </w:r>
+    </w:p>
+    <w:bookmarkEnd w:id="32"/>
+    <w:bookmarkStart w:id="33" w:name="X2aaa61dde1ecd98f080cbe2f0cfb81c5163d5ab"/>
     <w:p>
       <w:pPr>
         <w:pStyle w:val="Heading2"/>
@@ -5514,8 +5903,8 @@
         </w:tc>
       </w:tr>
     </w:tbl>
-    <w:bookmarkEnd w:id="32"/>
     <w:bookmarkEnd w:id="33"/>
+    <w:bookmarkEnd w:id="34"/>
     <w:sectPr>
       <w:footnotePr>
         <w:numRestart w:val="eachSect"/>
@@ -5857,12 +6246,45 @@
     <w:abstractNumId w:val="991"/>
   </w:num>
   <w:num w:numId="1005">
-    <w:abstractNumId w:val="991"/>
+    <w:abstractNumId w:val="99411"/>
+    <w:lvlOverride w:ilvl="0">
+      <w:startOverride w:val="1"/>
+    </w:lvlOverride>
+    <w:lvlOverride w:ilvl="1">
+      <w:startOverride w:val="1"/>
+    </w:lvlOverride>
+    <w:lvlOverride w:ilvl="2">
+      <w:startOverride w:val="1"/>
+    </w:lvlOverride>
+    <w:lvlOverride w:ilvl="3">
+      <w:startOverride w:val="1"/>
+    </w:lvlOverride>
+    <w:lvlOverride w:ilvl="4">
+      <w:startOverride w:val="1"/>
+    </w:lvlOverride>
+    <w:lvlOverride w:ilvl="5">
+      <w:startOverride w:val="1"/>
+    </w:lvlOverride>
+    <w:lvlOverride w:ilvl="6">
+      <w:startOverride w:val="1"/>
+    </w:lvlOverride>
+    <w:lvlOverride w:ilvl="7">
+      <w:startOverride w:val="1"/>
+    </w:lvlOverride>
+    <w:lvlOverride w:ilvl="8">
+      <w:startOverride w:val="1"/>
+    </w:lvlOverride>
   </w:num>
   <w:num w:numId="1006">
     <w:abstractNumId w:val="991"/>
   </w:num>
   <w:num w:numId="1007">
+    <w:abstractNumId w:val="991"/>
+  </w:num>
+  <w:num w:numId="1008">
+    <w:abstractNumId w:val="991"/>
+  </w:num>
+  <w:num w:numId="1009">
     <w:abstractNumId w:val="99411"/>
     <w:lvlOverride w:ilvl="0">
       <w:startOverride w:val="1"/>

</xml_diff>

<commit_message>
Module giao bài và chấm bài: đánh dấu trên bài (lỗi / lưu ý / dùng hay), so sánh hai lần nộp
</commit_message>
<xml_diff>
--- a/docx/10-huong-dan-su-dung.docx
+++ b/docx/10-huong-dan-su-dung.docx
@@ -28,7 +28,7 @@
         </w:p>
       </w:sdtContent>
     </w:sdt>
-    <w:bookmarkStart w:id="35" w:name="X62b689528c743ccb8c3229542497059f4aa59b0"/>
+    <w:bookmarkStart w:id="34" w:name="X62b689528c743ccb8c3229542497059f4aa59b0"/>
     <w:p>
       <w:pPr>
         <w:pStyle w:val="Heading1"/>
@@ -290,7 +290,7 @@
               <w:pStyle w:val="Compact"/>
             </w:pPr>
             <w:r>
-              <w:t xml:space="preserve">Sinh viên: bài được giao, chi tiết bài, lịch sử nộp, làm bài (cả khi mất mạng), nộp bài, kết quả từng phần + so sánh các lần nộp</w:t>
+              <w:t xml:space="preserve">Sinh viên: bài được giao, chi tiết bài, lịch sử nộp, làm bài (cả khi mất mạng), nộp bài</w:t>
             </w:r>
           </w:p>
         </w:tc>
@@ -322,7 +322,7 @@
               <w:pStyle w:val="Compact"/>
             </w:pPr>
             <w:r>
-              <w:t xml:space="preserve">Sinh viên: kết quả học tập, trao đổi</w:t>
+              <w:t xml:space="preserve">Sinh viên: xem kết quả chi tiết, kết quả học tập, trao đổi</w:t>
             </w:r>
           </w:p>
         </w:tc>
@@ -4920,7 +4920,7 @@
     </w:p>
     <w:bookmarkEnd w:id="25"/>
     <w:bookmarkEnd w:id="26"/>
-    <w:bookmarkStart w:id="32" w:name="Xa4980557fe2b16e9ea1555bbc3e255ac8d44acd"/>
+    <w:bookmarkStart w:id="31" w:name="Xa4980557fe2b16e9ea1555bbc3e255ac8d44acd"/>
     <w:p>
       <w:pPr>
         <w:pStyle w:val="Heading2"/>
@@ -5705,13 +5705,13 @@
       </w:r>
     </w:p>
     <w:bookmarkEnd w:id="29"/>
-    <w:bookmarkStart w:id="30" w:name="X36c870cc6791c2cf75eef469404e0415cfcff36"/>
+    <w:bookmarkStart w:id="30" w:name="X3b2aee35a6458aa45263b9eff75cd6a1e1138d6"/>
     <w:p>
       <w:pPr>
         <w:pStyle w:val="Heading3"/>
       </w:pPr>
       <w:r>
-        <w:t xml:space="preserve">7.4. Kết quả từng phần</w:t>
+        <w:t xml:space="preserve">7.4. Đang làm</w:t>
       </w:r>
     </w:p>
     <w:p>
@@ -5719,36 +5719,99 @@
         <w:pStyle w:val="FirstParagraph"/>
       </w:pPr>
       <w:r>
-        <w:t xml:space="preserve">Mở từ nút</w:t>
-      </w:r>
-      <w:r>
-        <w:t xml:space="preserve"> </w:t>
-      </w:r>
-      <w:r>
-        <w:rPr>
-          <w:b/>
-          <w:bCs/>
-        </w:rPr>
-        <w:t xml:space="preserve">Xem kết quả</w:t>
-      </w:r>
-      <w:r>
-        <w:t xml:space="preserve"> </w:t>
-      </w:r>
-      <w:r>
-        <w:t xml:space="preserve">ở chi tiết bài / màn làm bài, hoặc bấm một lần nộp trong</w:t>
-      </w:r>
-      <w:r>
-        <w:t xml:space="preserve"> </w:t>
-      </w:r>
-      <w:r>
-        <w:rPr>
-          <w:b/>
-          <w:bCs/>
-        </w:rPr>
-        <w:t xml:space="preserve">Lịch sử nộp</w:t>
-      </w:r>
-      <w:r>
-        <w:t xml:space="preserve">. Mặc định hiện lần nộp gần nhất đã được trả; ô chọn ở góc phải để xem lần khác (lần chưa trả ghi "chờ kết quả").</w:t>
+        <w:rPr>
+          <w:b/>
+          <w:bCs/>
+        </w:rPr>
+        <w:t xml:space="preserve">Xem kết quả chi tiết</w:t>
+      </w:r>
+      <w:r>
+        <w:t xml:space="preserve"> </w:t>
+      </w:r>
+      <w:r>
+        <w:t xml:space="preserve">(band từng tiêu chí, so sánh các lần nộp),</w:t>
+      </w:r>
+      <w:r>
+        <w:t xml:space="preserve"> </w:t>
+      </w:r>
+      <w:r>
+        <w:rPr>
+          <w:b/>
+          <w:bCs/>
+        </w:rPr>
+        <w:t xml:space="preserve">kết quả học tập</w:t>
+      </w:r>
+      <w:r>
+        <w:t xml:space="preserve"> </w:t>
+      </w:r>
+      <w:r>
+        <w:t xml:space="preserve">và</w:t>
+      </w:r>
+      <w:r>
+        <w:t xml:space="preserve"> </w:t>
+      </w:r>
+      <w:r>
+        <w:rPr>
+          <w:b/>
+          <w:bCs/>
+        </w:rPr>
+        <w:t xml:space="preserve">trao đổi</w:t>
+      </w:r>
+      <w:r>
+        <w:t xml:space="preserve"> </w:t>
+      </w:r>
+      <w:r>
+        <w:t xml:space="preserve">sẽ có ở các bước tiếp theo.</w:t>
+      </w:r>
+    </w:p>
+    <w:p>
+      <w:r>
+        <w:pict>
+          <v:rect style="width:0;height:1.5pt" o:hralign="center" o:hrstd="t" o:hr="t"/>
+        </w:pict>
+      </w:r>
+    </w:p>
+    <w:bookmarkEnd w:id="30"/>
+    <w:bookmarkEnd w:id="31"/>
+    <w:bookmarkStart w:id="32" w:name="X27a74f3cf0506426a1a76b4e73d04f5d967bbd0"/>
+    <w:p>
+      <w:pPr>
+        <w:pStyle w:val="Heading2"/>
+      </w:pPr>
+      <w:r>
+        <w:t xml:space="preserve">8. Kịch bản demo gợi ý (~10 phút)</w:t>
+      </w:r>
+    </w:p>
+    <w:p>
+      <w:pPr>
+        <w:pStyle w:val="FirstParagraph"/>
+      </w:pPr>
+      <w:r>
+        <w:t xml:space="preserve">Mở hai trình duyệt (hoặc một cửa sổ ẩn danh): máy A đăng nhập</w:t>
+      </w:r>
+      <w:r>
+        <w:t xml:space="preserve"> </w:t>
+      </w:r>
+      <w:r>
+        <w:rPr>
+          <w:rStyle w:val="VerbatimChar"/>
+        </w:rPr>
+        <w:t xml:space="preserve">gv.demo</w:t>
+      </w:r>
+      <w:r>
+        <w:t xml:space="preserve">, máy B đăng nhập</w:t>
+      </w:r>
+      <w:r>
+        <w:t xml:space="preserve"> </w:t>
+      </w:r>
+      <w:r>
+        <w:rPr>
+          <w:rStyle w:val="VerbatimChar"/>
+        </w:rPr>
+        <w:t xml:space="preserve">DEMO001</w:t>
+      </w:r>
+      <w:r>
+        <w:t xml:space="preserve">.</w:t>
       </w:r>
     </w:p>
     <w:p>
@@ -5764,39 +5827,22 @@
           <w:b/>
           <w:bCs/>
         </w:rPr>
-        <w:t xml:space="preserve">Đầu trang</w:t>
-      </w:r>
-      <w:r>
-        <w:t xml:space="preserve">: band của lần nộp và mức (vd 6.0 · Khá), giờ trả bài. Đang</w:t>
-      </w:r>
-      <w:r>
-        <w:t xml:space="preserve"> </w:t>
-      </w:r>
-      <w:r>
-        <w:rPr>
-          <w:b/>
-          <w:bCs/>
-        </w:rPr>
-        <w:t xml:space="preserve">Cần sửa</w:t>
-      </w:r>
-      <w:r>
-        <w:t xml:space="preserve"> </w:t>
-      </w:r>
-      <w:r>
-        <w:t xml:space="preserve">thì có khung đỏ (hạn sửa, lời nhắn, nút</w:t>
-      </w:r>
-      <w:r>
-        <w:t xml:space="preserve"> </w:t>
-      </w:r>
-      <w:r>
-        <w:rPr>
-          <w:b/>
-          <w:bCs/>
-        </w:rPr>
-        <w:t xml:space="preserve">Sửa bài</w:t>
-      </w:r>
-      <w:r>
-        <w:t xml:space="preserve">) và ghi chú "Gợi ý sửa sẽ hiện sau khi bạn nộp bản sửa".</w:t>
+        <w:t xml:space="preserve">Admin</w:t>
+      </w:r>
+      <w:r>
+        <w:t xml:space="preserve"> </w:t>
+      </w:r>
+      <w:r>
+        <w:t xml:space="preserve">(</w:t>
+      </w:r>
+      <w:r>
+        <w:rPr>
+          <w:rStyle w:val="VerbatimChar"/>
+        </w:rPr>
+        <w:t xml:space="preserve">admin</w:t>
+      </w:r>
+      <w:r>
+        <w:t xml:space="preserve">): Tổng quan → Giáo viên → thêm một giáo viên, xem mật khẩu tạm hiện một lần → Nhật ký thấy dòng "Tạo giáo viên".</w:t>
       </w:r>
     </w:p>
     <w:p>
@@ -5812,26 +5858,28 @@
           <w:b/>
           <w:bCs/>
         </w:rPr>
-        <w:t xml:space="preserve">Bên trái</w:t>
-      </w:r>
-      <w:r>
-        <w:t xml:space="preserve">: bài viết kèm đánh dấu của giáo viên (như mục 7.3) và bảng</w:t>
-      </w:r>
-      <w:r>
-        <w:t xml:space="preserve"> </w:t>
-      </w:r>
-      <w:r>
-        <w:rPr>
-          <w:b/>
-          <w:bCs/>
-        </w:rPr>
-        <w:t xml:space="preserve">Lỗi trong bài</w:t>
-      </w:r>
-      <w:r>
-        <w:t xml:space="preserve"> </w:t>
-      </w:r>
-      <w:r>
-        <w:t xml:space="preserve">(mã lỗi, số lần).</w:t>
+        <w:t xml:space="preserve">Giáo viên</w:t>
+      </w:r>
+      <w:r>
+        <w:t xml:space="preserve"> </w:t>
+      </w:r>
+      <w:r>
+        <w:t xml:space="preserve">(máy A): Lớp học → mở</w:t>
+      </w:r>
+      <w:r>
+        <w:t xml:space="preserve"> </w:t>
+      </w:r>
+      <w:r>
+        <w:rPr>
+          <w:rStyle w:val="VerbatimChar"/>
+        </w:rPr>
+        <w:t xml:space="preserve">DEMO-A</w:t>
+      </w:r>
+      <w:r>
+        <w:t xml:space="preserve"> </w:t>
+      </w:r>
+      <w:r>
+        <w:t xml:space="preserve">→ Import file mẫu đã điền vài sinh viên → xem kết quả, tải file tài khoản.</w:t>
       </w:r>
     </w:p>
     <w:p>
@@ -5843,14 +5891,79 @@
         </w:numPr>
       </w:pPr>
       <w:r>
-        <w:rPr>
-          <w:b/>
-          <w:bCs/>
-        </w:rPr>
-        <w:t xml:space="preserve">Bên phải</w:t>
-      </w:r>
-      <w:r>
-        <w:t xml:space="preserve">: từng tiêu chí với điểm, nhận xét, checklist (● đạt, ○ chưa đạt, ● cam = điểm yếu làm giới hạn điểm) và lý do bị giới hạn điểm nếu có; cuối cùng là nhận xét chung.</w:t>
+        <w:t xml:space="preserve">Bài tập → mở</w:t>
+      </w:r>
+      <w:r>
+        <w:t xml:space="preserve"> </w:t>
+      </w:r>
+      <w:r>
+        <w:rPr>
+          <w:b/>
+          <w:bCs/>
+        </w:rPr>
+        <w:t xml:space="preserve">"Tuần 2"</w:t>
+      </w:r>
+      <w:r>
+        <w:t xml:space="preserve"> </w:t>
+      </w:r>
+      <w:r>
+        <w:t xml:space="preserve">(nháp) →</w:t>
+      </w:r>
+      <w:r>
+        <w:t xml:space="preserve"> </w:t>
+      </w:r>
+      <w:r>
+        <w:rPr>
+          <w:b/>
+          <w:bCs/>
+        </w:rPr>
+        <w:t xml:space="preserve">Giao bài &amp; phát hành</w:t>
+      </w:r>
+      <w:r>
+        <w:t xml:space="preserve"> </w:t>
+      </w:r>
+      <w:r>
+        <w:t xml:space="preserve">cho lớp</w:t>
+      </w:r>
+      <w:r>
+        <w:t xml:space="preserve"> </w:t>
+      </w:r>
+      <w:r>
+        <w:rPr>
+          <w:rStyle w:val="VerbatimChar"/>
+        </w:rPr>
+        <w:t xml:space="preserve">DEMO-A</w:t>
+      </w:r>
+      <w:r>
+        <w:t xml:space="preserve"> </w:t>
+      </w:r>
+      <w:r>
+        <w:t xml:space="preserve">→ máy B (</w:t>
+      </w:r>
+      <w:r>
+        <w:rPr>
+          <w:rStyle w:val="VerbatimChar"/>
+        </w:rPr>
+        <w:t xml:space="preserve">DEMO001</w:t>
+      </w:r>
+      <w:r>
+        <w:t xml:space="preserve">) thấy</w:t>
+      </w:r>
+      <w:r>
+        <w:t xml:space="preserve"> </w:t>
+      </w:r>
+      <w:r>
+        <w:rPr>
+          <w:b/>
+          <w:bCs/>
+        </w:rPr>
+        <w:t xml:space="preserve">thông báo bật lên ngay</w:t>
+      </w:r>
+      <w:r>
+        <w:t xml:space="preserve"> </w:t>
+      </w:r>
+      <w:r>
+        <w:t xml:space="preserve">và số trên chuông tăng.</w:t>
       </w:r>
     </w:p>
     <w:p>
@@ -5862,75 +5975,34 @@
         </w:numPr>
       </w:pPr>
       <w:r>
-        <w:rPr>
-          <w:b/>
-          <w:bCs/>
-        </w:rPr>
-        <w:t xml:space="preserve">So sánh các lần nộp</w:t>
-      </w:r>
-      <w:r>
-        <w:t xml:space="preserve"> </w:t>
-      </w:r>
-      <w:r>
-        <w:t xml:space="preserve">(khi đã nộp từ 2 lần): chọn lần cũ, xem</w:t>
-      </w:r>
-      <w:r>
-        <w:t xml:space="preserve"> </w:t>
-      </w:r>
-      <w:r>
-        <w:rPr>
-          <w:b/>
-          <w:bCs/>
-        </w:rPr>
-        <w:t xml:space="preserve">Gộp</w:t>
-      </w:r>
-      <w:r>
-        <w:t xml:space="preserve"> </w:t>
-      </w:r>
-      <w:r>
-        <w:t xml:space="preserve">hoặc</w:t>
-      </w:r>
-      <w:r>
-        <w:t xml:space="preserve"> </w:t>
-      </w:r>
-      <w:r>
-        <w:rPr>
-          <w:b/>
-          <w:bCs/>
-        </w:rPr>
-        <w:t xml:space="preserve">Song song</w:t>
-      </w:r>
-      <w:r>
-        <w:t xml:space="preserve"> </w:t>
-      </w:r>
-      <w:r>
-        <w:t xml:space="preserve">— chữ bỏ đi gạch ngang nền đỏ, chữ thêm nền xanh. Bên dưới là</w:t>
-      </w:r>
-      <w:r>
-        <w:t xml:space="preserve"> </w:t>
-      </w:r>
-      <w:r>
-        <w:rPr>
-          <w:b/>
-          <w:bCs/>
-        </w:rPr>
-        <w:t xml:space="preserve">"Đã sửa X/Y lỗi của lần N"</w:t>
-      </w:r>
-      <w:r>
-        <w:t xml:space="preserve"> </w:t>
-      </w:r>
-      <w:r>
-        <w:t xml:space="preserve">và từng lỗi của lần cũ: đánh giá của giáo viên, hoặc "(tự đoán)" khi giáo viên chưa đánh giá. Bấm một lỗi để thấy đoạn đó trên bài cũ.</w:t>
-      </w:r>
-    </w:p>
-    <w:bookmarkEnd w:id="30"/>
-    <w:bookmarkStart w:id="31" w:name="X6726a65495af199a8816c8c0d960edd0fa1a7a0"/>
-    <w:p>
-      <w:pPr>
-        <w:pStyle w:val="Heading3"/>
-      </w:pPr>
-      <w:r>
-        <w:t xml:space="preserve">7.5. Đang làm</w:t>
+        <w:t xml:space="preserve">Tắt mạng máy B vài giây (hoặc khởi động lại backend) → thanh vàng "Mất kết nối… đang thử lại" → bật lại → tự kết nối.</w:t>
+      </w:r>
+    </w:p>
+    <w:p>
+      <w:pPr>
+        <w:pStyle w:val="Compact"/>
+        <w:numPr>
+          <w:ilvl w:val="0"/>
+          <w:numId w:val="1010"/>
+        </w:numPr>
+      </w:pPr>
+      <w:r>
+        <w:t xml:space="preserve">Đăng nhập</w:t>
+      </w:r>
+      <w:r>
+        <w:t xml:space="preserve"> </w:t>
+      </w:r>
+      <w:r>
+        <w:rPr>
+          <w:rStyle w:val="VerbatimChar"/>
+        </w:rPr>
+        <w:t xml:space="preserve">DEMO001</w:t>
+      </w:r>
+      <w:r>
+        <w:t xml:space="preserve"> </w:t>
+      </w:r>
+      <w:r>
+        <w:t xml:space="preserve">ở trình duyệt thứ ba → máy B hiện "Tài khoản vừa đăng nhập ở nơi khác".</w:t>
       </w:r>
     </w:p>
     <w:p>
@@ -5938,33 +6010,43 @@
         <w:pStyle w:val="FirstParagraph"/>
       </w:pPr>
       <w:r>
-        <w:rPr>
-          <w:b/>
-          <w:bCs/>
-        </w:rPr>
-        <w:t xml:space="preserve">Kết quả học tập</w:t>
-      </w:r>
-      <w:r>
-        <w:t xml:space="preserve"> </w:t>
-      </w:r>
-      <w:r>
-        <w:t xml:space="preserve">(band theo thời gian, trung bình theo tiêu chí) và</w:t>
-      </w:r>
-      <w:r>
-        <w:t xml:space="preserve"> </w:t>
-      </w:r>
-      <w:r>
-        <w:rPr>
-          <w:b/>
-          <w:bCs/>
-        </w:rPr>
-        <w:t xml:space="preserve">trao đổi</w:t>
-      </w:r>
-      <w:r>
-        <w:t xml:space="preserve"> </w:t>
-      </w:r>
-      <w:r>
-        <w:t xml:space="preserve">sẽ có ở các bước tiếp theo.</w:t>
+        <w:t xml:space="preserve">Muốn làm lại từ đầu: xoá dữ liệu (Docker:</w:t>
+      </w:r>
+      <w:r>
+        <w:t xml:space="preserve"> </w:t>
+      </w:r>
+      <w:r>
+        <w:rPr>
+          <w:rStyle w:val="VerbatimChar"/>
+        </w:rPr>
+        <w:t xml:space="preserve">docker compose down -v</w:t>
+      </w:r>
+      <w:r>
+        <w:t xml:space="preserve">; trên máy: xoá và tạo lại DB</w:t>
+      </w:r>
+      <w:r>
+        <w:t xml:space="preserve"> </w:t>
+      </w:r>
+      <w:r>
+        <w:rPr>
+          <w:rStyle w:val="VerbatimChar"/>
+        </w:rPr>
+        <w:t xml:space="preserve">ielts</w:t>
+      </w:r>
+      <w:r>
+        <w:t xml:space="preserve">) rồi khởi động lại với profile</w:t>
+      </w:r>
+      <w:r>
+        <w:t xml:space="preserve"> </w:t>
+      </w:r>
+      <w:r>
+        <w:rPr>
+          <w:rStyle w:val="VerbatimChar"/>
+        </w:rPr>
+        <w:t xml:space="preserve">demo</w:t>
+      </w:r>
+      <w:r>
+        <w:t xml:space="preserve">.</w:t>
       </w:r>
     </w:p>
     <w:p>
@@ -5974,293 +6056,8 @@
         </w:pict>
       </w:r>
     </w:p>
-    <w:bookmarkEnd w:id="31"/>
     <w:bookmarkEnd w:id="32"/>
-    <w:bookmarkStart w:id="33" w:name="X27a74f3cf0506426a1a76b4e73d04f5d967bbd0"/>
-    <w:p>
-      <w:pPr>
-        <w:pStyle w:val="Heading2"/>
-      </w:pPr>
-      <w:r>
-        <w:t xml:space="preserve">8. Kịch bản demo gợi ý (~10 phút)</w:t>
-      </w:r>
-    </w:p>
-    <w:p>
-      <w:pPr>
-        <w:pStyle w:val="FirstParagraph"/>
-      </w:pPr>
-      <w:r>
-        <w:t xml:space="preserve">Mở hai trình duyệt (hoặc một cửa sổ ẩn danh): máy A đăng nhập</w:t>
-      </w:r>
-      <w:r>
-        <w:t xml:space="preserve"> </w:t>
-      </w:r>
-      <w:r>
-        <w:rPr>
-          <w:rStyle w:val="VerbatimChar"/>
-        </w:rPr>
-        <w:t xml:space="preserve">gv.demo</w:t>
-      </w:r>
-      <w:r>
-        <w:t xml:space="preserve">, máy B đăng nhập</w:t>
-      </w:r>
-      <w:r>
-        <w:t xml:space="preserve"> </w:t>
-      </w:r>
-      <w:r>
-        <w:rPr>
-          <w:rStyle w:val="VerbatimChar"/>
-        </w:rPr>
-        <w:t xml:space="preserve">DEMO001</w:t>
-      </w:r>
-      <w:r>
-        <w:t xml:space="preserve">.</w:t>
-      </w:r>
-    </w:p>
-    <w:p>
-      <w:pPr>
-        <w:pStyle w:val="Compact"/>
-        <w:numPr>
-          <w:ilvl w:val="0"/>
-          <w:numId w:val="1011"/>
-        </w:numPr>
-      </w:pPr>
-      <w:r>
-        <w:rPr>
-          <w:b/>
-          <w:bCs/>
-        </w:rPr>
-        <w:t xml:space="preserve">Admin</w:t>
-      </w:r>
-      <w:r>
-        <w:t xml:space="preserve"> </w:t>
-      </w:r>
-      <w:r>
-        <w:t xml:space="preserve">(</w:t>
-      </w:r>
-      <w:r>
-        <w:rPr>
-          <w:rStyle w:val="VerbatimChar"/>
-        </w:rPr>
-        <w:t xml:space="preserve">admin</w:t>
-      </w:r>
-      <w:r>
-        <w:t xml:space="preserve">): Tổng quan → Giáo viên → thêm một giáo viên, xem mật khẩu tạm hiện một lần → Nhật ký thấy dòng "Tạo giáo viên".</w:t>
-      </w:r>
-    </w:p>
-    <w:p>
-      <w:pPr>
-        <w:pStyle w:val="Compact"/>
-        <w:numPr>
-          <w:ilvl w:val="0"/>
-          <w:numId w:val="1011"/>
-        </w:numPr>
-      </w:pPr>
-      <w:r>
-        <w:rPr>
-          <w:b/>
-          <w:bCs/>
-        </w:rPr>
-        <w:t xml:space="preserve">Giáo viên</w:t>
-      </w:r>
-      <w:r>
-        <w:t xml:space="preserve"> </w:t>
-      </w:r>
-      <w:r>
-        <w:t xml:space="preserve">(máy A): Lớp học → mở</w:t>
-      </w:r>
-      <w:r>
-        <w:t xml:space="preserve"> </w:t>
-      </w:r>
-      <w:r>
-        <w:rPr>
-          <w:rStyle w:val="VerbatimChar"/>
-        </w:rPr>
-        <w:t xml:space="preserve">DEMO-A</w:t>
-      </w:r>
-      <w:r>
-        <w:t xml:space="preserve"> </w:t>
-      </w:r>
-      <w:r>
-        <w:t xml:space="preserve">→ Import file mẫu đã điền vài sinh viên → xem kết quả, tải file tài khoản.</w:t>
-      </w:r>
-    </w:p>
-    <w:p>
-      <w:pPr>
-        <w:pStyle w:val="Compact"/>
-        <w:numPr>
-          <w:ilvl w:val="0"/>
-          <w:numId w:val="1011"/>
-        </w:numPr>
-      </w:pPr>
-      <w:r>
-        <w:t xml:space="preserve">Bài tập → mở</w:t>
-      </w:r>
-      <w:r>
-        <w:t xml:space="preserve"> </w:t>
-      </w:r>
-      <w:r>
-        <w:rPr>
-          <w:b/>
-          <w:bCs/>
-        </w:rPr>
-        <w:t xml:space="preserve">"Tuần 2"</w:t>
-      </w:r>
-      <w:r>
-        <w:t xml:space="preserve"> </w:t>
-      </w:r>
-      <w:r>
-        <w:t xml:space="preserve">(nháp) →</w:t>
-      </w:r>
-      <w:r>
-        <w:t xml:space="preserve"> </w:t>
-      </w:r>
-      <w:r>
-        <w:rPr>
-          <w:b/>
-          <w:bCs/>
-        </w:rPr>
-        <w:t xml:space="preserve">Giao bài &amp; phát hành</w:t>
-      </w:r>
-      <w:r>
-        <w:t xml:space="preserve"> </w:t>
-      </w:r>
-      <w:r>
-        <w:t xml:space="preserve">cho lớp</w:t>
-      </w:r>
-      <w:r>
-        <w:t xml:space="preserve"> </w:t>
-      </w:r>
-      <w:r>
-        <w:rPr>
-          <w:rStyle w:val="VerbatimChar"/>
-        </w:rPr>
-        <w:t xml:space="preserve">DEMO-A</w:t>
-      </w:r>
-      <w:r>
-        <w:t xml:space="preserve"> </w:t>
-      </w:r>
-      <w:r>
-        <w:t xml:space="preserve">→ máy B (</w:t>
-      </w:r>
-      <w:r>
-        <w:rPr>
-          <w:rStyle w:val="VerbatimChar"/>
-        </w:rPr>
-        <w:t xml:space="preserve">DEMO001</w:t>
-      </w:r>
-      <w:r>
-        <w:t xml:space="preserve">) thấy</w:t>
-      </w:r>
-      <w:r>
-        <w:t xml:space="preserve"> </w:t>
-      </w:r>
-      <w:r>
-        <w:rPr>
-          <w:b/>
-          <w:bCs/>
-        </w:rPr>
-        <w:t xml:space="preserve">thông báo bật lên ngay</w:t>
-      </w:r>
-      <w:r>
-        <w:t xml:space="preserve"> </w:t>
-      </w:r>
-      <w:r>
-        <w:t xml:space="preserve">và số trên chuông tăng.</w:t>
-      </w:r>
-    </w:p>
-    <w:p>
-      <w:pPr>
-        <w:pStyle w:val="Compact"/>
-        <w:numPr>
-          <w:ilvl w:val="0"/>
-          <w:numId w:val="1011"/>
-        </w:numPr>
-      </w:pPr>
-      <w:r>
-        <w:t xml:space="preserve">Tắt mạng máy B vài giây (hoặc khởi động lại backend) → thanh vàng "Mất kết nối… đang thử lại" → bật lại → tự kết nối.</w:t>
-      </w:r>
-    </w:p>
-    <w:p>
-      <w:pPr>
-        <w:pStyle w:val="Compact"/>
-        <w:numPr>
-          <w:ilvl w:val="0"/>
-          <w:numId w:val="1011"/>
-        </w:numPr>
-      </w:pPr>
-      <w:r>
-        <w:t xml:space="preserve">Đăng nhập</w:t>
-      </w:r>
-      <w:r>
-        <w:t xml:space="preserve"> </w:t>
-      </w:r>
-      <w:r>
-        <w:rPr>
-          <w:rStyle w:val="VerbatimChar"/>
-        </w:rPr>
-        <w:t xml:space="preserve">DEMO001</w:t>
-      </w:r>
-      <w:r>
-        <w:t xml:space="preserve"> </w:t>
-      </w:r>
-      <w:r>
-        <w:t xml:space="preserve">ở trình duyệt thứ ba → máy B hiện "Tài khoản vừa đăng nhập ở nơi khác".</w:t>
-      </w:r>
-    </w:p>
-    <w:p>
-      <w:pPr>
-        <w:pStyle w:val="FirstParagraph"/>
-      </w:pPr>
-      <w:r>
-        <w:t xml:space="preserve">Muốn làm lại từ đầu: xoá dữ liệu (Docker:</w:t>
-      </w:r>
-      <w:r>
-        <w:t xml:space="preserve"> </w:t>
-      </w:r>
-      <w:r>
-        <w:rPr>
-          <w:rStyle w:val="VerbatimChar"/>
-        </w:rPr>
-        <w:t xml:space="preserve">docker compose down -v</w:t>
-      </w:r>
-      <w:r>
-        <w:t xml:space="preserve">; trên máy: xoá và tạo lại DB</w:t>
-      </w:r>
-      <w:r>
-        <w:t xml:space="preserve"> </w:t>
-      </w:r>
-      <w:r>
-        <w:rPr>
-          <w:rStyle w:val="VerbatimChar"/>
-        </w:rPr>
-        <w:t xml:space="preserve">ielts</w:t>
-      </w:r>
-      <w:r>
-        <w:t xml:space="preserve">) rồi khởi động lại với profile</w:t>
-      </w:r>
-      <w:r>
-        <w:t xml:space="preserve"> </w:t>
-      </w:r>
-      <w:r>
-        <w:rPr>
-          <w:rStyle w:val="VerbatimChar"/>
-        </w:rPr>
-        <w:t xml:space="preserve">demo</w:t>
-      </w:r>
-      <w:r>
-        <w:t xml:space="preserve">.</w:t>
-      </w:r>
-    </w:p>
-    <w:p>
-      <w:r>
-        <w:pict>
-          <v:rect style="width:0;height:1.5pt" o:hralign="center" o:hrstd="t" o:hr="t"/>
-        </w:pict>
-      </w:r>
-    </w:p>
-    <w:bookmarkEnd w:id="33"/>
-    <w:bookmarkStart w:id="34" w:name="X2aaa61dde1ecd98f080cbe2f0cfb81c5163d5ab"/>
+    <w:bookmarkStart w:id="33" w:name="X2aaa61dde1ecd98f080cbe2f0cfb81c5163d5ab"/>
     <w:p>
       <w:pPr>
         <w:pStyle w:val="Heading2"/>
@@ -6611,8 +6408,8 @@
         </w:tc>
       </w:tr>
     </w:tbl>
+    <w:bookmarkEnd w:id="33"/>
     <w:bookmarkEnd w:id="34"/>
-    <w:bookmarkEnd w:id="35"/>
     <w:sectPr>
       <w:footnotePr>
         <w:numRestart w:val="eachSect"/>
@@ -6996,9 +6793,6 @@
     <w:abstractNumId w:val="991"/>
   </w:num>
   <w:num w:numId="1010">
-    <w:abstractNumId w:val="991"/>
-  </w:num>
-  <w:num w:numId="1011">
     <w:abstractNumId w:val="99411"/>
     <w:lvlOverride w:ilvl="0">
       <w:startOverride w:val="1"/>

</xml_diff>